<commit_message>
Expand competitive-markets memo with full written argument
Lengthen the wqf/zhh brief: competitor layers, province-by-province so-whats, and a closed logic from share shift to two sample markets. Stay off case, product, and channel chapters.

Co-authored-by: MotWang <MotWang@users.noreply.github.com>
</commit_message>
<xml_diff>
--- a/deliverables/Laoshan_Competitive_Markets.docx
+++ b/deliverables/Laoshan_Competitive_Markets.docx
@@ -353,7 +353,7 @@
                 <w:color w:val="1A1A1A"/>
                 <w:sz w:val="17"/>
               </w:rPr>
-              <w:t>二、竞争品牌与区域市场。不写行业总量综述、崂山产品档案、跨品类全国化案例、渠道机制专章</w:t>
+              <w:t>二、竞争品牌与区域市场。行业总量综述、崂山产品档案、跨品类案例、渠道利润模型不在本稿</w:t>
             </w:r>
           </w:p>
         </w:tc>
@@ -501,7 +501,7 @@
                 <w:color w:val="1A1A1A"/>
                 <w:sz w:val="17"/>
               </w:rPr>
-              <w:t>飞书研讨页；复盘@YJ 逐字稿预调研判断与 H6 竞品名单；上市公司年报与统计局产量</w:t>
+              <w:t>飞书研讨页；复盘@YJ 逐字稿预研判断与 H6；上市公司年报与统计局产量</w:t>
             </w:r>
           </w:p>
         </w:tc>
@@ -575,7 +575,7 @@
                 <w:color w:val="1A1A1A"/>
                 <w:sz w:val="17"/>
               </w:rPr>
-              <w:t>2026-10-04。会上【填】项未闭环，不以访谈空格冒充品牌方原话</w:t>
+              <w:t>2026-10-04 修订。会上【填】未闭环，不以空格冒充品牌方原话</w:t>
             </w:r>
           </w:p>
         </w:tc>
@@ -594,7 +594,7 @@
           <w:color w:val="767676"/>
           <w:sz w:val="17"/>
         </w:rPr>
-        <w:t>表 0  文件信息。评价单元按 YJ 预调研：看品牌经营，不看青啤公司总量。</w:t>
+        <w:t>表 0  文件信息。评价单元按 YJ：看品牌经营，不看青啤公司总量。</w:t>
       </w:r>
     </w:p>
     <w:p>
@@ -610,7 +610,7 @@
           <w:color w:val="1428A0"/>
           <w:sz w:val="30"/>
         </w:rPr>
-        <w:t>01  竞争落在产品和桌上，不落在集团排位</w:t>
+        <w:t>01  本稿要收住的问题</w:t>
       </w:r>
     </w:p>
     <w:p>
@@ -635,7 +635,7 @@
           <w:color w:val="1A1A1A"/>
           <w:sz w:val="22"/>
         </w:rPr>
-        <w:t>2025 年规上啤酒产量同比下降 1.1%。同期青岛啤酒中高端以上销量增长 5.2%，燕京 U8 增长 29.31%。总量没有增量，份额在具体产品和具体终端上重分。YJ 预调研写过同一句话：竞争同时发生在企业体系和终端。对崂山，有用的不是华润、青啤谁第一，而是店里那一瓶跟谁并排、被谁换掉。</w:t>
+        <w:t>全国化课题容易写成「中国啤酒很大、五强很强、崂山要加油」。那三句话对 10 月 13 日没有用。本组只收两个问题：店里那瓶崂山跟谁并排、被谁换掉；这件事在哪些省已经发生、在哪些省还没资格发生。</w:t>
       </w:r>
     </w:p>
     <w:p>
@@ -652,7 +652,7 @@
           <w:color w:val="1A1A1A"/>
           <w:sz w:val="22"/>
         </w:rPr>
-        <w:t>青啤公开战略是「主品牌 + 崂山全国性第二品牌」。2023—2025 年，青岛品牌销量 456 → 434 → 449 万千升，2025 年回正 3.54%；其他品牌（崂山为代表）345 → 320 → 315 万千升，三年连降。集团在修主品牌，第二品牌仍在失量。全国化如果按公司销量讲，会把青岛的回量误读成崂山的空间。</w:t>
+        <w:t>飞书把目标写成独立大众品牌，避开青啤腹地，核心市场在山东、河北，场景在火锅、烧烤、小龙虾，节奏是样板先行。YJ 预调研补了两条读数纪律：竞争同时发生在企业体系和终端；全国化的评价单元是品牌经营，不是公司总量。两条合在一起，对手名单不能按集团排，区域判断不能把青啤分部账本当成崂山消费地图。</w:t>
       </w:r>
     </w:p>
     <w:p>
@@ -669,7 +669,116 @@
           <w:color w:val="1A1A1A"/>
           <w:sz w:val="22"/>
         </w:rPr>
-        <w:t>其他品牌是组合口径，不是崂山单品牌。320 万、315 万千升不得写成崂山本体。即便高估到这一量级，也只相当于燕京全公司的八成、华润的三成：量在，全国心智不在。飞书的判断成立——销量相对靠前，品牌力偏弱。</w:t>
+        <w:t>价格带还没被品牌方拍板。课题写 6 元以下，分工材料写 8 元以下，YJ 的 H4 仍空着。本稿先当工作口径用：历史成交在 6 元以下，升级后要看的是 6—8 元。6 元以下是守盘，6—8 元才是独立品牌还站不站得住。青岛经典、纯生不进对手名单。</w:t>
+      </w:r>
+    </w:p>
+    <w:p>
+      <w:pPr>
+        <w:spacing w:before="320" w:after="40"/>
+        <w:ind w:firstLine="0"/>
+      </w:pPr>
+      <w:r>
+        <w:rPr>
+          <w:rFonts w:ascii="Calibri" w:hAnsi="Calibri" w:eastAsia="微软雅黑" w:cs="Calibri"/>
+          <w:b/>
+          <w:i w:val="0"/>
+          <w:color w:val="1428A0"/>
+          <w:sz w:val="30"/>
+        </w:rPr>
+        <w:t>02  总量停了之后，竞争改怎么读</w:t>
+      </w:r>
+    </w:p>
+    <w:p>
+      <w:pPr>
+        <w:spacing w:before="0" w:after="160"/>
+        <w:pBdr>
+          <w:bottom w:val="single" w:sz="12" w:space="1" w:color="1428A0"/>
+        </w:pBdr>
+      </w:pPr>
+    </w:p>
+    <w:p>
+      <w:pPr>
+        <w:spacing w:before="0" w:after="140" w:line="307" w:lineRule="auto"/>
+        <w:ind w:firstLine="0"/>
+        <w:jc w:val="both"/>
+      </w:pPr>
+      <w:r>
+        <w:rPr>
+          <w:rFonts w:ascii="Calibri" w:hAnsi="Calibri" w:eastAsia="微软雅黑" w:cs="Calibri"/>
+          <w:b w:val="0"/>
+          <w:i w:val="0"/>
+          <w:color w:val="1A1A1A"/>
+          <w:sz w:val="22"/>
+        </w:rPr>
+        <w:t>2023 年规上啤酒产量 3,555.5 万千升，同比 +0.3%；2024 年 3,521.3 万千升，−0.6%；2025 年公告 3,536.0 万千升，同比 −1.1%。三年都在 3,500 万千升上下，没有扩容故事。同期青啤中高端以上 2025 年 +5.2%，燕京 U8 +29.31%。YJ 预调研那句「行业总量承压，增长向具体产品分化」可以直接用。对崂山，含义很硬：全国化带不来行业增量，只能从别人杯子里抢酒。</w:t>
+      </w:r>
+    </w:p>
+    <w:p>
+      <w:pPr>
+        <w:spacing w:before="0" w:after="140" w:line="307" w:lineRule="auto"/>
+        <w:ind w:firstLine="0"/>
+        <w:jc w:val="both"/>
+      </w:pPr>
+      <w:r>
+        <w:rPr>
+          <w:rFonts w:ascii="Calibri" w:hAnsi="Calibri" w:eastAsia="微软雅黑" w:cs="Calibri"/>
+          <w:b w:val="0"/>
+          <w:i w:val="0"/>
+          <w:color w:val="1A1A1A"/>
+          <w:sz w:val="22"/>
+        </w:rPr>
+        <w:t>2024 年是分化年。百威亚太中国区 −11.8%，青啤集团 −5.86%，华润 −2.5%，重啤几乎持平，燕京、珠江正增长。2025 年除百威中国区再 −8.6% 外，其余转正。龙头让出的不是空白市场，是结构：现饮弱的掉得快，有大单品的还在长。崂山如果按「等行业回暖再铺」来排期，会错过正在发生的再分配。</w:t>
+      </w:r>
+    </w:p>
+    <w:p>
+      <w:pPr>
+        <w:spacing w:before="0" w:after="140" w:line="307" w:lineRule="auto"/>
+        <w:ind w:firstLine="0"/>
+        <w:jc w:val="both"/>
+      </w:pPr>
+      <w:r>
+        <w:rPr>
+          <w:rFonts w:ascii="Calibri" w:hAnsi="Calibri" w:eastAsia="微软雅黑" w:cs="Calibri"/>
+          <w:b w:val="0"/>
+          <w:i w:val="0"/>
+          <w:color w:val="1A1A1A"/>
+          <w:sz w:val="22"/>
+        </w:rPr>
+        <w:t>华润 2024 年 1,087.4 万千升，2025 年约 1,103 万千升，仍是量的标尺。青啤集团 753.8 万、764.8 万千升。燕京 400.44 万、405.30 万千升。把企业销量除以 2024 年规上产量，华润约 30.9%，青啤约 21.4%，燕京约 11.4%。这不是官方市占，只说明量级。崂山即使把「其他品牌」全部算上，2024 年也只是 320 万千升这一档，和燕京全公司还差一截，和华润差一个数量级。全国化的成功标准不能写成进入五强。</w:t>
+      </w:r>
+    </w:p>
+    <w:p>
+      <w:pPr>
+        <w:spacing w:before="0" w:after="140" w:line="307" w:lineRule="auto"/>
+        <w:ind w:firstLine="0"/>
+        <w:jc w:val="both"/>
+      </w:pPr>
+      <w:r>
+        <w:rPr>
+          <w:rFonts w:ascii="Calibri" w:hAnsi="Calibri" w:eastAsia="微软雅黑" w:cs="Calibri"/>
+          <w:b w:val="0"/>
+          <w:i w:val="0"/>
+          <w:color w:val="1A1A1A"/>
+          <w:sz w:val="22"/>
+        </w:rPr>
+        <w:t>青啤公开战略是「主品牌 + 崂山全国性第二品牌」。2023—2025 年青岛品牌 456 → 434 → 449 万千升，2025 年回正 3.54%；其他品牌（崂山为代表）345 → 320 → 315 万千升，收入约 101.4 → 94.95 → 94.48 亿元。集团在修主品牌，第二品牌仍在失量。按其他品牌粗算，2024 年吨酒收入约 2,967 元 / 千升，2025 年约 3,000 元 / 千升，大约是青岛品牌 5,000 元量级的六成。全国化如果按公司销量讲，会把青岛的回量误读成崂山的空间。</w:t>
+      </w:r>
+    </w:p>
+    <w:p>
+      <w:pPr>
+        <w:spacing w:before="0" w:after="140" w:line="307" w:lineRule="auto"/>
+        <w:ind w:firstLine="0"/>
+        <w:jc w:val="both"/>
+      </w:pPr>
+      <w:r>
+        <w:rPr>
+          <w:rFonts w:ascii="Calibri" w:hAnsi="Calibri" w:eastAsia="微软雅黑" w:cs="Calibri"/>
+          <w:b w:val="0"/>
+          <w:i w:val="0"/>
+          <w:color w:val="1A1A1A"/>
+          <w:sz w:val="22"/>
+        </w:rPr>
+        <w:t>其他品牌是组合口径，不是崂山单品牌。320 万、315 万千升不得写成崂山本体。口径限制不影响方向：第二品牌这条线在缩，主品牌这条线在修。飞书说销量相对靠前、品牌力偏弱，和公开账对得上——骨架在，全国心智不在。</w:t>
       </w:r>
     </w:p>
     <w:tbl>
@@ -3115,7 +3224,7 @@
           <w:color w:val="1428A0"/>
           <w:sz w:val="30"/>
         </w:rPr>
-        <w:t>02  对手名单：勇闯、小麦王、燕京清爽；U8 在上一层拦截</w:t>
+        <w:t>03  对手名单</w:t>
       </w:r>
     </w:p>
     <w:p>
@@ -3128,19 +3237,18 @@
     </w:p>
     <w:p>
       <w:pPr>
-        <w:spacing w:before="0" w:after="140" w:line="307" w:lineRule="auto"/>
+        <w:spacing w:before="220" w:after="100"/>
         <w:ind w:firstLine="0"/>
-        <w:jc w:val="both"/>
       </w:pPr>
       <w:r>
         <w:rPr>
           <w:rFonts w:ascii="Calibri" w:hAnsi="Calibri" w:eastAsia="微软雅黑" w:cs="Calibri"/>
-          <w:b w:val="0"/>
+          <w:b/>
           <w:i w:val="0"/>
           <w:color w:val="1A1A1A"/>
-          <w:sz w:val="22"/>
+          <w:sz w:val="24"/>
         </w:rPr>
-        <w:t>课题材料写 6 元以下，分工材料写 8 元以下。YJ 的 H4 仍待品牌方拍板，会上空格未填。本稿先按两层用：历史成交落在 6 元以下；升级后要看的是 6—8 元。6 元以下是存量消耗，6—8 元才是独立大众品牌还能站住的位置。青岛经典、纯生不进对手名单——飞书写明避开青啤腹地。</w:t>
+        <w:t>3.1  先分层，再点名</w:t>
       </w:r>
     </w:p>
     <w:p>
@@ -3157,7 +3265,7 @@
           <w:color w:val="1A1A1A"/>
           <w:sz w:val="22"/>
         </w:rPr>
-        <w:t>YJ 预调研 H6 把真实竞品写成勇闯天涯、哈尔滨小麦王、燕京清爽。这一名单和飞书「与雪花、燕京同价位差异化」对得上。雪花要守住经济型、主力市场和大单品；2024 年中档及以上占比首次全年过半，2025 年次高档及以上接近总销量 25%，老雪 +60%。塔基它不会让，升级带它也在填。崂山出省以后，店主最省事的替换就是雪花。</w:t>
+        <w:t>YJ 的 H6 把真实竞品写成勇闯天涯、哈尔滨小麦王、燕京清爽。飞书写的是与雪花、燕京同价位差异化。两份材料对得上，缺的是层。没有层，勇闯和 U8 会被写成同一个对手，青岛经典也会被误列进来。</w:t>
       </w:r>
     </w:p>
     <w:p>
@@ -3174,7 +3282,7 @@
           <w:color w:val="1A1A1A"/>
           <w:sz w:val="22"/>
         </w:rPr>
-        <w:t>燕京 2024、2025 年连续正增长。U8 从 69.60 万千升到 90 万千升，两年仍是三十来个点的增速。华北仍占燕京收入 53.40%。U8 的成交口径有 5—6 元和 8—10 元两说，不在本稿合成一个价。对崂山只需记住结构：燕京清爽抢塔基，U8 在大众升级带截流。哈尔滨小麦王把「小麦 / 口感」摆上同一条大众桌，和全麦叙事最近，也最容易把升级讲成口味游戏而不是品牌。</w:t>
+        <w:t>塔基大约在 6 元以下：勇闯、燕京清爽、地方经济型、哈啤入门款。这是崂山的历史基本盘，费用最烈，盘在缩。大众升级大约在 6—8 元：老雪往下走、U8、哈尔滨小麦王。这是独立品牌还要不要得住的位置，全麦必须在这里被点。经典、纯生及中高端以上不进入：青岛主品牌、喜力、百威核心。飞书把这条写成红线，做成小青岛即失败。</w:t>
       </w:r>
     </w:p>
     <w:p>
@@ -3191,7 +3299,241 @@
           <w:color w:val="1A1A1A"/>
           <w:sz w:val="22"/>
         </w:rPr>
-        <w:t>百威中国区 2024 年销量 −11.8%，2025 年 −8.6%，公司自己写的是现饮人流下降。飞书把崂山场景钉在火锅、烧烤、小龙虾。现饮是原点，也是 2024—2025 年掉得最快的一层。对手如果只在餐饮桌上比，崂山会把全国化做成复制一个正在变难的场景。</w:t>
+        <w:t>H4 没拍板，表 2 的价位只是工作口径，不是官方零售价。终端核价回来以后，可以改价签，不要改分层逻辑。</w:t>
+      </w:r>
+    </w:p>
+    <w:p>
+      <w:pPr>
+        <w:spacing w:before="220" w:after="100"/>
+        <w:ind w:firstLine="0"/>
+      </w:pPr>
+      <w:r>
+        <w:rPr>
+          <w:rFonts w:ascii="Calibri" w:hAnsi="Calibri" w:eastAsia="微软雅黑" w:cs="Calibri"/>
+          <w:b/>
+          <w:i w:val="0"/>
+          <w:color w:val="1A1A1A"/>
+          <w:sz w:val="24"/>
+        </w:rPr>
+        <w:t>3.2  雪花：出省以后店主最省事的替换</w:t>
+      </w:r>
+    </w:p>
+    <w:p>
+      <w:pPr>
+        <w:spacing w:before="0" w:after="140" w:line="307" w:lineRule="auto"/>
+        <w:ind w:firstLine="0"/>
+        <w:jc w:val="both"/>
+      </w:pPr>
+      <w:r>
+        <w:rPr>
+          <w:rFonts w:ascii="Calibri" w:hAnsi="Calibri" w:eastAsia="微软雅黑" w:cs="Calibri"/>
+          <w:b w:val="0"/>
+          <w:i w:val="0"/>
+          <w:color w:val="1A1A1A"/>
+          <w:sz w:val="22"/>
+        </w:rPr>
+        <w:t>华润是销量第一，也是全国铺货最完整的大众机器。2024 年公司说要守住经济型、主力市场和大单品。塔基它不会让出来给崂山「更便宜一点」的打法。同年中档及以上销量占比首次全年过半；2025 年次高档及以上接近总销量 25%，喜力仍有近两成增长，老雪 +60%。雪花在用勇闯守桌，用老雪和喜力把货架从下往上填满。</w:t>
+      </w:r>
+    </w:p>
+    <w:p>
+      <w:pPr>
+        <w:spacing w:before="0" w:after="140" w:line="307" w:lineRule="auto"/>
+        <w:ind w:firstLine="0"/>
+        <w:jc w:val="both"/>
+      </w:pPr>
+      <w:r>
+        <w:rPr>
+          <w:rFonts w:ascii="Calibri" w:hAnsi="Calibri" w:eastAsia="微软雅黑" w:cs="Calibri"/>
+          <w:b w:val="0"/>
+          <w:i w:val="0"/>
+          <w:color w:val="1A1A1A"/>
+          <w:sz w:val="22"/>
+        </w:rPr>
+        <w:t>侯孝海公开提过，山东因为勇闯涨价和竞争烈度增加，增速放缓。这句话比任何份额访谈都有用：雪花已经把山东当成必须投入的第二主场，不是远方市场。行业访谈把青啤在鲁份额放到 70%—80%、华润约 20%；更早的渠道材料写过，雪花用清爽、勇闯和部分罐装切的就是 6 元及以下，青啤回击时用过精品崂山和经典。数字是访谈口径，机制是实的——勇闯在根据地打过同价位，而且打过一轮。</w:t>
+      </w:r>
+    </w:p>
+    <w:p>
+      <w:pPr>
+        <w:spacing w:before="0" w:after="140" w:line="307" w:lineRule="auto"/>
+        <w:ind w:firstLine="0"/>
+        <w:jc w:val="both"/>
+      </w:pPr>
+      <w:r>
+        <w:rPr>
+          <w:rFonts w:ascii="Calibri" w:hAnsi="Calibri" w:eastAsia="微软雅黑" w:cs="Calibri"/>
+          <w:b w:val="0"/>
+          <w:i w:val="0"/>
+          <w:color w:val="1A1A1A"/>
+          <w:sz w:val="22"/>
+        </w:rPr>
+        <w:t>对崂山：雪花第一。样板如果选在雪花费用密度最高的省，开店成本会系统性高于北方根据地。6 元以下和勇闯对砸，胜率最低；6—8 元若没有可感知差异，店主仍会回到雪花。</w:t>
+      </w:r>
+    </w:p>
+    <w:p>
+      <w:pPr>
+        <w:spacing w:before="220" w:after="100"/>
+        <w:ind w:firstLine="0"/>
+      </w:pPr>
+      <w:r>
+        <w:rPr>
+          <w:rFonts w:ascii="Calibri" w:hAnsi="Calibri" w:eastAsia="微软雅黑" w:cs="Calibri"/>
+          <w:b/>
+          <w:i w:val="0"/>
+          <w:color w:val="1A1A1A"/>
+          <w:sz w:val="24"/>
+        </w:rPr>
+        <w:t>3.3  燕京：清爽在下面，U8 在上面</w:t>
+      </w:r>
+    </w:p>
+    <w:p>
+      <w:pPr>
+        <w:spacing w:before="0" w:after="140" w:line="307" w:lineRule="auto"/>
+        <w:ind w:firstLine="0"/>
+        <w:jc w:val="both"/>
+      </w:pPr>
+      <w:r>
+        <w:rPr>
+          <w:rFonts w:ascii="Calibri" w:hAnsi="Calibri" w:eastAsia="微软雅黑" w:cs="Calibri"/>
+          <w:b w:val="0"/>
+          <w:i w:val="0"/>
+          <w:color w:val="1A1A1A"/>
+          <w:sz w:val="22"/>
+        </w:rPr>
+        <w:t>燕京 2023 年 394.24 万千升，2024 年 400.44 万千升（+1.57%），2025 年 405.30 万千升（+1.21%），缩量年里连续正增长。U8 2024 年 69.60 万千升（+31.40%），2025 年 90 万千升（+29.31%）。公司收入仍有 53.40% 在华北（2024 年 78.30 亿元，+5.39%），华东只占 9.12%，华南 26.23%。燕京没有先变成均匀的全国公司，是用一款单品从华北往外溢。</w:t>
+      </w:r>
+    </w:p>
+    <w:p>
+      <w:pPr>
+        <w:spacing w:before="0" w:after="140" w:line="307" w:lineRule="auto"/>
+        <w:ind w:firstLine="0"/>
+        <w:jc w:val="both"/>
+      </w:pPr>
+      <w:r>
+        <w:rPr>
+          <w:rFonts w:ascii="Calibri" w:hAnsi="Calibri" w:eastAsia="微软雅黑" w:cs="Calibri"/>
+          <w:b w:val="0"/>
+          <w:i w:val="0"/>
+          <w:color w:val="1A1A1A"/>
+          <w:sz w:val="22"/>
+        </w:rPr>
+        <w:t>U8 成交有 5—6 元和 8—10 元两说，本稿并存，不合成一个价。结构比标价重要：燕京清爽继续占塔基，U8 在大众升级带截流。河北是 U8 除北京、内蒙外的优势区，也是飞书点名的崂山核心市场。两条线在河北会撞上。</w:t>
+      </w:r>
+    </w:p>
+    <w:p>
+      <w:pPr>
+        <w:spacing w:before="0" w:after="140" w:line="307" w:lineRule="auto"/>
+        <w:ind w:firstLine="0"/>
+        <w:jc w:val="both"/>
+      </w:pPr>
+      <w:r>
+        <w:rPr>
+          <w:rFonts w:ascii="Calibri" w:hAnsi="Calibri" w:eastAsia="微软雅黑" w:cs="Calibri"/>
+          <w:b w:val="0"/>
+          <w:i w:val="0"/>
+          <w:color w:val="1A1A1A"/>
+          <w:sz w:val="22"/>
+        </w:rPr>
+        <w:t>2024 年燕京华东收入 +9.82%，华北 +5.39%，华南几乎持平（+0.28%），西北 −12.52%。全国化不是所有方向都赚钱。对崂山：燕京第二。鲁冀不能只防勇闯，还要防 U8 把「能喝出一点不一样」的预算先拿走。华南不是燕京最锋利的刃，却是珠江的家门口，不能因为燕京弱就判断南下容易。</w:t>
+      </w:r>
+    </w:p>
+    <w:p>
+      <w:pPr>
+        <w:spacing w:before="220" w:after="100"/>
+        <w:ind w:firstLine="0"/>
+      </w:pPr>
+      <w:r>
+        <w:rPr>
+          <w:rFonts w:ascii="Calibri" w:hAnsi="Calibri" w:eastAsia="微软雅黑" w:cs="Calibri"/>
+          <w:b/>
+          <w:i w:val="0"/>
+          <w:color w:val="1A1A1A"/>
+          <w:sz w:val="24"/>
+        </w:rPr>
+        <w:t>3.4  哈尔滨小麦王：全麦叙事最近的干扰</w:t>
+      </w:r>
+    </w:p>
+    <w:p>
+      <w:pPr>
+        <w:spacing w:before="0" w:after="140" w:line="307" w:lineRule="auto"/>
+        <w:ind w:firstLine="0"/>
+        <w:jc w:val="both"/>
+      </w:pPr>
+      <w:r>
+        <w:rPr>
+          <w:rFonts w:ascii="Calibri" w:hAnsi="Calibri" w:eastAsia="微软雅黑" w:cs="Calibri"/>
+          <w:b w:val="0"/>
+          <w:i w:val="0"/>
+          <w:color w:val="1A1A1A"/>
+          <w:sz w:val="22"/>
+        </w:rPr>
+        <w:t>哈啤是百威在中国的大众 / 中档抓手。YJ 把小麦王列进 H6，和全麦升级最近。媒体把部分哈啤 SKU 放在 8—10 元，和崂山历史 6 元以下并不完全重叠。终端核价没回来之前，小麦王先当干扰项：它会把「全麦 / 小麦 / 口感」讲成口味游戏。升级如果只停在原料词，桌上会被小麦王稀释，品牌还是 anonymous 的大众瓶。</w:t>
+      </w:r>
+    </w:p>
+    <w:p>
+      <w:pPr>
+        <w:spacing w:before="0" w:after="140" w:line="307" w:lineRule="auto"/>
+        <w:ind w:firstLine="0"/>
+        <w:jc w:val="both"/>
+      </w:pPr>
+      <w:r>
+        <w:rPr>
+          <w:rFonts w:ascii="Calibri" w:hAnsi="Calibri" w:eastAsia="微软雅黑" w:cs="Calibri"/>
+          <w:b w:val="0"/>
+          <w:i w:val="0"/>
+          <w:color w:val="1A1A1A"/>
+          <w:sz w:val="22"/>
+        </w:rPr>
+        <w:t>百威中国区 2024 年销量 −11.8%、收入 −13.0%、每百升收入 −1.4%，份额 −149 个基点；2025 年销量再 −8.6%。公司写的原因是行业放缓、更侧重的即饮渠道人流下降，四季度主动去库存约占 2024 年降幅的三分之一。飞书把崂山场景钉在火锅、烧烤、小龙虾。现饮是原点，也是这两年掉得最快的一层。对手如果只在餐饮桌上比，全国化会做成复制一个正在变难的场景。</w:t>
+      </w:r>
+    </w:p>
+    <w:p>
+      <w:pPr>
+        <w:spacing w:before="220" w:after="100"/>
+        <w:ind w:firstLine="0"/>
+      </w:pPr>
+      <w:r>
+        <w:rPr>
+          <w:rFonts w:ascii="Calibri" w:hAnsi="Calibri" w:eastAsia="微软雅黑" w:cs="Calibri"/>
+          <w:b/>
+          <w:i w:val="0"/>
+          <w:color w:val="1A1A1A"/>
+          <w:sz w:val="24"/>
+        </w:rPr>
+        <w:t>3.5  珠江和嘉士伯：南边墙上的名字，不是北方桌上的对手</w:t>
+      </w:r>
+    </w:p>
+    <w:p>
+      <w:pPr>
+        <w:spacing w:before="0" w:after="140" w:line="307" w:lineRule="auto"/>
+        <w:ind w:firstLine="0"/>
+        <w:jc w:val="both"/>
+      </w:pPr>
+      <w:r>
+        <w:rPr>
+          <w:rFonts w:ascii="Calibri" w:hAnsi="Calibri" w:eastAsia="微软雅黑" w:cs="Calibri"/>
+          <w:b w:val="0"/>
+          <w:i w:val="0"/>
+          <w:color w:val="1A1A1A"/>
+          <w:sz w:val="22"/>
+        </w:rPr>
+        <w:t>珠江 2024 年 143.96 万千升（+2.62%），2025 年 146.24 万千升（+1.58%），2025 年华南收入占 95.66%。这是区域墙，不是全国假想敌。重庆啤酒 2024 年 297.49 万千升，2025 年 299.52 万千升，高档已近半，代表嘉士伯在西部和部分南部的组合。两家都不该写进鲁冀的对手名单，但南下候选城里必须点名。广东 2024 年规上产量 474.72 万千升，已超过山东 463.4 万千升。产量第一不自动等于崂山的需求机会。飞书写「填补南方中低端」，公开格局显示南方中低端并不空。</w:t>
+      </w:r>
+    </w:p>
+    <w:p>
+      <w:pPr>
+        <w:spacing w:before="0" w:after="140" w:line="307" w:lineRule="auto"/>
+        <w:ind w:firstLine="0"/>
+        <w:jc w:val="both"/>
+      </w:pPr>
+      <w:r>
+        <w:rPr>
+          <w:rFonts w:ascii="Calibri" w:hAnsi="Calibri" w:eastAsia="微软雅黑" w:cs="Calibri"/>
+          <w:b w:val="0"/>
+          <w:i w:val="0"/>
+          <w:color w:val="1A1A1A"/>
+          <w:sz w:val="22"/>
+        </w:rPr>
+        <w:t>地方品牌是家里的第三对手。河北 2024 年啤酒产量 −3.98%，规上营收 67.51 亿元；华润雪花河北、河北燕京、青啤石家庄、蓝贝四家合计占全省规上啤酒营收 50.98%、利润 47.1%。河北不是自留地。山东的地方鲜啤还在，但重资产门店外扩的路径本组不展开，那是案例组的失败样本。</w:t>
       </w:r>
     </w:p>
     <w:tbl>
@@ -3821,7 +4163,7 @@
           <w:color w:val="1428A0"/>
           <w:sz w:val="30"/>
         </w:rPr>
-        <w:t>03  区域：量在北方分部，墙在南方桌上</w:t>
+        <w:t>04  区域市场</w:t>
       </w:r>
     </w:p>
     <w:p>
@@ -3834,19 +4176,18 @@
     </w:p>
     <w:p>
       <w:pPr>
-        <w:spacing w:before="0" w:after="140" w:line="307" w:lineRule="auto"/>
+        <w:spacing w:before="220" w:after="100"/>
         <w:ind w:firstLine="0"/>
-        <w:jc w:val="both"/>
       </w:pPr>
       <w:r>
         <w:rPr>
           <w:rFonts w:ascii="Calibri" w:hAnsi="Calibri" w:eastAsia="微软雅黑" w:cs="Calibri"/>
-          <w:b w:val="0"/>
+          <w:b/>
           <w:i w:val="0"/>
           <w:color w:val="1A1A1A"/>
-          <w:sz w:val="22"/>
+          <w:sz w:val="24"/>
         </w:rPr>
-        <w:t>飞书点名核心市场是山东、河北。青啤 2024 年山东分部收入 220.95 亿元，同比 −3.38%；2025 年 223.24 亿元，+1.04%。山东分部销量占集团 70.68%（2024）、70.60%（2025），华北占 26.59%、26.62%。两分部相加约 97%。这是销售组织记账，不是消费地占 97%。山东工厂完全可能把销往外省的酒记在自己账上。能确定的只有一句：基本盘和队伍在北方，南方不是换个商标就能接上的市场。</w:t>
+        <w:t>4.1  集团账本只能证明队伍在北方</w:t>
       </w:r>
     </w:p>
     <w:p>
@@ -3863,7 +4204,7 @@
           <w:color w:val="1A1A1A"/>
           <w:sz w:val="22"/>
         </w:rPr>
-        <w:t>2024 年华南收入 −6.75%，华东 −9.91%，东南 −24.14%。2025 年华南、华东转正，体量仍小。广东 2024 年规上产量 474.72 万千升，超过山东 463.4 万千升，已经是第一生产大省。珠江 2025 年华南收入占 95.66%，且仍在正增长。南下面对的是珠江、雪花、嘉士伯已经站好的桌，不是空出来的中低端。</w:t>
+        <w:t>飞书点名核心市场是山东、河北。青啤 2024 年山东分部收入 22,094,714 千元（220.95 亿元），同比 −3.38%；2025 年 22,324,392 千元，+1.04%。华北 2024 年 78.03 亿元，−2.24%；2025 年 78.64 亿元，+0.78%。山东分部销量占集团 70.68%（2024）、70.60%（2025），华北占 26.59%、26.62%。两分部相加约 97%。</w:t>
       </w:r>
     </w:p>
     <w:p>
@@ -3880,7 +4221,191 @@
           <w:color w:val="1A1A1A"/>
           <w:sz w:val="22"/>
         </w:rPr>
-        <w:t>山东也不是后花园。行业访谈把青啤在鲁份额放到 70%—80%，华润约 20%。更早的渠道材料写过，雪花用清爽、勇闯和部分罐装切的就是 6 元及以下，青啤回击时用过精品崂山和经典。数字是访谈口径，机制是实的：勇闯已经在根据地打过同价位。河北 2024 年啤酒产量下降 3.98%；华润雪花河北、河北燕京、青啤石家庄、蓝贝四家合计拿走全省规上啤酒营收的 50.98%。河北是四强绞杀，也是 U8 除北京、内蒙外的优势区。</w:t>
+        <w:t>97% 是销售组织记账。山东分部完全可能把销往外省的酒记在自己账上，不能写成「中国有 97% 的青啤消费者在鲁冀」。能确定的只有：基本盘、工厂和队伍在北方；南方不是换个商标就能接上的市场。崂山作为第二品牌，没有理由假设自己比集团更全国。</w:t>
+      </w:r>
+    </w:p>
+    <w:p>
+      <w:pPr>
+        <w:spacing w:before="0" w:after="140" w:line="307" w:lineRule="auto"/>
+        <w:ind w:firstLine="0"/>
+        <w:jc w:val="both"/>
+      </w:pPr>
+      <w:r>
+        <w:rPr>
+          <w:rFonts w:ascii="Calibri" w:hAnsi="Calibri" w:eastAsia="微软雅黑" w:cs="Calibri"/>
+          <w:b w:val="0"/>
+          <w:i w:val="0"/>
+          <w:color w:val="1A1A1A"/>
+          <w:sz w:val="22"/>
+        </w:rPr>
+        <w:t>2024 年华南 −6.75%、华东 −9.91%、东南 −24.14%。2025 年华南 +1.18%、华东 +3.81%，体量仍小。集团在南方的问题是规模不够、波动更大。青啤 2025 年报自己写北方连片、南方靠正向积累。这和飞书「样板先行、先稳经销商基本盘」是同一句话。</w:t>
+      </w:r>
+    </w:p>
+    <w:p>
+      <w:pPr>
+        <w:spacing w:before="220" w:after="100"/>
+        <w:ind w:firstLine="0"/>
+      </w:pPr>
+      <w:r>
+        <w:rPr>
+          <w:rFonts w:ascii="Calibri" w:hAnsi="Calibri" w:eastAsia="微软雅黑" w:cs="Calibri"/>
+          <w:b/>
+          <w:i w:val="0"/>
+          <w:color w:val="1A1A1A"/>
+          <w:sz w:val="24"/>
+        </w:rPr>
+        <w:t>4.2  山东：粮仓，也是勇闯已经进来过的主战场</w:t>
+      </w:r>
+    </w:p>
+    <w:p>
+      <w:pPr>
+        <w:spacing w:before="0" w:after="140" w:line="307" w:lineRule="auto"/>
+        <w:ind w:firstLine="0"/>
+        <w:jc w:val="both"/>
+      </w:pPr>
+      <w:r>
+        <w:rPr>
+          <w:rFonts w:ascii="Calibri" w:hAnsi="Calibri" w:eastAsia="微软雅黑" w:cs="Calibri"/>
+          <w:b w:val="0"/>
+          <w:i w:val="0"/>
+          <w:color w:val="1A1A1A"/>
+          <w:sz w:val="22"/>
+        </w:rPr>
+        <w:t>山东产量 2022 年 489.39 万千升，2023 年 483.6 万千升，2024 年 463.4 万千升，并把维持三十余年的产量第一让给广东。消费上它仍是青啤体系最厚的省。份额访谈不能当官方数，但方向稳定：青啤在鲁是老大，雪花是唯一能把费用打进来的第二。</w:t>
+      </w:r>
+    </w:p>
+    <w:p>
+      <w:pPr>
+        <w:spacing w:before="0" w:after="140" w:line="307" w:lineRule="auto"/>
+        <w:ind w:firstLine="0"/>
+        <w:jc w:val="both"/>
+      </w:pPr>
+      <w:r>
+        <w:rPr>
+          <w:rFonts w:ascii="Calibri" w:hAnsi="Calibri" w:eastAsia="微软雅黑" w:cs="Calibri"/>
+          <w:b w:val="0"/>
+          <w:i w:val="0"/>
+          <w:color w:val="1A1A1A"/>
+          <w:sz w:val="22"/>
+        </w:rPr>
+        <w:t>对崂山，山东有两个角色，不能只记一个。它是现金流和经销商能力的样板源，全国化若抽空山东费用去支援南下，勇闯会把 6 元以下再切一刀。它也不是可以躺着的后花园——勇闯涨价和竞争烈度已经在公开场合被华润提起。正确写法是：山东先做升级保卫，验证全麦在勇闯桌上还能否被点，再把方法带出去。只守不升，永远是区域品牌；只抽不守，连区域品牌都保不住。</w:t>
+      </w:r>
+    </w:p>
+    <w:p>
+      <w:pPr>
+        <w:spacing w:before="220" w:after="100"/>
+        <w:ind w:firstLine="0"/>
+      </w:pPr>
+      <w:r>
+        <w:rPr>
+          <w:rFonts w:ascii="Calibri" w:hAnsi="Calibri" w:eastAsia="微软雅黑" w:cs="Calibri"/>
+          <w:b/>
+          <w:i w:val="0"/>
+          <w:color w:val="1A1A1A"/>
+          <w:sz w:val="24"/>
+        </w:rPr>
+        <w:t>4.3  河北：飞书点名的第二核心，四强已经在桌上</w:t>
+      </w:r>
+    </w:p>
+    <w:p>
+      <w:pPr>
+        <w:spacing w:before="0" w:after="140" w:line="307" w:lineRule="auto"/>
+        <w:ind w:firstLine="0"/>
+        <w:jc w:val="both"/>
+      </w:pPr>
+      <w:r>
+        <w:rPr>
+          <w:rFonts w:ascii="Calibri" w:hAnsi="Calibri" w:eastAsia="微软雅黑" w:cs="Calibri"/>
+          <w:b w:val="0"/>
+          <w:i w:val="0"/>
+          <w:color w:val="1A1A1A"/>
+          <w:sz w:val="22"/>
+        </w:rPr>
+        <w:t>河北 2024 年啤酒产量下降，利润微降，四家企业拿走约一半营收。燕京在这里有根据地，U8 往外溢时河北是近场。雪花有河北公司，青啤有石家庄工厂，蓝贝还在。飞书把河北写成核心市场，公开格局把它写成消耗市场。</w:t>
+      </w:r>
+    </w:p>
+    <w:p>
+      <w:pPr>
+        <w:spacing w:before="0" w:after="140" w:line="307" w:lineRule="auto"/>
+        <w:ind w:firstLine="0"/>
+        <w:jc w:val="both"/>
+      </w:pPr>
+      <w:r>
+        <w:rPr>
+          <w:rFonts w:ascii="Calibri" w:hAnsi="Calibri" w:eastAsia="微软雅黑" w:cs="Calibri"/>
+          <w:b w:val="0"/>
+          <w:i w:val="0"/>
+          <w:color w:val="1A1A1A"/>
+          <w:sz w:val="22"/>
+        </w:rPr>
+        <w:t>河北样板的考核不应是再铺多少低价瓶。要看的是：燕京 U8 和雪花同时在场时，升级后的崂山还能否保住桌数。能保住，北方连片才成立；保不住，全国化在第二核心就已经失败，不必南下验证。</w:t>
+      </w:r>
+    </w:p>
+    <w:p>
+      <w:pPr>
+        <w:spacing w:before="220" w:after="100"/>
+        <w:ind w:firstLine="0"/>
+      </w:pPr>
+      <w:r>
+        <w:rPr>
+          <w:rFonts w:ascii="Calibri" w:hAnsi="Calibri" w:eastAsia="微软雅黑" w:cs="Calibri"/>
+          <w:b/>
+          <w:i w:val="0"/>
+          <w:color w:val="1A1A1A"/>
+          <w:sz w:val="24"/>
+        </w:rPr>
+        <w:t>4.4  华南：产量中心南移，品牌墙比需求墙高</w:t>
+      </w:r>
+    </w:p>
+    <w:p>
+      <w:pPr>
+        <w:spacing w:before="0" w:after="140" w:line="307" w:lineRule="auto"/>
+        <w:ind w:firstLine="0"/>
+        <w:jc w:val="both"/>
+      </w:pPr>
+      <w:r>
+        <w:rPr>
+          <w:rFonts w:ascii="Calibri" w:hAnsi="Calibri" w:eastAsia="微软雅黑" w:cs="Calibri"/>
+          <w:b w:val="0"/>
+          <w:i w:val="0"/>
+          <w:color w:val="1A1A1A"/>
+          <w:sz w:val="22"/>
+        </w:rPr>
+        <w:t>广东成为第一生产大省，雪花、嘉士伯、青啤都在这里有过产能或收购。珠江把 95% 以上收入放在华南且仍在增长。飞书禁止用统一策略覆盖全国，落成操作就是：不与珠江抢「广东人自己的啤酒」，不与喜力、嘉士伯抢夜场高档，只试验外地大众品牌能否在中低端餐饮和传统零售站住。</w:t>
+      </w:r>
+    </w:p>
+    <w:p>
+      <w:pPr>
+        <w:spacing w:before="0" w:after="140" w:line="307" w:lineRule="auto"/>
+        <w:ind w:firstLine="0"/>
+        <w:jc w:val="both"/>
+      </w:pPr>
+      <w:r>
+        <w:rPr>
+          <w:rFonts w:ascii="Calibri" w:hAnsi="Calibri" w:eastAsia="微软雅黑" w:cs="Calibri"/>
+          <w:b w:val="0"/>
+          <w:i w:val="0"/>
+          <w:color w:val="1A1A1A"/>
+          <w:sz w:val="22"/>
+        </w:rPr>
+        <w:t>样板城缩小到一座，不要写成华南大区。门槛五条：有现成青啤或崂山经销商，90 天能铺进餐饮加零售；现饮场景和北方同源，烧烤、夜宵、海鲜，降低教育成本；勇闯或 U8 费用还没顶格；不和青岛经典抢同一张中档桌；能铺到邻城，不是旅游孤岛。按这个筛，南下先是一座夜宵城，不是广东省。</w:t>
+      </w:r>
+    </w:p>
+    <w:p>
+      <w:pPr>
+        <w:spacing w:before="0" w:after="140" w:line="307" w:lineRule="auto"/>
+        <w:ind w:firstLine="0"/>
+        <w:jc w:val="both"/>
+      </w:pPr>
+      <w:r>
+        <w:rPr>
+          <w:rFonts w:ascii="Calibri" w:hAnsi="Calibri" w:eastAsia="微软雅黑" w:cs="Calibri"/>
+          <w:b w:val="0"/>
+          <w:i w:val="0"/>
+          <w:color w:val="1A1A1A"/>
+          <w:sz w:val="22"/>
+        </w:rPr>
+        <w:t>华东 2024 年掉了 9.91%，2025 年转正 3.81%，体量介于华北和华南之间。本稿不把华东写成第三核心，除非崂山分省数回来以后显示那里已经有可观的桌。沿黄、鲁西可以和山东保卫放在同一组观察，不另开一条「全国战线」。</w:t>
       </w:r>
     </w:p>
     <w:tbl>
@@ -5779,7 +6304,7 @@
           <w:color w:val="1428A0"/>
           <w:sz w:val="30"/>
         </w:rPr>
-        <w:t>04  判断</w:t>
+        <w:t>05  把对手和区域收成一条逻辑</w:t>
       </w:r>
     </w:p>
     <w:p>
@@ -5804,7 +6329,7 @@
           <w:color w:val="1A1A1A"/>
           <w:sz w:val="22"/>
         </w:rPr>
-        <w:t>崂山要赢的不是五强排位，是 6—8 元那一桌有没有独立理由被点。假想敌按这个顺序：雪花第一，燕京第二——清爽在下面、U8 在上面。青岛主品牌是红线。哈尔滨小麦王是全麦叙事最近的干扰项，终端核价后决定是否升格为主对手。</w:t>
+        <w:t>前面分开写了人和地。收口时只保留能互相支撑的句子，其余留给其他组。</w:t>
       </w:r>
     </w:p>
     <w:p>
@@ -5821,7 +6346,7 @@
           <w:color w:val="1A1A1A"/>
           <w:sz w:val="22"/>
         </w:rPr>
-        <w:t>第二品牌三年失量，全国化是止衰，不是锦上添花。吨酒收入按其他品牌粗算约 2,970—3,000 元 / 千升，大约是青岛品牌的六成。继续当便宜青岛，资源会被主品牌吸走；做成独立大众品牌，失量才有机会变成再配置。</w:t>
+        <w:t>总量不再长，份额在大单品和终端上重分。青啤主品牌 2025 年已经回量，其他品牌仍在降。崂山全国化的时间窗口，叠在第二品牌失量、主品牌吸量的阶段。继续当便宜青岛，资源会被主品牌拿走；做成独立大众品牌，失量才有机会变成再配置。这是为什么对手不能写成青岛经典，价位不能停在「再便宜一档」。</w:t>
       </w:r>
     </w:p>
     <w:p>
@@ -5838,7 +6363,7 @@
           <w:color w:val="1A1A1A"/>
           <w:sz w:val="22"/>
         </w:rPr>
-        <w:t>南方中低端并不空。空的是「有品质感、不是青岛、还进得了大众预算」。样板先定门槛：有现成经销商、场景和北方同源、勇闯或 U8 费用还没顶格、不和经典抢同一张中档桌、能铺到邻城。按这个看，先做鲁西或冀中的升级保卫，再进一座南方夜宵城。不做广东全省，也不做全国铺开。</w:t>
+        <w:t>桌上的替换顺序因此是固定的。6 元以下，店主换的是勇闯和燕京清爽。6—8 元，截流的是 U8、老雪和小麦王。经典桌不进。北方已经是这个结构：山东有勇闯，河北有 U8。南方多一块珠江墙，并不是少一块对手。所以南下不是去填空，是把北方已经成立的对位，搬到一座场景相近、费用尚未顶格的城里再试一次。</w:t>
       </w:r>
     </w:p>
     <w:p>
@@ -5855,7 +6380,116 @@
           <w:color w:val="1A1A1A"/>
           <w:sz w:val="22"/>
         </w:rPr>
-        <w:t>现饮可以做原点，不能做唯一引擎。百威中国连续两年双位数下滑，写的就是现饮。样板城同时看餐饮桌数、零售排面、即时零售有没有出单。铺货家数不算阶段成果。</w:t>
+        <w:t>区域顺序也因此是固定的。鲁冀是保卫战，证明全麦在勇闯和 U8 同时在场时还能否被点。南方是进入战，证明外地大众瓶在珠江和雪花的桌子上有没有第二次被点的机会。两个样板回答两个不同的问题，不能互相替代：北方赢了，只说明根据地还在；南方赢了，只说明有一座城可以被复制。全国化成立，要两个都成立。现在公开数据只支持把样板名单收到这个范围，不支持写成广东全省或全国铺开。</w:t>
+      </w:r>
+    </w:p>
+    <w:p>
+      <w:pPr>
+        <w:spacing w:before="0" w:after="140" w:line="307" w:lineRule="auto"/>
+        <w:ind w:firstLine="0"/>
+        <w:jc w:val="both"/>
+      </w:pPr>
+      <w:r>
+        <w:rPr>
+          <w:rFonts w:ascii="Calibri" w:hAnsi="Calibri" w:eastAsia="微软雅黑" w:cs="Calibri"/>
+          <w:b w:val="0"/>
+          <w:i w:val="0"/>
+          <w:color w:val="1A1A1A"/>
+          <w:sz w:val="22"/>
+        </w:rPr>
+        <w:t>现饮是两条战线的共同原点，也是共同风险。飞书钉在火锅烧烤小龙虾，百威中国用两年双位数下滑证明现饮的 β。样板城的数因此不能只留铺货家数。餐饮桌数说明有没有被点，零售排面说明离开桌子以后还在不在，即时零售说明有没有第三条出货。三项里只有铺货、没有售卖和补货，和金威、乌苏那类「出货快于饮用」是同一类错误——对照本身归案例组，本组只把这条纪律留下。</w:t>
+      </w:r>
+    </w:p>
+    <w:p>
+      <w:pPr>
+        <w:spacing w:before="320" w:after="40"/>
+        <w:ind w:firstLine="0"/>
+      </w:pPr>
+      <w:r>
+        <w:rPr>
+          <w:rFonts w:ascii="Calibri" w:hAnsi="Calibri" w:eastAsia="微软雅黑" w:cs="Calibri"/>
+          <w:b/>
+          <w:i w:val="0"/>
+          <w:color w:val="1428A0"/>
+          <w:sz w:val="30"/>
+        </w:rPr>
+        <w:t>06  判断</w:t>
+      </w:r>
+    </w:p>
+    <w:p>
+      <w:pPr>
+        <w:spacing w:before="0" w:after="160"/>
+        <w:pBdr>
+          <w:bottom w:val="single" w:sz="12" w:space="1" w:color="1428A0"/>
+        </w:pBdr>
+      </w:pPr>
+    </w:p>
+    <w:p>
+      <w:pPr>
+        <w:spacing w:before="0" w:after="140" w:line="307" w:lineRule="auto"/>
+        <w:ind w:firstLine="0"/>
+        <w:jc w:val="both"/>
+      </w:pPr>
+      <w:r>
+        <w:rPr>
+          <w:rFonts w:ascii="Calibri" w:hAnsi="Calibri" w:eastAsia="微软雅黑" w:cs="Calibri"/>
+          <w:b w:val="0"/>
+          <w:i w:val="0"/>
+          <w:color w:val="1A1A1A"/>
+          <w:sz w:val="22"/>
+        </w:rPr>
+        <w:t>崂山要赢的不是五强排位，是 6—8 元那一桌有没有独立理由被点。假想敌：雪花第一，燕京第二——清爽在下、U8 在上。青岛主品牌是红线。哈尔滨小麦王先当全麦叙事的干扰，终端核价后再决定升不升格。</w:t>
+      </w:r>
+    </w:p>
+    <w:p>
+      <w:pPr>
+        <w:spacing w:before="0" w:after="140" w:line="307" w:lineRule="auto"/>
+        <w:ind w:firstLine="0"/>
+        <w:jc w:val="both"/>
+      </w:pPr>
+      <w:r>
+        <w:rPr>
+          <w:rFonts w:ascii="Calibri" w:hAnsi="Calibri" w:eastAsia="微软雅黑" w:cs="Calibri"/>
+          <w:b w:val="0"/>
+          <w:i w:val="0"/>
+          <w:color w:val="1A1A1A"/>
+          <w:sz w:val="22"/>
+        </w:rPr>
+        <w:t>第二品牌三年失量，全国化是止衰。吨酒收入停在主品牌的六成左右。6 元以下只守不扩；扩出去的规格必须离开「更便宜的青岛」，又不能撞进经典带。规格、包装、购买理由的写法归产品组，本组只锁价位和对手。</w:t>
+      </w:r>
+    </w:p>
+    <w:p>
+      <w:pPr>
+        <w:spacing w:before="0" w:after="140" w:line="307" w:lineRule="auto"/>
+        <w:ind w:firstLine="0"/>
+        <w:jc w:val="both"/>
+      </w:pPr>
+      <w:r>
+        <w:rPr>
+          <w:rFonts w:ascii="Calibri" w:hAnsi="Calibri" w:eastAsia="微软雅黑" w:cs="Calibri"/>
+          <w:b w:val="0"/>
+          <w:i w:val="0"/>
+          <w:color w:val="1A1A1A"/>
+          <w:sz w:val="22"/>
+        </w:rPr>
+        <w:t>样板两座，问题不同。鲁西或冀中：升级保卫，对手是勇闯加 U8。一座南方夜宵城：进入试验，对手是珠江加雪花，场景仍要和北方同源。门槛仍是那五条。不做华南大区，不做全国铺开。</w:t>
+      </w:r>
+    </w:p>
+    <w:p>
+      <w:pPr>
+        <w:spacing w:before="0" w:after="140" w:line="307" w:lineRule="auto"/>
+        <w:ind w:firstLine="0"/>
+        <w:jc w:val="both"/>
+      </w:pPr>
+      <w:r>
+        <w:rPr>
+          <w:rFonts w:ascii="Calibri" w:hAnsi="Calibri" w:eastAsia="微软雅黑" w:cs="Calibri"/>
+          <w:b w:val="0"/>
+          <w:i w:val="0"/>
+          <w:color w:val="1A1A1A"/>
+          <w:sz w:val="22"/>
+        </w:rPr>
+        <w:t>现饮做原点，不做唯一引擎。铺货家数不作为阶段成果。本组对样板的经营定义停在：这张桌上还是不是那几个对手、还在不在那两个价位。经销利润、费用科目、案例对照，分别交回渠道组和案例组。</w:t>
       </w:r>
     </w:p>
     <w:tbl>
@@ -5898,7 +6532,7 @@
                 <w:color w:val="1428A0"/>
                 <w:sz w:val="21"/>
               </w:rPr>
-              <w:t>给 10.13 的三句</w:t>
+              <w:t>给 10.13 的收口</w:t>
             </w:r>
           </w:p>
           <w:p>
@@ -5915,7 +6549,7 @@
                 <w:color w:val="1A1A1A"/>
                 <w:sz w:val="21"/>
               </w:rPr>
-              <w:t>对手是勇闯、小麦王、燕京清爽，上一层还有 U8；不是青岛经典。战场先在鲁冀守住，再进一座南方夜宵城。价位看 6—8 元，6 元以下只守不扩。</w:t>
+              <w:t>对手是勇闯、小麦王、燕京清爽，上一层还有 U8，不是青岛经典。战场先在鲁冀证明升级还守得住桌，再进一座南方夜宵城看外地瓶能不能被点第二次。价位看 6—8 元，6 元以下只守不扩。现在公开数据够锁住这三句；不够写出分省份额和货架成交价。</w:t>
             </w:r>
           </w:p>
         </w:tc>
@@ -5939,7 +6573,7 @@
           <w:color w:val="1428A0"/>
           <w:sz w:val="30"/>
         </w:rPr>
-        <w:t>05  本组还缺的数</w:t>
+        <w:t>07  本组还缺的数</w:t>
       </w:r>
     </w:p>
     <w:p>
@@ -6088,7 +6722,7 @@
           <w:color w:val="1428A0"/>
           <w:sz w:val="30"/>
         </w:rPr>
-        <w:t>06  来源</w:t>
+        <w:t>08  来源</w:t>
       </w:r>
     </w:p>
     <w:p>

</xml_diff>

<commit_message>
Rewrite competitive-markets memo in MBB pyramid form
Lead with the governing thought, then MECE arguments A–C, so-whats, falsifiers, and a locked resource sequence. Keep cases, product, and channel work out of scope.

Co-authored-by: MotWang <MotWang@users.noreply.github.com>
</commit_message>
<xml_diff>
--- a/deliverables/Laoshan_Competitive_Markets.docx
+++ b/deliverables/Laoshan_Competitive_Markets.docx
@@ -63,7 +63,7 @@
           <w:color w:val="1428A0"/>
           <w:sz w:val="20"/>
         </w:rPr>
-        <w:t>RESEARCH BRIEF  ·  02 / 04</w:t>
+        <w:t>WORKING PAPER  ·  02 / 04</w:t>
       </w:r>
     </w:p>
     <w:p>
@@ -80,7 +80,7 @@
           <w:color w:val="767676"/>
           <w:sz w:val="24"/>
         </w:rPr>
-        <w:t>崂山啤酒  ·  品牌升级与全国化</w:t>
+        <w:t>崂山啤酒品牌升级与全国化</w:t>
       </w:r>
     </w:p>
     <w:p>
@@ -114,7 +114,7 @@
           <w:color w:val="767676"/>
           <w:sz w:val="24"/>
         </w:rPr>
-        <w:t>谁在抢同一桌酒，战场实际在哪些省</w:t>
+        <w:t>Governing thought：全国化成立，当且仅当鲁冀守得住桌、南方有一座城能被点第二次</w:t>
       </w:r>
     </w:p>
     <w:p>
@@ -169,7 +169,6 @@
                 <w:color w:val="FFFFFF"/>
                 <w:sz w:val="17"/>
               </w:rPr>
-              <w:t>项目</w:t>
             </w:r>
           </w:p>
         </w:tc>
@@ -205,7 +204,6 @@
                 <w:color w:val="FFFFFF"/>
                 <w:sz w:val="17"/>
               </w:rPr>
-              <w:t>内容</w:t>
             </w:r>
           </w:p>
         </w:tc>
@@ -243,7 +241,7 @@
                 <w:color w:val="1A1A1A"/>
                 <w:sz w:val="17"/>
               </w:rPr>
-              <w:t>负责人 / 协同</w:t>
+              <w:t>作者</w:t>
             </w:r>
           </w:p>
         </w:tc>
@@ -279,7 +277,7 @@
                 <w:color w:val="1A1A1A"/>
                 <w:sz w:val="17"/>
               </w:rPr>
-              <w:t>wqf  /  zhh</w:t>
+              <w:t>wqf / zhh　｜　对应分工：竞争品牌与区域市场</w:t>
             </w:r>
           </w:p>
         </w:tc>
@@ -317,7 +315,7 @@
                 <w:color w:val="1A1A1A"/>
                 <w:sz w:val="17"/>
               </w:rPr>
-              <w:t>对应分工</w:t>
+              <w:t>读者</w:t>
             </w:r>
           </w:p>
         </w:tc>
@@ -353,7 +351,7 @@
                 <w:color w:val="1A1A1A"/>
                 <w:sz w:val="17"/>
               </w:rPr>
-              <w:t>二、竞争品牌与区域市场。行业总量综述、崂山产品档案、跨品类案例、渠道利润模型不在本稿</w:t>
+              <w:t>10.13 上海销总汇报；课题 EM 整合</w:t>
             </w:r>
           </w:p>
         </w:tc>
@@ -391,7 +389,7 @@
                 <w:color w:val="1A1A1A"/>
                 <w:sz w:val="17"/>
               </w:rPr>
-              <w:t>时间窗口</w:t>
+              <w:t>不写</w:t>
             </w:r>
           </w:p>
         </w:tc>
@@ -427,7 +425,7 @@
                 <w:color w:val="1A1A1A"/>
                 <w:sz w:val="17"/>
               </w:rPr>
-              <w:t>2023—2025 年全年；主体为崂山品牌，不含青岛主品牌</w:t>
+              <w:t>行业总量综述、崂山产品档案、跨品类案例、渠道利润与组织考核</w:t>
             </w:r>
           </w:p>
         </w:tc>
@@ -465,7 +463,7 @@
                 <w:color w:val="1A1A1A"/>
                 <w:sz w:val="17"/>
               </w:rPr>
-              <w:t>材料依据</w:t>
+              <w:t>口径</w:t>
             </w:r>
           </w:p>
         </w:tc>
@@ -501,7 +499,7 @@
                 <w:color w:val="1A1A1A"/>
                 <w:sz w:val="17"/>
               </w:rPr>
-              <w:t>飞书研讨页；复盘@YJ 逐字稿预研判断与 H6；上市公司年报与统计局产量</w:t>
+              <w:t>2023—2025；主体为崂山品牌。青啤「其他品牌」≠ 崂山单品牌</w:t>
             </w:r>
           </w:p>
         </w:tc>
@@ -539,7 +537,7 @@
                 <w:color w:val="1A1A1A"/>
                 <w:sz w:val="17"/>
               </w:rPr>
-              <w:t>本稿</w:t>
+              <w:t>日期</w:t>
             </w:r>
           </w:p>
         </w:tc>
@@ -575,7 +573,7 @@
                 <w:color w:val="1A1A1A"/>
                 <w:sz w:val="17"/>
               </w:rPr>
-              <w:t>2026-10-04 修订。会上【填】未闭环，不以空格冒充品牌方原话</w:t>
+              <w:t>2026-10-04。YJ 会上【填】未当作品牌方原话</w:t>
             </w:r>
           </w:p>
         </w:tc>
@@ -594,7 +592,7 @@
           <w:color w:val="767676"/>
           <w:sz w:val="17"/>
         </w:rPr>
-        <w:t>表 0  文件信息。评价单元按 YJ：看品牌经营，不看青啤公司总量。</w:t>
+        <w:t>表 0  本稿边界。评价单元按 YJ：品牌经营，不是青啤公司总量。</w:t>
       </w:r>
     </w:p>
     <w:p>
@@ -610,7 +608,7 @@
           <w:color w:val="1428A0"/>
           <w:sz w:val="30"/>
         </w:rPr>
-        <w:t>01  本稿要收住的问题</w:t>
+        <w:t>01  先给答案</w:t>
       </w:r>
     </w:p>
     <w:p>
@@ -635,7 +633,7 @@
           <w:color w:val="1A1A1A"/>
           <w:sz w:val="22"/>
         </w:rPr>
-        <w:t>全国化课题容易写成「中国啤酒很大、五强很强、崂山要加油」。那三句话对 10 月 13 日没有用。本组只收两个问题：店里那瓶崂山跟谁并排、被谁换掉；这件事在哪些省已经发生、在哪些省还没资格发生。</w:t>
+        <w:t>10 月 13 日要决定的，不是「崂山要不要全国化」。公开战略已经写成主品牌加全国性第二品牌。要决定的是：在存量盘里，和谁抢、在哪抢、先证明什么才允许把费用铺开。</w:t>
       </w:r>
     </w:p>
     <w:p>
@@ -652,7 +650,118 @@
           <w:color w:val="1A1A1A"/>
           <w:sz w:val="22"/>
         </w:rPr>
-        <w:t>飞书把目标写成独立大众品牌，避开青啤腹地，核心市场在山东、河北，场景在火锅、烧烤、小龙虾，节奏是样板先行。YJ 预调研补了两条读数纪律：竞争同时发生在企业体系和终端；全国化的评价单元是品牌经营，不是公司总量。两条合在一起，对手名单不能按集团排，区域判断不能把青啤分部账本当成崂山消费地图。</w:t>
+        <w:t>答案是三句，后面每一节只为这三句提供支持，不为这三句提供气氛。</w:t>
+      </w:r>
+    </w:p>
+    <w:p>
+      <w:pPr>
+        <w:spacing w:after="80" w:line="300" w:lineRule="auto"/>
+        <w:ind w:left="351" w:hanging="170"/>
+        <w:jc w:val="both"/>
+      </w:pPr>
+      <w:r>
+        <w:rPr>
+          <w:rFonts w:ascii="Calibri" w:hAnsi="Calibri" w:eastAsia="微软雅黑" w:cs="Calibri"/>
+          <w:b/>
+          <w:i w:val="0"/>
+          <w:color w:val="1428A0"/>
+          <w:sz w:val="22"/>
+        </w:rPr>
+        <w:t xml:space="preserve">–  </w:t>
+      </w:r>
+      <w:r>
+        <w:rPr>
+          <w:rFonts w:ascii="Calibri" w:hAnsi="Calibri" w:eastAsia="微软雅黑" w:cs="Calibri"/>
+          <w:b/>
+          <w:i w:val="0"/>
+          <w:color w:val="1A1A1A"/>
+          <w:sz w:val="22"/>
+        </w:rPr>
+        <w:t>和谁抢。</w:t>
+      </w:r>
+      <w:r>
+        <w:rPr>
+          <w:rFonts w:ascii="Calibri" w:hAnsi="Calibri" w:eastAsia="微软雅黑" w:cs="Calibri"/>
+          <w:b w:val="0"/>
+          <w:i w:val="0"/>
+          <w:color w:val="1A1A1A"/>
+          <w:sz w:val="22"/>
+        </w:rPr>
+        <w:t>勇闯天涯、燕京清爽抢塔基；U8、老雪、哈尔滨小麦王在 6—8 元截流。青岛经典不进对手名单。</w:t>
+      </w:r>
+    </w:p>
+    <w:p>
+      <w:pPr>
+        <w:spacing w:after="80" w:line="300" w:lineRule="auto"/>
+        <w:ind w:left="351" w:hanging="170"/>
+        <w:jc w:val="both"/>
+      </w:pPr>
+      <w:r>
+        <w:rPr>
+          <w:rFonts w:ascii="Calibri" w:hAnsi="Calibri" w:eastAsia="微软雅黑" w:cs="Calibri"/>
+          <w:b/>
+          <w:i w:val="0"/>
+          <w:color w:val="1428A0"/>
+          <w:sz w:val="22"/>
+        </w:rPr>
+        <w:t xml:space="preserve">–  </w:t>
+      </w:r>
+      <w:r>
+        <w:rPr>
+          <w:rFonts w:ascii="Calibri" w:hAnsi="Calibri" w:eastAsia="微软雅黑" w:cs="Calibri"/>
+          <w:b/>
+          <w:i w:val="0"/>
+          <w:color w:val="1A1A1A"/>
+          <w:sz w:val="22"/>
+        </w:rPr>
+        <w:t>在哪抢。</w:t>
+      </w:r>
+      <w:r>
+        <w:rPr>
+          <w:rFonts w:ascii="Calibri" w:hAnsi="Calibri" w:eastAsia="微软雅黑" w:cs="Calibri"/>
+          <w:b w:val="0"/>
+          <w:i w:val="0"/>
+          <w:color w:val="1A1A1A"/>
+          <w:sz w:val="22"/>
+        </w:rPr>
+        <w:t>先在山东、河北证明升级后的崂山还能从勇闯和 U8 手里保住桌。再在一座场景同源的南方夜宵城，看外地大众瓶能不能被点第二次。</w:t>
+      </w:r>
+    </w:p>
+    <w:p>
+      <w:pPr>
+        <w:spacing w:after="80" w:line="300" w:lineRule="auto"/>
+        <w:ind w:left="351" w:hanging="170"/>
+        <w:jc w:val="both"/>
+      </w:pPr>
+      <w:r>
+        <w:rPr>
+          <w:rFonts w:ascii="Calibri" w:hAnsi="Calibri" w:eastAsia="微软雅黑" w:cs="Calibri"/>
+          <w:b/>
+          <w:i w:val="0"/>
+          <w:color w:val="1428A0"/>
+          <w:sz w:val="22"/>
+        </w:rPr>
+        <w:t xml:space="preserve">–  </w:t>
+      </w:r>
+      <w:r>
+        <w:rPr>
+          <w:rFonts w:ascii="Calibri" w:hAnsi="Calibri" w:eastAsia="微软雅黑" w:cs="Calibri"/>
+          <w:b/>
+          <w:i w:val="0"/>
+          <w:color w:val="1A1A1A"/>
+          <w:sz w:val="22"/>
+        </w:rPr>
+        <w:t>先证明什么。</w:t>
+      </w:r>
+      <w:r>
+        <w:rPr>
+          <w:rFonts w:ascii="Calibri" w:hAnsi="Calibri" w:eastAsia="微软雅黑" w:cs="Calibri"/>
+          <w:b w:val="0"/>
+          <w:i w:val="0"/>
+          <w:color w:val="1A1A1A"/>
+          <w:sz w:val="22"/>
+        </w:rPr>
+        <w:t>6 元以下只守不扩。扩出去的规格必须离开「更便宜的青岛」，又不能撞进经典带。H4 未拍板之前，这是工作口径，不是官方零售价。</w:t>
       </w:r>
     </w:p>
     <w:p>
@@ -669,48 +778,7 @@
           <w:color w:val="1A1A1A"/>
           <w:sz w:val="22"/>
         </w:rPr>
-        <w:t>价格带还没被品牌方拍板。课题写 6 元以下，分工材料写 8 元以下，YJ 的 H4 仍空着。本稿先当工作口径用：历史成交在 6 元以下，升级后要看的是 6—8 元。6 元以下是守盘，6—8 元才是独立品牌还站不站得住。青岛经典、纯生不进对手名单。</w:t>
-      </w:r>
-    </w:p>
-    <w:p>
-      <w:pPr>
-        <w:spacing w:before="320" w:after="40"/>
-        <w:ind w:firstLine="0"/>
-      </w:pPr>
-      <w:r>
-        <w:rPr>
-          <w:rFonts w:ascii="Calibri" w:hAnsi="Calibri" w:eastAsia="微软雅黑" w:cs="Calibri"/>
-          <w:b/>
-          <w:i w:val="0"/>
-          <w:color w:val="1428A0"/>
-          <w:sz w:val="30"/>
-        </w:rPr>
-        <w:t>02  总量停了之后，竞争改怎么读</w:t>
-      </w:r>
-    </w:p>
-    <w:p>
-      <w:pPr>
-        <w:spacing w:before="0" w:after="160"/>
-        <w:pBdr>
-          <w:bottom w:val="single" w:sz="12" w:space="1" w:color="1428A0"/>
-        </w:pBdr>
-      </w:pPr>
-    </w:p>
-    <w:p>
-      <w:pPr>
-        <w:spacing w:before="0" w:after="140" w:line="307" w:lineRule="auto"/>
-        <w:ind w:firstLine="0"/>
-        <w:jc w:val="both"/>
-      </w:pPr>
-      <w:r>
-        <w:rPr>
-          <w:rFonts w:ascii="Calibri" w:hAnsi="Calibri" w:eastAsia="微软雅黑" w:cs="Calibri"/>
-          <w:b w:val="0"/>
-          <w:i w:val="0"/>
-          <w:color w:val="1A1A1A"/>
-          <w:sz w:val="22"/>
-        </w:rPr>
-        <w:t>2023 年规上啤酒产量 3,555.5 万千升，同比 +0.3%；2024 年 3,521.3 万千升，−0.6%；2025 年公告 3,536.0 万千升，同比 −1.1%。三年都在 3,500 万千升上下，没有扩容故事。同期青啤中高端以上 2025 年 +5.2%，燕京 U8 +29.31%。YJ 预调研那句「行业总量承压，增长向具体产品分化」可以直接用。对崂山，含义很硬：全国化带不来行业增量，只能从别人杯子里抢酒。</w:t>
+        <w:t>全国化成立，当且仅当这两个试验同时成立。北方赢了，只说明根据地还在；南方赢了，只说明有一座城可以被复制。现在的公开数据够把资源锁在这两个试验上，不够支持铺省或铺全国。</w:t>
       </w:r>
     </w:p>
     <w:p>
@@ -727,7 +795,7 @@
           <w:color w:val="1A1A1A"/>
           <w:sz w:val="22"/>
         </w:rPr>
-        <w:t>2024 年是分化年。百威亚太中国区 −11.8%，青啤集团 −5.86%，华润 −2.5%，重啤几乎持平，燕京、珠江正增长。2025 年除百威中国区再 −8.6% 外，其余转正。龙头让出的不是空白市场，是结构：现饮弱的掉得快，有大单品的还在长。崂山如果按「等行业回暖再铺」来排期，会错过正在发生的再分配。</w:t>
+        <w:t>三条支持论点按 MECE 展开。A：战场已经从集团排位改到产品和终端，第二品牌还在失量。B：对手必须分层，否则会把勇闯和 U8 写成同一个敌人，也会把青岛经典误列进来。C：地理不是「往南走」，是保卫战加进入战，两场回答两个问题。三节各自有 So what；第五节把它们收成一条决策逻辑。</w:t>
       </w:r>
     </w:p>
     <w:p>
@@ -744,7 +812,7 @@
           <w:color w:val="1A1A1A"/>
           <w:sz w:val="22"/>
         </w:rPr>
-        <w:t>华润 2024 年 1,087.4 万千升，2025 年约 1,103 万千升，仍是量的标尺。青啤集团 753.8 万、764.8 万千升。燕京 400.44 万、405.30 万千升。把企业销量除以 2024 年规上产量，华润约 30.9%，青啤约 21.4%，燕京约 11.4%。这不是官方市占，只说明量级。崂山即使把「其他品牌」全部算上，2024 年也只是 320 万千升这一档，和燕京全公司还差一截，和华润差一个数量级。全国化的成功标准不能写成进入五强。</w:t>
+        <w:t>问题树只拆到本组边界。第一层：全国化现在要不要铺开费用，还是先做可证伪的试验。答案是后者。第二层拆三个互不重叠的问题——战场是不是还在扩（A）、桌上的敌人是谁（B）、先在哪张地图上证明（C）。行业为什么缩量、全麦配方怎么写、经销商毛利够不够、乌苏怎么打出来，分别在树的其他枝上，不在本稿展开。</w:t>
       </w:r>
     </w:p>
     <w:p>
@@ -761,7 +829,115 @@
           <w:color w:val="1A1A1A"/>
           <w:sz w:val="22"/>
         </w:rPr>
-        <w:t>青啤公开战略是「主品牌 + 崂山全国性第二品牌」。2023—2025 年青岛品牌 456 → 434 → 449 万千升，2025 年回正 3.54%；其他品牌（崂山为代表）345 → 320 → 315 万千升，收入约 101.4 → 94.95 → 94.48 亿元。集团在修主品牌，第二品牌仍在失量。按其他品牌粗算，2024 年吨酒收入约 2,967 元 / 千升，2025 年约 3,000 元 / 千升，大约是青岛品牌 5,000 元量级的六成。全国化如果按公司销量讲，会把青岛的回量误读成崂山的空间。</w:t>
+        <w:t>预调研里四条判断，本组只继承两条读数纪律：竞争同时发生在体系和终端；评价单元是品牌经营。另外两条——总量承压、崂山大众角色已被披露——当作已知，不重写行业章。H1 到 H3、H5 属于升级和渠道，会上空格不在这里填。</w:t>
+      </w:r>
+    </w:p>
+    <w:tbl>
+      <w:tblPr>
+        <w:tblW w:type="auto" w:w="0"/>
+        <w:tblLook w:firstColumn="1" w:firstRow="1" w:lastColumn="0" w:lastRow="0" w:noHBand="0" w:noVBand="1" w:val="04A0"/>
+        <w:tblW w:w="5000" w:type="pct"/>
+      </w:tblPr>
+      <w:tblGrid>
+        <w:gridCol w:w="9412"/>
+      </w:tblGrid>
+      <w:tr>
+        <w:tc>
+          <w:tcPr>
+            <w:tcW w:type="dxa" w:w="9412"/>
+            <w:shd w:fill="F4F6FB" w:val="clear"/>
+            <w:tcMar>
+              <w:top w:w="90" w:type="dxa"/>
+              <w:left w:w="130" w:type="dxa"/>
+              <w:bottom w:w="90" w:type="dxa"/>
+              <w:right w:w="130" w:type="dxa"/>
+            </w:tcMar>
+            <w:tcBorders>
+              <w:top w:val="nil" w:sz="0" w:color="FFFFFF"/>
+              <w:left w:val="single" w:sz="24" w:color="1428A0"/>
+              <w:bottom w:val="nil" w:sz="0" w:color="FFFFFF"/>
+              <w:right w:val="nil" w:sz="0" w:color="FFFFFF"/>
+            </w:tcBorders>
+          </w:tcPr>
+          <w:p>
+            <w:pPr>
+              <w:spacing w:after="80"/>
+              <w:ind w:firstLine="0"/>
+            </w:pPr>
+            <w:r>
+              <w:rPr>
+                <w:rFonts w:ascii="Calibri" w:hAnsi="Calibri" w:eastAsia="微软雅黑" w:cs="Calibri"/>
+                <w:b/>
+                <w:i w:val="0"/>
+                <w:color w:val="1428A0"/>
+                <w:sz w:val="21"/>
+              </w:rPr>
+              <w:t>如果只带一页进销总</w:t>
+            </w:r>
+          </w:p>
+          <w:p>
+            <w:pPr>
+              <w:spacing w:after="0" w:line="300" w:lineRule="auto"/>
+              <w:ind w:firstLine="0"/>
+              <w:jc w:val="both"/>
+            </w:pPr>
+            <w:r>
+              <w:rPr>
+                <w:rFonts w:ascii="Calibri" w:hAnsi="Calibri" w:eastAsia="微软雅黑" w:cs="Calibri"/>
+                <w:b w:val="0"/>
+                <w:i w:val="0"/>
+                <w:color w:val="1A1A1A"/>
+                <w:sz w:val="21"/>
+              </w:rPr>
+              <w:t>第二品牌在缩、主品牌在修，全国化是止衰不是扩盘。桌上的敌人是雪花和燕京的同价位单品，不是青岛经典。先在鲁冀打赢 6—8 元，再拿一座南方城做复制试验。铺货家数、覆盖省数，都不构成阶段成果。</w:t>
+            </w:r>
+          </w:p>
+        </w:tc>
+      </w:tr>
+    </w:tbl>
+    <w:p>
+      <w:pPr>
+        <w:spacing w:after="120"/>
+      </w:pPr>
+    </w:p>
+    <w:p>
+      <w:pPr>
+        <w:spacing w:before="320" w:after="40"/>
+        <w:ind w:firstLine="0"/>
+      </w:pPr>
+      <w:r>
+        <w:rPr>
+          <w:rFonts w:ascii="Calibri" w:hAnsi="Calibri" w:eastAsia="微软雅黑" w:cs="Calibri"/>
+          <w:b/>
+          <w:i w:val="0"/>
+          <w:color w:val="1428A0"/>
+          <w:sz w:val="30"/>
+        </w:rPr>
+        <w:t>02  论点 A　战场变了：存量、单品、第二品牌失量</w:t>
+      </w:r>
+    </w:p>
+    <w:p>
+      <w:pPr>
+        <w:spacing w:before="0" w:after="160"/>
+        <w:pBdr>
+          <w:bottom w:val="single" w:sz="12" w:space="1" w:color="1428A0"/>
+        </w:pBdr>
+      </w:pPr>
+    </w:p>
+    <w:p>
+      <w:pPr>
+        <w:spacing w:before="220" w:after="100"/>
+        <w:ind w:firstLine="0"/>
+      </w:pPr>
+      <w:r>
+        <w:rPr>
+          <w:rFonts w:ascii="Calibri" w:hAnsi="Calibri" w:eastAsia="微软雅黑" w:cs="Calibri"/>
+          <w:b/>
+          <w:i w:val="0"/>
+          <w:color w:val="1A1A1A"/>
+          <w:sz w:val="24"/>
+        </w:rPr>
+        <w:t>A1  总量不再提供增量，份额在单品上重分</w:t>
       </w:r>
     </w:p>
     <w:p>
@@ -778,7 +954,158 @@
           <w:color w:val="1A1A1A"/>
           <w:sz w:val="22"/>
         </w:rPr>
-        <w:t>其他品牌是组合口径，不是崂山单品牌。320 万、315 万千升不得写成崂山本体。口径限制不影响方向：第二品牌这条线在缩，主品牌这条线在修。飞书说销量相对靠前、品牌力偏弱，和公开账对得上——骨架在，全国心智不在。</w:t>
+        <w:t>规上啤酒产量 2023 年 3,555.5 万千升（+0.3%），2024 年 3,521.3 万千升（−0.6%），2025 年公告 3,536.0 万千升（同比 −1.1%，不与 2024 年当时公布基数连乘）。三年都在 3,500 万千升上下。同一窗口，青啤中高端以上 2025 年 +5.2%，燕京 U8 +29.31%。YJ 预调研的判断可以原句使用：行业总量承压，增长向具体产品分化。</w:t>
+      </w:r>
+    </w:p>
+    <w:p>
+      <w:pPr>
+        <w:spacing w:before="0" w:after="140" w:line="307" w:lineRule="auto"/>
+        <w:ind w:firstLine="0"/>
+        <w:jc w:val="both"/>
+      </w:pPr>
+      <w:r>
+        <w:rPr>
+          <w:rFonts w:ascii="Calibri" w:hAnsi="Calibri" w:eastAsia="微软雅黑" w:cs="Calibri"/>
+          <w:b w:val="0"/>
+          <w:i w:val="0"/>
+          <w:color w:val="1A1A1A"/>
+          <w:sz w:val="22"/>
+        </w:rPr>
+        <w:t>2024 年各家销量方向不一致。百威亚太中国区 −11.8%，青啤集团 −5.86%，华润 −2.5%，重庆啤酒 −0.75%，燕京 +1.57%，珠江 +2.62%。2025 年除百威中国区再 −8.6% 外，华润 +1.4%、青啤 +1.5%、燕京 +1.21%、重啤 +0.68%、珠江 +1.58%。龙头让出的不是空白市场。现饮弱、没有大单品的掉得快；有大单品的还在长。</w:t>
+      </w:r>
+    </w:p>
+    <w:p>
+      <w:pPr>
+        <w:spacing w:before="0" w:after="140" w:line="307" w:lineRule="auto"/>
+        <w:ind w:firstLine="0"/>
+        <w:jc w:val="both"/>
+      </w:pPr>
+      <w:r>
+        <w:rPr>
+          <w:rFonts w:ascii="Calibri" w:hAnsi="Calibri" w:eastAsia="微软雅黑" w:cs="Calibri"/>
+          <w:b w:val="0"/>
+          <w:i w:val="0"/>
+          <w:color w:val="1A1A1A"/>
+          <w:sz w:val="22"/>
+        </w:rPr>
+        <w:t>这意味着：崂山全国化带不来行业增量，只能从别人杯子里抢酒。排期如果写成「等行业回暖再铺」，会错过正在发生的再分配。评价如果写成公司销量，会把青岛主品牌 2025 年的回量，误读成第二品牌的空间。</w:t>
+      </w:r>
+    </w:p>
+    <w:p>
+      <w:pPr>
+        <w:spacing w:before="220" w:after="100"/>
+        <w:ind w:firstLine="0"/>
+      </w:pPr>
+      <w:r>
+        <w:rPr>
+          <w:rFonts w:ascii="Calibri" w:hAnsi="Calibri" w:eastAsia="微软雅黑" w:cs="Calibri"/>
+          <w:b/>
+          <w:i w:val="0"/>
+          <w:color w:val="1A1A1A"/>
+          <w:sz w:val="24"/>
+        </w:rPr>
+        <w:t>A2  量级排除了一种成功定义</w:t>
+      </w:r>
+    </w:p>
+    <w:p>
+      <w:pPr>
+        <w:spacing w:before="0" w:after="140" w:line="307" w:lineRule="auto"/>
+        <w:ind w:firstLine="0"/>
+        <w:jc w:val="both"/>
+      </w:pPr>
+      <w:r>
+        <w:rPr>
+          <w:rFonts w:ascii="Calibri" w:hAnsi="Calibri" w:eastAsia="微软雅黑" w:cs="Calibri"/>
+          <w:b w:val="0"/>
+          <w:i w:val="0"/>
+          <w:color w:val="1A1A1A"/>
+          <w:sz w:val="22"/>
+        </w:rPr>
+        <w:t>华润 2024 年 1,087.4 万千升、2025 年约 1,103 万千升。青啤集团 753.8 万、764.8 万千升。燕京 400.44 万、405.30 万千升。以 2024 年规上产量 3,521.3 万千升做分母，粗算量级分别约 30.9%、21.4%、11.4%。这不是官方市占。它只说明：全国化的成功标准不能写成进入五强。</w:t>
+      </w:r>
+    </w:p>
+    <w:p>
+      <w:pPr>
+        <w:spacing w:before="0" w:after="140" w:line="307" w:lineRule="auto"/>
+        <w:ind w:firstLine="0"/>
+        <w:jc w:val="both"/>
+      </w:pPr>
+      <w:r>
+        <w:rPr>
+          <w:rFonts w:ascii="Calibri" w:hAnsi="Calibri" w:eastAsia="微软雅黑" w:cs="Calibri"/>
+          <w:b w:val="0"/>
+          <w:i w:val="0"/>
+          <w:color w:val="1A1A1A"/>
+          <w:sz w:val="22"/>
+        </w:rPr>
+        <w:t>其他品牌（崂山为代表）2024 年 320 万千升。即便把这一口径全部当成崂山——已经高估——也只相当于燕京全公司的八成、华润的三成。飞书说销量相对靠前、品牌力偏弱，和账对得上：骨架在，全国心智不在。成功标准只能写成：在 6—8 元桌上建立可识别、不依附青岛的被点理由，并在有限样板里拿到可复制的桌数与复购。</w:t>
+      </w:r>
+    </w:p>
+    <w:p>
+      <w:pPr>
+        <w:spacing w:before="220" w:after="100"/>
+        <w:ind w:firstLine="0"/>
+      </w:pPr>
+      <w:r>
+        <w:rPr>
+          <w:rFonts w:ascii="Calibri" w:hAnsi="Calibri" w:eastAsia="微软雅黑" w:cs="Calibri"/>
+          <w:b/>
+          <w:i w:val="0"/>
+          <w:color w:val="1A1A1A"/>
+          <w:sz w:val="24"/>
+        </w:rPr>
+        <w:t>A3  第二品牌在失量，全国化的时间含义是止衰</w:t>
+      </w:r>
+    </w:p>
+    <w:p>
+      <w:pPr>
+        <w:spacing w:before="0" w:after="140" w:line="307" w:lineRule="auto"/>
+        <w:ind w:firstLine="0"/>
+        <w:jc w:val="both"/>
+      </w:pPr>
+      <w:r>
+        <w:rPr>
+          <w:rFonts w:ascii="Calibri" w:hAnsi="Calibri" w:eastAsia="微软雅黑" w:cs="Calibri"/>
+          <w:b w:val="0"/>
+          <w:i w:val="0"/>
+          <w:color w:val="1A1A1A"/>
+          <w:sz w:val="22"/>
+        </w:rPr>
+        <w:t>青啤公开战略是主品牌加崂山全国性第二品牌。青岛品牌销量 2023—2025 年 456 → 434 → 449 万千升，2025 年 +3.54%。其他品牌（崂山为代表）345 → 320 → 315 万千升，收入约 101.4 → 94.95 → 94.48 亿元。按其他品牌还原，吨酒收入约 2,967—3,000 元 / 千升，大约是青岛品牌 5,000 元量级的六成。</w:t>
+      </w:r>
+    </w:p>
+    <w:p>
+      <w:pPr>
+        <w:spacing w:before="0" w:after="140" w:line="307" w:lineRule="auto"/>
+        <w:ind w:firstLine="0"/>
+        <w:jc w:val="both"/>
+      </w:pPr>
+      <w:r>
+        <w:rPr>
+          <w:rFonts w:ascii="Calibri" w:hAnsi="Calibri" w:eastAsia="微软雅黑" w:cs="Calibri"/>
+          <w:b w:val="0"/>
+          <w:i w:val="0"/>
+          <w:color w:val="1A1A1A"/>
+          <w:sz w:val="22"/>
+        </w:rPr>
+        <w:t>320 万、315 万千升不得写成崂山本体。口径限制不改变方向：集团在修主品牌，第二品牌这条线仍在降。全国化启动的窗口，叠在第二品牌失量、主品牌吸量的阶段。</w:t>
+      </w:r>
+    </w:p>
+    <w:p>
+      <w:pPr>
+        <w:spacing w:before="0" w:after="140" w:line="307" w:lineRule="auto"/>
+        <w:ind w:firstLine="0"/>
+        <w:jc w:val="both"/>
+      </w:pPr>
+      <w:r>
+        <w:rPr>
+          <w:rFonts w:ascii="Calibri" w:hAnsi="Calibri" w:eastAsia="微软雅黑" w:cs="Calibri"/>
+          <w:b w:val="0"/>
+          <w:i w:val="0"/>
+          <w:color w:val="1A1A1A"/>
+          <w:sz w:val="22"/>
+        </w:rPr>
+        <w:t>这意味着两件互斥的事。继续当便宜青岛，费用和货架会被主品牌吸走，失量会继续。做成独立大众品牌，失量才有机会变成再配置——同一批经销商、同一批餐饮桌，换一瓶不再叫青岛影子的酒。全国化在本组里的含义，不是锦上添花，是止衰。产品怎么写购买理由，归产品组；本组锁住的是：止衰只能发生在同价位桌上，不能发生在经典桌上。</w:t>
       </w:r>
     </w:p>
     <w:tbl>
@@ -937,7 +1264,7 @@
                 <w:color w:val="FFFFFF"/>
                 <w:sz w:val="17"/>
               </w:rPr>
-              <w:t>2024同比</w:t>
+              <w:t>24同比</w:t>
             </w:r>
           </w:p>
         </w:tc>
@@ -1009,7 +1336,7 @@
                 <w:color w:val="FFFFFF"/>
                 <w:sz w:val="17"/>
               </w:rPr>
-              <w:t>2025同比</w:t>
+              <w:t>25同比</w:t>
             </w:r>
           </w:p>
         </w:tc>
@@ -1409,7 +1736,7 @@
                 <w:color w:val="1A1A1A"/>
                 <w:sz w:val="17"/>
               </w:rPr>
-              <w:t>1,103.0</w:t>
+              <w:t>1,103</w:t>
             </w:r>
           </w:p>
         </w:tc>
@@ -2137,7 +2464,7 @@
                 <w:color w:val="1A1A1A"/>
                 <w:sz w:val="17"/>
               </w:rPr>
-              <w:t>燕京啤酒（含托管）</w:t>
+              <w:t>燕京 / 其中 U8</w:t>
             </w:r>
           </w:p>
         </w:tc>
@@ -2173,7 +2500,7 @@
                 <w:color w:val="1A1A1A"/>
                 <w:sz w:val="17"/>
               </w:rPr>
-              <w:t>394.24</w:t>
+              <w:t>394.24 / —</w:t>
             </w:r>
           </w:p>
         </w:tc>
@@ -2209,7 +2536,7 @@
                 <w:color w:val="1A1A1A"/>
                 <w:sz w:val="17"/>
               </w:rPr>
-              <w:t>400.44</w:t>
+              <w:t>400.44 / 69.60</w:t>
             </w:r>
           </w:p>
         </w:tc>
@@ -2245,7 +2572,7 @@
                 <w:color w:val="1A1A1A"/>
                 <w:sz w:val="17"/>
               </w:rPr>
-              <w:t>+1.57%</w:t>
+              <w:t>+1.57% / +31.4%</w:t>
             </w:r>
           </w:p>
         </w:tc>
@@ -2281,7 +2608,7 @@
                 <w:color w:val="1A1A1A"/>
                 <w:sz w:val="17"/>
               </w:rPr>
-              <w:t>405.30</w:t>
+              <w:t>405.30 / 90</w:t>
             </w:r>
           </w:p>
         </w:tc>
@@ -2317,7 +2644,7 @@
                 <w:color w:val="1A1A1A"/>
                 <w:sz w:val="17"/>
               </w:rPr>
-              <w:t>+1.21%</w:t>
+              <w:t>+1.21% / +29.3%</w:t>
             </w:r>
           </w:p>
         </w:tc>
@@ -2355,7 +2682,443 @@
                 <w:color w:val="1A1A1A"/>
                 <w:sz w:val="17"/>
               </w:rPr>
-              <w:t xml:space="preserve">　燕京 U8</w:t>
+              <w:t>重庆啤酒</w:t>
+            </w:r>
+          </w:p>
+        </w:tc>
+        <w:tc>
+          <w:tcPr>
+            <w:tcW w:type="dxa" w:w="1569"/>
+            <w:shd w:fill="FFFFFF" w:val="clear"/>
+            <w:tcBorders>
+              <w:top w:val="single" w:sz="4" w:space="0" w:color="EEEEEE"/>
+              <w:left w:val="nil" w:sz="0" w:space="0" w:color="FFFFFF"/>
+              <w:bottom w:val="single" w:sz="4" w:space="0" w:color="EEEEEE"/>
+              <w:right w:val="nil" w:sz="0" w:space="0" w:color="FFFFFF"/>
+            </w:tcBorders>
+            <w:tcMar>
+              <w:top w:w="52" w:type="dxa"/>
+              <w:left w:w="72" w:type="dxa"/>
+              <w:bottom w:w="52" w:type="dxa"/>
+              <w:right w:w="72" w:type="dxa"/>
+            </w:tcMar>
+            <w:vAlign w:val="center"/>
+          </w:tcPr>
+          <w:p>
+            <w:pPr>
+              <w:spacing w:before="0" w:after="0" w:line="269" w:lineRule="auto"/>
+              <w:ind w:firstLine="0"/>
+              <w:jc w:val="left"/>
+            </w:pPr>
+            <w:r>
+              <w:rPr>
+                <w:rFonts w:ascii="Calibri" w:hAnsi="Calibri" w:eastAsia="微软雅黑" w:cs="Calibri"/>
+                <w:b w:val="0"/>
+                <w:i w:val="0"/>
+                <w:color w:val="1A1A1A"/>
+                <w:sz w:val="17"/>
+              </w:rPr>
+              <w:t>约 300</w:t>
+            </w:r>
+          </w:p>
+        </w:tc>
+        <w:tc>
+          <w:tcPr>
+            <w:tcW w:type="dxa" w:w="1569"/>
+            <w:shd w:fill="FFFFFF" w:val="clear"/>
+            <w:tcBorders>
+              <w:top w:val="single" w:sz="4" w:space="0" w:color="EEEEEE"/>
+              <w:left w:val="nil" w:sz="0" w:space="0" w:color="FFFFFF"/>
+              <w:bottom w:val="single" w:sz="4" w:space="0" w:color="EEEEEE"/>
+              <w:right w:val="nil" w:sz="0" w:space="0" w:color="FFFFFF"/>
+            </w:tcBorders>
+            <w:tcMar>
+              <w:top w:w="52" w:type="dxa"/>
+              <w:left w:w="72" w:type="dxa"/>
+              <w:bottom w:w="52" w:type="dxa"/>
+              <w:right w:w="72" w:type="dxa"/>
+            </w:tcMar>
+            <w:vAlign w:val="center"/>
+          </w:tcPr>
+          <w:p>
+            <w:pPr>
+              <w:spacing w:before="0" w:after="0" w:line="269" w:lineRule="auto"/>
+              <w:ind w:firstLine="0"/>
+              <w:jc w:val="left"/>
+            </w:pPr>
+            <w:r>
+              <w:rPr>
+                <w:rFonts w:ascii="Calibri" w:hAnsi="Calibri" w:eastAsia="微软雅黑" w:cs="Calibri"/>
+                <w:b w:val="0"/>
+                <w:i w:val="0"/>
+                <w:color w:val="1A1A1A"/>
+                <w:sz w:val="17"/>
+              </w:rPr>
+              <w:t>297.49</w:t>
+            </w:r>
+          </w:p>
+        </w:tc>
+        <w:tc>
+          <w:tcPr>
+            <w:tcW w:type="dxa" w:w="1569"/>
+            <w:shd w:fill="FFFFFF" w:val="clear"/>
+            <w:tcBorders>
+              <w:top w:val="single" w:sz="4" w:space="0" w:color="EEEEEE"/>
+              <w:left w:val="nil" w:sz="0" w:space="0" w:color="FFFFFF"/>
+              <w:bottom w:val="single" w:sz="4" w:space="0" w:color="EEEEEE"/>
+              <w:right w:val="nil" w:sz="0" w:space="0" w:color="FFFFFF"/>
+            </w:tcBorders>
+            <w:tcMar>
+              <w:top w:w="52" w:type="dxa"/>
+              <w:left w:w="72" w:type="dxa"/>
+              <w:bottom w:w="52" w:type="dxa"/>
+              <w:right w:w="72" w:type="dxa"/>
+            </w:tcMar>
+            <w:vAlign w:val="center"/>
+          </w:tcPr>
+          <w:p>
+            <w:pPr>
+              <w:spacing w:before="0" w:after="0" w:line="269" w:lineRule="auto"/>
+              <w:ind w:firstLine="0"/>
+              <w:jc w:val="left"/>
+            </w:pPr>
+            <w:r>
+              <w:rPr>
+                <w:rFonts w:ascii="Calibri" w:hAnsi="Calibri" w:eastAsia="微软雅黑" w:cs="Calibri"/>
+                <w:b w:val="0"/>
+                <w:i w:val="0"/>
+                <w:color w:val="1A1A1A"/>
+                <w:sz w:val="17"/>
+              </w:rPr>
+              <w:t>−0.75%</w:t>
+            </w:r>
+          </w:p>
+        </w:tc>
+        <w:tc>
+          <w:tcPr>
+            <w:tcW w:type="dxa" w:w="1569"/>
+            <w:shd w:fill="FFFFFF" w:val="clear"/>
+            <w:tcBorders>
+              <w:top w:val="single" w:sz="4" w:space="0" w:color="EEEEEE"/>
+              <w:left w:val="nil" w:sz="0" w:space="0" w:color="FFFFFF"/>
+              <w:bottom w:val="single" w:sz="4" w:space="0" w:color="EEEEEE"/>
+              <w:right w:val="nil" w:sz="0" w:space="0" w:color="FFFFFF"/>
+            </w:tcBorders>
+            <w:tcMar>
+              <w:top w:w="52" w:type="dxa"/>
+              <w:left w:w="72" w:type="dxa"/>
+              <w:bottom w:w="52" w:type="dxa"/>
+              <w:right w:w="72" w:type="dxa"/>
+            </w:tcMar>
+            <w:vAlign w:val="center"/>
+          </w:tcPr>
+          <w:p>
+            <w:pPr>
+              <w:spacing w:before="0" w:after="0" w:line="269" w:lineRule="auto"/>
+              <w:ind w:firstLine="0"/>
+              <w:jc w:val="left"/>
+            </w:pPr>
+            <w:r>
+              <w:rPr>
+                <w:rFonts w:ascii="Calibri" w:hAnsi="Calibri" w:eastAsia="微软雅黑" w:cs="Calibri"/>
+                <w:b w:val="0"/>
+                <w:i w:val="0"/>
+                <w:color w:val="1A1A1A"/>
+                <w:sz w:val="17"/>
+              </w:rPr>
+              <w:t>299.52</w:t>
+            </w:r>
+          </w:p>
+        </w:tc>
+        <w:tc>
+          <w:tcPr>
+            <w:tcW w:type="dxa" w:w="1569"/>
+            <w:shd w:fill="FFFFFF" w:val="clear"/>
+            <w:tcBorders>
+              <w:top w:val="single" w:sz="4" w:space="0" w:color="EEEEEE"/>
+              <w:left w:val="nil" w:sz="0" w:space="0" w:color="FFFFFF"/>
+              <w:bottom w:val="single" w:sz="4" w:space="0" w:color="EEEEEE"/>
+              <w:right w:val="nil" w:sz="0" w:space="0" w:color="FFFFFF"/>
+            </w:tcBorders>
+            <w:tcMar>
+              <w:top w:w="52" w:type="dxa"/>
+              <w:left w:w="72" w:type="dxa"/>
+              <w:bottom w:w="52" w:type="dxa"/>
+              <w:right w:w="72" w:type="dxa"/>
+            </w:tcMar>
+            <w:vAlign w:val="center"/>
+          </w:tcPr>
+          <w:p>
+            <w:pPr>
+              <w:spacing w:before="0" w:after="0" w:line="269" w:lineRule="auto"/>
+              <w:ind w:firstLine="0"/>
+              <w:jc w:val="left"/>
+            </w:pPr>
+            <w:r>
+              <w:rPr>
+                <w:rFonts w:ascii="Calibri" w:hAnsi="Calibri" w:eastAsia="微软雅黑" w:cs="Calibri"/>
+                <w:b w:val="0"/>
+                <w:i w:val="0"/>
+                <w:color w:val="1A1A1A"/>
+                <w:sz w:val="17"/>
+              </w:rPr>
+              <w:t>+0.68%</w:t>
+            </w:r>
+          </w:p>
+        </w:tc>
+      </w:tr>
+      <w:tr>
+        <w:tc>
+          <w:tcPr>
+            <w:tcW w:type="dxa" w:w="1569"/>
+            <w:shd w:fill="F7F8FA" w:val="clear"/>
+            <w:tcBorders>
+              <w:top w:val="single" w:sz="4" w:space="0" w:color="EEEEEE"/>
+              <w:left w:val="nil" w:sz="0" w:space="0" w:color="FFFFFF"/>
+              <w:bottom w:val="single" w:sz="4" w:space="0" w:color="EEEEEE"/>
+              <w:right w:val="nil" w:sz="0" w:space="0" w:color="FFFFFF"/>
+            </w:tcBorders>
+            <w:tcMar>
+              <w:top w:w="52" w:type="dxa"/>
+              <w:left w:w="72" w:type="dxa"/>
+              <w:bottom w:w="52" w:type="dxa"/>
+              <w:right w:w="72" w:type="dxa"/>
+            </w:tcMar>
+            <w:vAlign w:val="center"/>
+          </w:tcPr>
+          <w:p>
+            <w:pPr>
+              <w:spacing w:before="0" w:after="0" w:line="269" w:lineRule="auto"/>
+              <w:ind w:firstLine="0"/>
+              <w:jc w:val="left"/>
+            </w:pPr>
+            <w:r>
+              <w:rPr>
+                <w:rFonts w:ascii="Calibri" w:hAnsi="Calibri" w:eastAsia="微软雅黑" w:cs="Calibri"/>
+                <w:b w:val="0"/>
+                <w:i w:val="0"/>
+                <w:color w:val="1A1A1A"/>
+                <w:sz w:val="17"/>
+              </w:rPr>
+              <w:t>珠江啤酒</w:t>
+            </w:r>
+          </w:p>
+        </w:tc>
+        <w:tc>
+          <w:tcPr>
+            <w:tcW w:type="dxa" w:w="1569"/>
+            <w:shd w:fill="F7F8FA" w:val="clear"/>
+            <w:tcBorders>
+              <w:top w:val="single" w:sz="4" w:space="0" w:color="EEEEEE"/>
+              <w:left w:val="nil" w:sz="0" w:space="0" w:color="FFFFFF"/>
+              <w:bottom w:val="single" w:sz="4" w:space="0" w:color="EEEEEE"/>
+              <w:right w:val="nil" w:sz="0" w:space="0" w:color="FFFFFF"/>
+            </w:tcBorders>
+            <w:tcMar>
+              <w:top w:w="52" w:type="dxa"/>
+              <w:left w:w="72" w:type="dxa"/>
+              <w:bottom w:w="52" w:type="dxa"/>
+              <w:right w:w="72" w:type="dxa"/>
+            </w:tcMar>
+            <w:vAlign w:val="center"/>
+          </w:tcPr>
+          <w:p>
+            <w:pPr>
+              <w:spacing w:before="0" w:after="0" w:line="269" w:lineRule="auto"/>
+              <w:ind w:firstLine="0"/>
+              <w:jc w:val="left"/>
+            </w:pPr>
+            <w:r>
+              <w:rPr>
+                <w:rFonts w:ascii="Calibri" w:hAnsi="Calibri" w:eastAsia="微软雅黑" w:cs="Calibri"/>
+                <w:b w:val="0"/>
+                <w:i w:val="0"/>
+                <w:color w:val="1A1A1A"/>
+                <w:sz w:val="17"/>
+              </w:rPr>
+              <w:t>140.28</w:t>
+            </w:r>
+          </w:p>
+        </w:tc>
+        <w:tc>
+          <w:tcPr>
+            <w:tcW w:type="dxa" w:w="1569"/>
+            <w:shd w:fill="F7F8FA" w:val="clear"/>
+            <w:tcBorders>
+              <w:top w:val="single" w:sz="4" w:space="0" w:color="EEEEEE"/>
+              <w:left w:val="nil" w:sz="0" w:space="0" w:color="FFFFFF"/>
+              <w:bottom w:val="single" w:sz="4" w:space="0" w:color="EEEEEE"/>
+              <w:right w:val="nil" w:sz="0" w:space="0" w:color="FFFFFF"/>
+            </w:tcBorders>
+            <w:tcMar>
+              <w:top w:w="52" w:type="dxa"/>
+              <w:left w:w="72" w:type="dxa"/>
+              <w:bottom w:w="52" w:type="dxa"/>
+              <w:right w:w="72" w:type="dxa"/>
+            </w:tcMar>
+            <w:vAlign w:val="center"/>
+          </w:tcPr>
+          <w:p>
+            <w:pPr>
+              <w:spacing w:before="0" w:after="0" w:line="269" w:lineRule="auto"/>
+              <w:ind w:firstLine="0"/>
+              <w:jc w:val="left"/>
+            </w:pPr>
+            <w:r>
+              <w:rPr>
+                <w:rFonts w:ascii="Calibri" w:hAnsi="Calibri" w:eastAsia="微软雅黑" w:cs="Calibri"/>
+                <w:b w:val="0"/>
+                <w:i w:val="0"/>
+                <w:color w:val="1A1A1A"/>
+                <w:sz w:val="17"/>
+              </w:rPr>
+              <w:t>143.96</w:t>
+            </w:r>
+          </w:p>
+        </w:tc>
+        <w:tc>
+          <w:tcPr>
+            <w:tcW w:type="dxa" w:w="1569"/>
+            <w:shd w:fill="F7F8FA" w:val="clear"/>
+            <w:tcBorders>
+              <w:top w:val="single" w:sz="4" w:space="0" w:color="EEEEEE"/>
+              <w:left w:val="nil" w:sz="0" w:space="0" w:color="FFFFFF"/>
+              <w:bottom w:val="single" w:sz="4" w:space="0" w:color="EEEEEE"/>
+              <w:right w:val="nil" w:sz="0" w:space="0" w:color="FFFFFF"/>
+            </w:tcBorders>
+            <w:tcMar>
+              <w:top w:w="52" w:type="dxa"/>
+              <w:left w:w="72" w:type="dxa"/>
+              <w:bottom w:w="52" w:type="dxa"/>
+              <w:right w:w="72" w:type="dxa"/>
+            </w:tcMar>
+            <w:vAlign w:val="center"/>
+          </w:tcPr>
+          <w:p>
+            <w:pPr>
+              <w:spacing w:before="0" w:after="0" w:line="269" w:lineRule="auto"/>
+              <w:ind w:firstLine="0"/>
+              <w:jc w:val="left"/>
+            </w:pPr>
+            <w:r>
+              <w:rPr>
+                <w:rFonts w:ascii="Calibri" w:hAnsi="Calibri" w:eastAsia="微软雅黑" w:cs="Calibri"/>
+                <w:b w:val="0"/>
+                <w:i w:val="0"/>
+                <w:color w:val="1A1A1A"/>
+                <w:sz w:val="17"/>
+              </w:rPr>
+              <w:t>+2.62%</w:t>
+            </w:r>
+          </w:p>
+        </w:tc>
+        <w:tc>
+          <w:tcPr>
+            <w:tcW w:type="dxa" w:w="1569"/>
+            <w:shd w:fill="F7F8FA" w:val="clear"/>
+            <w:tcBorders>
+              <w:top w:val="single" w:sz="4" w:space="0" w:color="EEEEEE"/>
+              <w:left w:val="nil" w:sz="0" w:space="0" w:color="FFFFFF"/>
+              <w:bottom w:val="single" w:sz="4" w:space="0" w:color="EEEEEE"/>
+              <w:right w:val="nil" w:sz="0" w:space="0" w:color="FFFFFF"/>
+            </w:tcBorders>
+            <w:tcMar>
+              <w:top w:w="52" w:type="dxa"/>
+              <w:left w:w="72" w:type="dxa"/>
+              <w:bottom w:w="52" w:type="dxa"/>
+              <w:right w:w="72" w:type="dxa"/>
+            </w:tcMar>
+            <w:vAlign w:val="center"/>
+          </w:tcPr>
+          <w:p>
+            <w:pPr>
+              <w:spacing w:before="0" w:after="0" w:line="269" w:lineRule="auto"/>
+              <w:ind w:firstLine="0"/>
+              <w:jc w:val="left"/>
+            </w:pPr>
+            <w:r>
+              <w:rPr>
+                <w:rFonts w:ascii="Calibri" w:hAnsi="Calibri" w:eastAsia="微软雅黑" w:cs="Calibri"/>
+                <w:b w:val="0"/>
+                <w:i w:val="0"/>
+                <w:color w:val="1A1A1A"/>
+                <w:sz w:val="17"/>
+              </w:rPr>
+              <w:t>146.24</w:t>
+            </w:r>
+          </w:p>
+        </w:tc>
+        <w:tc>
+          <w:tcPr>
+            <w:tcW w:type="dxa" w:w="1569"/>
+            <w:shd w:fill="F7F8FA" w:val="clear"/>
+            <w:tcBorders>
+              <w:top w:val="single" w:sz="4" w:space="0" w:color="EEEEEE"/>
+              <w:left w:val="nil" w:sz="0" w:space="0" w:color="FFFFFF"/>
+              <w:bottom w:val="single" w:sz="4" w:space="0" w:color="EEEEEE"/>
+              <w:right w:val="nil" w:sz="0" w:space="0" w:color="FFFFFF"/>
+            </w:tcBorders>
+            <w:tcMar>
+              <w:top w:w="52" w:type="dxa"/>
+              <w:left w:w="72" w:type="dxa"/>
+              <w:bottom w:w="52" w:type="dxa"/>
+              <w:right w:w="72" w:type="dxa"/>
+            </w:tcMar>
+            <w:vAlign w:val="center"/>
+          </w:tcPr>
+          <w:p>
+            <w:pPr>
+              <w:spacing w:before="0" w:after="0" w:line="269" w:lineRule="auto"/>
+              <w:ind w:firstLine="0"/>
+              <w:jc w:val="left"/>
+            </w:pPr>
+            <w:r>
+              <w:rPr>
+                <w:rFonts w:ascii="Calibri" w:hAnsi="Calibri" w:eastAsia="微软雅黑" w:cs="Calibri"/>
+                <w:b w:val="0"/>
+                <w:i w:val="0"/>
+                <w:color w:val="1A1A1A"/>
+                <w:sz w:val="17"/>
+              </w:rPr>
+              <w:t>+1.58%</w:t>
+            </w:r>
+          </w:p>
+        </w:tc>
+      </w:tr>
+      <w:tr>
+        <w:tc>
+          <w:tcPr>
+            <w:tcW w:type="dxa" w:w="1569"/>
+            <w:shd w:fill="FFFFFF" w:val="clear"/>
+            <w:tcBorders>
+              <w:top w:val="single" w:sz="4" w:space="0" w:color="EEEEEE"/>
+              <w:left w:val="nil" w:sz="0" w:space="0" w:color="FFFFFF"/>
+              <w:bottom w:val="single" w:sz="4" w:space="0" w:color="EEEEEE"/>
+              <w:right w:val="nil" w:sz="0" w:space="0" w:color="FFFFFF"/>
+            </w:tcBorders>
+            <w:tcMar>
+              <w:top w:w="52" w:type="dxa"/>
+              <w:left w:w="72" w:type="dxa"/>
+              <w:bottom w:w="52" w:type="dxa"/>
+              <w:right w:w="72" w:type="dxa"/>
+            </w:tcMar>
+            <w:vAlign w:val="center"/>
+          </w:tcPr>
+          <w:p>
+            <w:pPr>
+              <w:spacing w:before="0" w:after="0" w:line="269" w:lineRule="auto"/>
+              <w:ind w:firstLine="0"/>
+              <w:jc w:val="left"/>
+            </w:pPr>
+            <w:r>
+              <w:rPr>
+                <w:rFonts w:ascii="Calibri" w:hAnsi="Calibri" w:eastAsia="微软雅黑" w:cs="Calibri"/>
+                <w:b w:val="0"/>
+                <w:i w:val="0"/>
+                <w:color w:val="1A1A1A"/>
+                <w:sz w:val="17"/>
+              </w:rPr>
+              <w:t>百威亚太中国区</w:t>
             </w:r>
           </w:p>
         </w:tc>
@@ -2427,7 +3190,7 @@
                 <w:color w:val="1A1A1A"/>
                 <w:sz w:val="17"/>
               </w:rPr>
-              <w:t>69.60</w:t>
+              <w:t>未披露绝对量</w:t>
             </w:r>
           </w:p>
         </w:tc>
@@ -2463,7 +3226,7 @@
                 <w:color w:val="1A1A1A"/>
                 <w:sz w:val="17"/>
               </w:rPr>
-              <w:t>+31.40%</w:t>
+              <w:t>−11.8%</w:t>
             </w:r>
           </w:p>
         </w:tc>
@@ -2499,7 +3262,7 @@
                 <w:color w:val="1A1A1A"/>
                 <w:sz w:val="17"/>
               </w:rPr>
-              <w:t>90</w:t>
+              <w:t>未披露绝对量</w:t>
             </w:r>
           </w:p>
         </w:tc>
@@ -2507,660 +3270,6 @@
           <w:tcPr>
             <w:tcW w:type="dxa" w:w="1569"/>
             <w:shd w:fill="FFFFFF" w:val="clear"/>
-            <w:tcBorders>
-              <w:top w:val="single" w:sz="4" w:space="0" w:color="EEEEEE"/>
-              <w:left w:val="nil" w:sz="0" w:space="0" w:color="FFFFFF"/>
-              <w:bottom w:val="single" w:sz="4" w:space="0" w:color="EEEEEE"/>
-              <w:right w:val="nil" w:sz="0" w:space="0" w:color="FFFFFF"/>
-            </w:tcBorders>
-            <w:tcMar>
-              <w:top w:w="52" w:type="dxa"/>
-              <w:left w:w="72" w:type="dxa"/>
-              <w:bottom w:w="52" w:type="dxa"/>
-              <w:right w:w="72" w:type="dxa"/>
-            </w:tcMar>
-            <w:vAlign w:val="center"/>
-          </w:tcPr>
-          <w:p>
-            <w:pPr>
-              <w:spacing w:before="0" w:after="0" w:line="269" w:lineRule="auto"/>
-              <w:ind w:firstLine="0"/>
-              <w:jc w:val="left"/>
-            </w:pPr>
-            <w:r>
-              <w:rPr>
-                <w:rFonts w:ascii="Calibri" w:hAnsi="Calibri" w:eastAsia="微软雅黑" w:cs="Calibri"/>
-                <w:b w:val="0"/>
-                <w:i w:val="0"/>
-                <w:color w:val="1A1A1A"/>
-                <w:sz w:val="17"/>
-              </w:rPr>
-              <w:t>+29.31%</w:t>
-            </w:r>
-          </w:p>
-        </w:tc>
-      </w:tr>
-      <w:tr>
-        <w:tc>
-          <w:tcPr>
-            <w:tcW w:type="dxa" w:w="1569"/>
-            <w:shd w:fill="F7F8FA" w:val="clear"/>
-            <w:tcBorders>
-              <w:top w:val="single" w:sz="4" w:space="0" w:color="EEEEEE"/>
-              <w:left w:val="nil" w:sz="0" w:space="0" w:color="FFFFFF"/>
-              <w:bottom w:val="single" w:sz="4" w:space="0" w:color="EEEEEE"/>
-              <w:right w:val="nil" w:sz="0" w:space="0" w:color="FFFFFF"/>
-            </w:tcBorders>
-            <w:tcMar>
-              <w:top w:w="52" w:type="dxa"/>
-              <w:left w:w="72" w:type="dxa"/>
-              <w:bottom w:w="52" w:type="dxa"/>
-              <w:right w:w="72" w:type="dxa"/>
-            </w:tcMar>
-            <w:vAlign w:val="center"/>
-          </w:tcPr>
-          <w:p>
-            <w:pPr>
-              <w:spacing w:before="0" w:after="0" w:line="269" w:lineRule="auto"/>
-              <w:ind w:firstLine="0"/>
-              <w:jc w:val="left"/>
-            </w:pPr>
-            <w:r>
-              <w:rPr>
-                <w:rFonts w:ascii="Calibri" w:hAnsi="Calibri" w:eastAsia="微软雅黑" w:cs="Calibri"/>
-                <w:b w:val="0"/>
-                <w:i w:val="0"/>
-                <w:color w:val="1A1A1A"/>
-                <w:sz w:val="17"/>
-              </w:rPr>
-              <w:t>重庆啤酒</w:t>
-            </w:r>
-          </w:p>
-        </w:tc>
-        <w:tc>
-          <w:tcPr>
-            <w:tcW w:type="dxa" w:w="1569"/>
-            <w:shd w:fill="F7F8FA" w:val="clear"/>
-            <w:tcBorders>
-              <w:top w:val="single" w:sz="4" w:space="0" w:color="EEEEEE"/>
-              <w:left w:val="nil" w:sz="0" w:space="0" w:color="FFFFFF"/>
-              <w:bottom w:val="single" w:sz="4" w:space="0" w:color="EEEEEE"/>
-              <w:right w:val="nil" w:sz="0" w:space="0" w:color="FFFFFF"/>
-            </w:tcBorders>
-            <w:tcMar>
-              <w:top w:w="52" w:type="dxa"/>
-              <w:left w:w="72" w:type="dxa"/>
-              <w:bottom w:w="52" w:type="dxa"/>
-              <w:right w:w="72" w:type="dxa"/>
-            </w:tcMar>
-            <w:vAlign w:val="center"/>
-          </w:tcPr>
-          <w:p>
-            <w:pPr>
-              <w:spacing w:before="0" w:after="0" w:line="269" w:lineRule="auto"/>
-              <w:ind w:firstLine="0"/>
-              <w:jc w:val="left"/>
-            </w:pPr>
-            <w:r>
-              <w:rPr>
-                <w:rFonts w:ascii="Calibri" w:hAnsi="Calibri" w:eastAsia="微软雅黑" w:cs="Calibri"/>
-                <w:b w:val="0"/>
-                <w:i w:val="0"/>
-                <w:color w:val="1A1A1A"/>
-                <w:sz w:val="17"/>
-              </w:rPr>
-              <w:t>约 300</w:t>
-            </w:r>
-          </w:p>
-        </w:tc>
-        <w:tc>
-          <w:tcPr>
-            <w:tcW w:type="dxa" w:w="1569"/>
-            <w:shd w:fill="F7F8FA" w:val="clear"/>
-            <w:tcBorders>
-              <w:top w:val="single" w:sz="4" w:space="0" w:color="EEEEEE"/>
-              <w:left w:val="nil" w:sz="0" w:space="0" w:color="FFFFFF"/>
-              <w:bottom w:val="single" w:sz="4" w:space="0" w:color="EEEEEE"/>
-              <w:right w:val="nil" w:sz="0" w:space="0" w:color="FFFFFF"/>
-            </w:tcBorders>
-            <w:tcMar>
-              <w:top w:w="52" w:type="dxa"/>
-              <w:left w:w="72" w:type="dxa"/>
-              <w:bottom w:w="52" w:type="dxa"/>
-              <w:right w:w="72" w:type="dxa"/>
-            </w:tcMar>
-            <w:vAlign w:val="center"/>
-          </w:tcPr>
-          <w:p>
-            <w:pPr>
-              <w:spacing w:before="0" w:after="0" w:line="269" w:lineRule="auto"/>
-              <w:ind w:firstLine="0"/>
-              <w:jc w:val="left"/>
-            </w:pPr>
-            <w:r>
-              <w:rPr>
-                <w:rFonts w:ascii="Calibri" w:hAnsi="Calibri" w:eastAsia="微软雅黑" w:cs="Calibri"/>
-                <w:b w:val="0"/>
-                <w:i w:val="0"/>
-                <w:color w:val="1A1A1A"/>
-                <w:sz w:val="17"/>
-              </w:rPr>
-              <w:t>297.49</w:t>
-            </w:r>
-          </w:p>
-        </w:tc>
-        <w:tc>
-          <w:tcPr>
-            <w:tcW w:type="dxa" w:w="1569"/>
-            <w:shd w:fill="F7F8FA" w:val="clear"/>
-            <w:tcBorders>
-              <w:top w:val="single" w:sz="4" w:space="0" w:color="EEEEEE"/>
-              <w:left w:val="nil" w:sz="0" w:space="0" w:color="FFFFFF"/>
-              <w:bottom w:val="single" w:sz="4" w:space="0" w:color="EEEEEE"/>
-              <w:right w:val="nil" w:sz="0" w:space="0" w:color="FFFFFF"/>
-            </w:tcBorders>
-            <w:tcMar>
-              <w:top w:w="52" w:type="dxa"/>
-              <w:left w:w="72" w:type="dxa"/>
-              <w:bottom w:w="52" w:type="dxa"/>
-              <w:right w:w="72" w:type="dxa"/>
-            </w:tcMar>
-            <w:vAlign w:val="center"/>
-          </w:tcPr>
-          <w:p>
-            <w:pPr>
-              <w:spacing w:before="0" w:after="0" w:line="269" w:lineRule="auto"/>
-              <w:ind w:firstLine="0"/>
-              <w:jc w:val="left"/>
-            </w:pPr>
-            <w:r>
-              <w:rPr>
-                <w:rFonts w:ascii="Calibri" w:hAnsi="Calibri" w:eastAsia="微软雅黑" w:cs="Calibri"/>
-                <w:b w:val="0"/>
-                <w:i w:val="0"/>
-                <w:color w:val="1A1A1A"/>
-                <w:sz w:val="17"/>
-              </w:rPr>
-              <w:t>−0.75%</w:t>
-            </w:r>
-          </w:p>
-        </w:tc>
-        <w:tc>
-          <w:tcPr>
-            <w:tcW w:type="dxa" w:w="1569"/>
-            <w:shd w:fill="F7F8FA" w:val="clear"/>
-            <w:tcBorders>
-              <w:top w:val="single" w:sz="4" w:space="0" w:color="EEEEEE"/>
-              <w:left w:val="nil" w:sz="0" w:space="0" w:color="FFFFFF"/>
-              <w:bottom w:val="single" w:sz="4" w:space="0" w:color="EEEEEE"/>
-              <w:right w:val="nil" w:sz="0" w:space="0" w:color="FFFFFF"/>
-            </w:tcBorders>
-            <w:tcMar>
-              <w:top w:w="52" w:type="dxa"/>
-              <w:left w:w="72" w:type="dxa"/>
-              <w:bottom w:w="52" w:type="dxa"/>
-              <w:right w:w="72" w:type="dxa"/>
-            </w:tcMar>
-            <w:vAlign w:val="center"/>
-          </w:tcPr>
-          <w:p>
-            <w:pPr>
-              <w:spacing w:before="0" w:after="0" w:line="269" w:lineRule="auto"/>
-              <w:ind w:firstLine="0"/>
-              <w:jc w:val="left"/>
-            </w:pPr>
-            <w:r>
-              <w:rPr>
-                <w:rFonts w:ascii="Calibri" w:hAnsi="Calibri" w:eastAsia="微软雅黑" w:cs="Calibri"/>
-                <w:b w:val="0"/>
-                <w:i w:val="0"/>
-                <w:color w:val="1A1A1A"/>
-                <w:sz w:val="17"/>
-              </w:rPr>
-              <w:t>299.52</w:t>
-            </w:r>
-          </w:p>
-        </w:tc>
-        <w:tc>
-          <w:tcPr>
-            <w:tcW w:type="dxa" w:w="1569"/>
-            <w:shd w:fill="F7F8FA" w:val="clear"/>
-            <w:tcBorders>
-              <w:top w:val="single" w:sz="4" w:space="0" w:color="EEEEEE"/>
-              <w:left w:val="nil" w:sz="0" w:space="0" w:color="FFFFFF"/>
-              <w:bottom w:val="single" w:sz="4" w:space="0" w:color="EEEEEE"/>
-              <w:right w:val="nil" w:sz="0" w:space="0" w:color="FFFFFF"/>
-            </w:tcBorders>
-            <w:tcMar>
-              <w:top w:w="52" w:type="dxa"/>
-              <w:left w:w="72" w:type="dxa"/>
-              <w:bottom w:w="52" w:type="dxa"/>
-              <w:right w:w="72" w:type="dxa"/>
-            </w:tcMar>
-            <w:vAlign w:val="center"/>
-          </w:tcPr>
-          <w:p>
-            <w:pPr>
-              <w:spacing w:before="0" w:after="0" w:line="269" w:lineRule="auto"/>
-              <w:ind w:firstLine="0"/>
-              <w:jc w:val="left"/>
-            </w:pPr>
-            <w:r>
-              <w:rPr>
-                <w:rFonts w:ascii="Calibri" w:hAnsi="Calibri" w:eastAsia="微软雅黑" w:cs="Calibri"/>
-                <w:b w:val="0"/>
-                <w:i w:val="0"/>
-                <w:color w:val="1A1A1A"/>
-                <w:sz w:val="17"/>
-              </w:rPr>
-              <w:t>+0.68%</w:t>
-            </w:r>
-          </w:p>
-        </w:tc>
-      </w:tr>
-      <w:tr>
-        <w:tc>
-          <w:tcPr>
-            <w:tcW w:type="dxa" w:w="1569"/>
-            <w:shd w:fill="FFFFFF" w:val="clear"/>
-            <w:tcBorders>
-              <w:top w:val="single" w:sz="4" w:space="0" w:color="EEEEEE"/>
-              <w:left w:val="nil" w:sz="0" w:space="0" w:color="FFFFFF"/>
-              <w:bottom w:val="single" w:sz="4" w:space="0" w:color="EEEEEE"/>
-              <w:right w:val="nil" w:sz="0" w:space="0" w:color="FFFFFF"/>
-            </w:tcBorders>
-            <w:tcMar>
-              <w:top w:w="52" w:type="dxa"/>
-              <w:left w:w="72" w:type="dxa"/>
-              <w:bottom w:w="52" w:type="dxa"/>
-              <w:right w:w="72" w:type="dxa"/>
-            </w:tcMar>
-            <w:vAlign w:val="center"/>
-          </w:tcPr>
-          <w:p>
-            <w:pPr>
-              <w:spacing w:before="0" w:after="0" w:line="269" w:lineRule="auto"/>
-              <w:ind w:firstLine="0"/>
-              <w:jc w:val="left"/>
-            </w:pPr>
-            <w:r>
-              <w:rPr>
-                <w:rFonts w:ascii="Calibri" w:hAnsi="Calibri" w:eastAsia="微软雅黑" w:cs="Calibri"/>
-                <w:b w:val="0"/>
-                <w:i w:val="0"/>
-                <w:color w:val="1A1A1A"/>
-                <w:sz w:val="17"/>
-              </w:rPr>
-              <w:t>珠江啤酒</w:t>
-            </w:r>
-          </w:p>
-        </w:tc>
-        <w:tc>
-          <w:tcPr>
-            <w:tcW w:type="dxa" w:w="1569"/>
-            <w:shd w:fill="FFFFFF" w:val="clear"/>
-            <w:tcBorders>
-              <w:top w:val="single" w:sz="4" w:space="0" w:color="EEEEEE"/>
-              <w:left w:val="nil" w:sz="0" w:space="0" w:color="FFFFFF"/>
-              <w:bottom w:val="single" w:sz="4" w:space="0" w:color="EEEEEE"/>
-              <w:right w:val="nil" w:sz="0" w:space="0" w:color="FFFFFF"/>
-            </w:tcBorders>
-            <w:tcMar>
-              <w:top w:w="52" w:type="dxa"/>
-              <w:left w:w="72" w:type="dxa"/>
-              <w:bottom w:w="52" w:type="dxa"/>
-              <w:right w:w="72" w:type="dxa"/>
-            </w:tcMar>
-            <w:vAlign w:val="center"/>
-          </w:tcPr>
-          <w:p>
-            <w:pPr>
-              <w:spacing w:before="0" w:after="0" w:line="269" w:lineRule="auto"/>
-              <w:ind w:firstLine="0"/>
-              <w:jc w:val="left"/>
-            </w:pPr>
-            <w:r>
-              <w:rPr>
-                <w:rFonts w:ascii="Calibri" w:hAnsi="Calibri" w:eastAsia="微软雅黑" w:cs="Calibri"/>
-                <w:b w:val="0"/>
-                <w:i w:val="0"/>
-                <w:color w:val="1A1A1A"/>
-                <w:sz w:val="17"/>
-              </w:rPr>
-              <w:t>140.28</w:t>
-            </w:r>
-          </w:p>
-        </w:tc>
-        <w:tc>
-          <w:tcPr>
-            <w:tcW w:type="dxa" w:w="1569"/>
-            <w:shd w:fill="FFFFFF" w:val="clear"/>
-            <w:tcBorders>
-              <w:top w:val="single" w:sz="4" w:space="0" w:color="EEEEEE"/>
-              <w:left w:val="nil" w:sz="0" w:space="0" w:color="FFFFFF"/>
-              <w:bottom w:val="single" w:sz="4" w:space="0" w:color="EEEEEE"/>
-              <w:right w:val="nil" w:sz="0" w:space="0" w:color="FFFFFF"/>
-            </w:tcBorders>
-            <w:tcMar>
-              <w:top w:w="52" w:type="dxa"/>
-              <w:left w:w="72" w:type="dxa"/>
-              <w:bottom w:w="52" w:type="dxa"/>
-              <w:right w:w="72" w:type="dxa"/>
-            </w:tcMar>
-            <w:vAlign w:val="center"/>
-          </w:tcPr>
-          <w:p>
-            <w:pPr>
-              <w:spacing w:before="0" w:after="0" w:line="269" w:lineRule="auto"/>
-              <w:ind w:firstLine="0"/>
-              <w:jc w:val="left"/>
-            </w:pPr>
-            <w:r>
-              <w:rPr>
-                <w:rFonts w:ascii="Calibri" w:hAnsi="Calibri" w:eastAsia="微软雅黑" w:cs="Calibri"/>
-                <w:b w:val="0"/>
-                <w:i w:val="0"/>
-                <w:color w:val="1A1A1A"/>
-                <w:sz w:val="17"/>
-              </w:rPr>
-              <w:t>143.96</w:t>
-            </w:r>
-          </w:p>
-        </w:tc>
-        <w:tc>
-          <w:tcPr>
-            <w:tcW w:type="dxa" w:w="1569"/>
-            <w:shd w:fill="FFFFFF" w:val="clear"/>
-            <w:tcBorders>
-              <w:top w:val="single" w:sz="4" w:space="0" w:color="EEEEEE"/>
-              <w:left w:val="nil" w:sz="0" w:space="0" w:color="FFFFFF"/>
-              <w:bottom w:val="single" w:sz="4" w:space="0" w:color="EEEEEE"/>
-              <w:right w:val="nil" w:sz="0" w:space="0" w:color="FFFFFF"/>
-            </w:tcBorders>
-            <w:tcMar>
-              <w:top w:w="52" w:type="dxa"/>
-              <w:left w:w="72" w:type="dxa"/>
-              <w:bottom w:w="52" w:type="dxa"/>
-              <w:right w:w="72" w:type="dxa"/>
-            </w:tcMar>
-            <w:vAlign w:val="center"/>
-          </w:tcPr>
-          <w:p>
-            <w:pPr>
-              <w:spacing w:before="0" w:after="0" w:line="269" w:lineRule="auto"/>
-              <w:ind w:firstLine="0"/>
-              <w:jc w:val="left"/>
-            </w:pPr>
-            <w:r>
-              <w:rPr>
-                <w:rFonts w:ascii="Calibri" w:hAnsi="Calibri" w:eastAsia="微软雅黑" w:cs="Calibri"/>
-                <w:b w:val="0"/>
-                <w:i w:val="0"/>
-                <w:color w:val="1A1A1A"/>
-                <w:sz w:val="17"/>
-              </w:rPr>
-              <w:t>+2.62%</w:t>
-            </w:r>
-          </w:p>
-        </w:tc>
-        <w:tc>
-          <w:tcPr>
-            <w:tcW w:type="dxa" w:w="1569"/>
-            <w:shd w:fill="FFFFFF" w:val="clear"/>
-            <w:tcBorders>
-              <w:top w:val="single" w:sz="4" w:space="0" w:color="EEEEEE"/>
-              <w:left w:val="nil" w:sz="0" w:space="0" w:color="FFFFFF"/>
-              <w:bottom w:val="single" w:sz="4" w:space="0" w:color="EEEEEE"/>
-              <w:right w:val="nil" w:sz="0" w:space="0" w:color="FFFFFF"/>
-            </w:tcBorders>
-            <w:tcMar>
-              <w:top w:w="52" w:type="dxa"/>
-              <w:left w:w="72" w:type="dxa"/>
-              <w:bottom w:w="52" w:type="dxa"/>
-              <w:right w:w="72" w:type="dxa"/>
-            </w:tcMar>
-            <w:vAlign w:val="center"/>
-          </w:tcPr>
-          <w:p>
-            <w:pPr>
-              <w:spacing w:before="0" w:after="0" w:line="269" w:lineRule="auto"/>
-              <w:ind w:firstLine="0"/>
-              <w:jc w:val="left"/>
-            </w:pPr>
-            <w:r>
-              <w:rPr>
-                <w:rFonts w:ascii="Calibri" w:hAnsi="Calibri" w:eastAsia="微软雅黑" w:cs="Calibri"/>
-                <w:b w:val="0"/>
-                <w:i w:val="0"/>
-                <w:color w:val="1A1A1A"/>
-                <w:sz w:val="17"/>
-              </w:rPr>
-              <w:t>146.24</w:t>
-            </w:r>
-          </w:p>
-        </w:tc>
-        <w:tc>
-          <w:tcPr>
-            <w:tcW w:type="dxa" w:w="1569"/>
-            <w:shd w:fill="FFFFFF" w:val="clear"/>
-            <w:tcBorders>
-              <w:top w:val="single" w:sz="4" w:space="0" w:color="EEEEEE"/>
-              <w:left w:val="nil" w:sz="0" w:space="0" w:color="FFFFFF"/>
-              <w:bottom w:val="single" w:sz="4" w:space="0" w:color="EEEEEE"/>
-              <w:right w:val="nil" w:sz="0" w:space="0" w:color="FFFFFF"/>
-            </w:tcBorders>
-            <w:tcMar>
-              <w:top w:w="52" w:type="dxa"/>
-              <w:left w:w="72" w:type="dxa"/>
-              <w:bottom w:w="52" w:type="dxa"/>
-              <w:right w:w="72" w:type="dxa"/>
-            </w:tcMar>
-            <w:vAlign w:val="center"/>
-          </w:tcPr>
-          <w:p>
-            <w:pPr>
-              <w:spacing w:before="0" w:after="0" w:line="269" w:lineRule="auto"/>
-              <w:ind w:firstLine="0"/>
-              <w:jc w:val="left"/>
-            </w:pPr>
-            <w:r>
-              <w:rPr>
-                <w:rFonts w:ascii="Calibri" w:hAnsi="Calibri" w:eastAsia="微软雅黑" w:cs="Calibri"/>
-                <w:b w:val="0"/>
-                <w:i w:val="0"/>
-                <w:color w:val="1A1A1A"/>
-                <w:sz w:val="17"/>
-              </w:rPr>
-              <w:t>+1.58%</w:t>
-            </w:r>
-          </w:p>
-        </w:tc>
-      </w:tr>
-      <w:tr>
-        <w:tc>
-          <w:tcPr>
-            <w:tcW w:type="dxa" w:w="1569"/>
-            <w:shd w:fill="F7F8FA" w:val="clear"/>
-            <w:tcBorders>
-              <w:top w:val="single" w:sz="4" w:space="0" w:color="EEEEEE"/>
-              <w:left w:val="nil" w:sz="0" w:space="0" w:color="FFFFFF"/>
-              <w:bottom w:val="single" w:sz="4" w:space="0" w:color="EEEEEE"/>
-              <w:right w:val="nil" w:sz="0" w:space="0" w:color="FFFFFF"/>
-            </w:tcBorders>
-            <w:tcMar>
-              <w:top w:w="52" w:type="dxa"/>
-              <w:left w:w="72" w:type="dxa"/>
-              <w:bottom w:w="52" w:type="dxa"/>
-              <w:right w:w="72" w:type="dxa"/>
-            </w:tcMar>
-            <w:vAlign w:val="center"/>
-          </w:tcPr>
-          <w:p>
-            <w:pPr>
-              <w:spacing w:before="0" w:after="0" w:line="269" w:lineRule="auto"/>
-              <w:ind w:firstLine="0"/>
-              <w:jc w:val="left"/>
-            </w:pPr>
-            <w:r>
-              <w:rPr>
-                <w:rFonts w:ascii="Calibri" w:hAnsi="Calibri" w:eastAsia="微软雅黑" w:cs="Calibri"/>
-                <w:b w:val="0"/>
-                <w:i w:val="0"/>
-                <w:color w:val="1A1A1A"/>
-                <w:sz w:val="17"/>
-              </w:rPr>
-              <w:t>百威亚太中国区</w:t>
-            </w:r>
-          </w:p>
-        </w:tc>
-        <w:tc>
-          <w:tcPr>
-            <w:tcW w:type="dxa" w:w="1569"/>
-            <w:shd w:fill="F7F8FA" w:val="clear"/>
-            <w:tcBorders>
-              <w:top w:val="single" w:sz="4" w:space="0" w:color="EEEEEE"/>
-              <w:left w:val="nil" w:sz="0" w:space="0" w:color="FFFFFF"/>
-              <w:bottom w:val="single" w:sz="4" w:space="0" w:color="EEEEEE"/>
-              <w:right w:val="nil" w:sz="0" w:space="0" w:color="FFFFFF"/>
-            </w:tcBorders>
-            <w:tcMar>
-              <w:top w:w="52" w:type="dxa"/>
-              <w:left w:w="72" w:type="dxa"/>
-              <w:bottom w:w="52" w:type="dxa"/>
-              <w:right w:w="72" w:type="dxa"/>
-            </w:tcMar>
-            <w:vAlign w:val="center"/>
-          </w:tcPr>
-          <w:p>
-            <w:pPr>
-              <w:spacing w:before="0" w:after="0" w:line="269" w:lineRule="auto"/>
-              <w:ind w:firstLine="0"/>
-              <w:jc w:val="left"/>
-            </w:pPr>
-            <w:r>
-              <w:rPr>
-                <w:rFonts w:ascii="Calibri" w:hAnsi="Calibri" w:eastAsia="微软雅黑" w:cs="Calibri"/>
-                <w:b w:val="0"/>
-                <w:i w:val="0"/>
-                <w:color w:val="1A1A1A"/>
-                <w:sz w:val="17"/>
-              </w:rPr>
-              <w:t>—</w:t>
-            </w:r>
-          </w:p>
-        </w:tc>
-        <w:tc>
-          <w:tcPr>
-            <w:tcW w:type="dxa" w:w="1569"/>
-            <w:shd w:fill="F7F8FA" w:val="clear"/>
-            <w:tcBorders>
-              <w:top w:val="single" w:sz="4" w:space="0" w:color="EEEEEE"/>
-              <w:left w:val="nil" w:sz="0" w:space="0" w:color="FFFFFF"/>
-              <w:bottom w:val="single" w:sz="4" w:space="0" w:color="EEEEEE"/>
-              <w:right w:val="nil" w:sz="0" w:space="0" w:color="FFFFFF"/>
-            </w:tcBorders>
-            <w:tcMar>
-              <w:top w:w="52" w:type="dxa"/>
-              <w:left w:w="72" w:type="dxa"/>
-              <w:bottom w:w="52" w:type="dxa"/>
-              <w:right w:w="72" w:type="dxa"/>
-            </w:tcMar>
-            <w:vAlign w:val="center"/>
-          </w:tcPr>
-          <w:p>
-            <w:pPr>
-              <w:spacing w:before="0" w:after="0" w:line="269" w:lineRule="auto"/>
-              <w:ind w:firstLine="0"/>
-              <w:jc w:val="left"/>
-            </w:pPr>
-            <w:r>
-              <w:rPr>
-                <w:rFonts w:ascii="Calibri" w:hAnsi="Calibri" w:eastAsia="微软雅黑" w:cs="Calibri"/>
-                <w:b w:val="0"/>
-                <w:i w:val="0"/>
-                <w:color w:val="1A1A1A"/>
-                <w:sz w:val="17"/>
-              </w:rPr>
-              <w:t>未披露绝对量</w:t>
-            </w:r>
-          </w:p>
-        </w:tc>
-        <w:tc>
-          <w:tcPr>
-            <w:tcW w:type="dxa" w:w="1569"/>
-            <w:shd w:fill="F7F8FA" w:val="clear"/>
-            <w:tcBorders>
-              <w:top w:val="single" w:sz="4" w:space="0" w:color="EEEEEE"/>
-              <w:left w:val="nil" w:sz="0" w:space="0" w:color="FFFFFF"/>
-              <w:bottom w:val="single" w:sz="4" w:space="0" w:color="EEEEEE"/>
-              <w:right w:val="nil" w:sz="0" w:space="0" w:color="FFFFFF"/>
-            </w:tcBorders>
-            <w:tcMar>
-              <w:top w:w="52" w:type="dxa"/>
-              <w:left w:w="72" w:type="dxa"/>
-              <w:bottom w:w="52" w:type="dxa"/>
-              <w:right w:w="72" w:type="dxa"/>
-            </w:tcMar>
-            <w:vAlign w:val="center"/>
-          </w:tcPr>
-          <w:p>
-            <w:pPr>
-              <w:spacing w:before="0" w:after="0" w:line="269" w:lineRule="auto"/>
-              <w:ind w:firstLine="0"/>
-              <w:jc w:val="left"/>
-            </w:pPr>
-            <w:r>
-              <w:rPr>
-                <w:rFonts w:ascii="Calibri" w:hAnsi="Calibri" w:eastAsia="微软雅黑" w:cs="Calibri"/>
-                <w:b w:val="0"/>
-                <w:i w:val="0"/>
-                <w:color w:val="1A1A1A"/>
-                <w:sz w:val="17"/>
-              </w:rPr>
-              <w:t>−11.8%</w:t>
-            </w:r>
-          </w:p>
-        </w:tc>
-        <w:tc>
-          <w:tcPr>
-            <w:tcW w:type="dxa" w:w="1569"/>
-            <w:shd w:fill="F7F8FA" w:val="clear"/>
-            <w:tcBorders>
-              <w:top w:val="single" w:sz="4" w:space="0" w:color="EEEEEE"/>
-              <w:left w:val="nil" w:sz="0" w:space="0" w:color="FFFFFF"/>
-              <w:bottom w:val="single" w:sz="4" w:space="0" w:color="EEEEEE"/>
-              <w:right w:val="nil" w:sz="0" w:space="0" w:color="FFFFFF"/>
-            </w:tcBorders>
-            <w:tcMar>
-              <w:top w:w="52" w:type="dxa"/>
-              <w:left w:w="72" w:type="dxa"/>
-              <w:bottom w:w="52" w:type="dxa"/>
-              <w:right w:w="72" w:type="dxa"/>
-            </w:tcMar>
-            <w:vAlign w:val="center"/>
-          </w:tcPr>
-          <w:p>
-            <w:pPr>
-              <w:spacing w:before="0" w:after="0" w:line="269" w:lineRule="auto"/>
-              <w:ind w:firstLine="0"/>
-              <w:jc w:val="left"/>
-            </w:pPr>
-            <w:r>
-              <w:rPr>
-                <w:rFonts w:ascii="Calibri" w:hAnsi="Calibri" w:eastAsia="微软雅黑" w:cs="Calibri"/>
-                <w:b w:val="0"/>
-                <w:i w:val="0"/>
-                <w:color w:val="1A1A1A"/>
-                <w:sz w:val="17"/>
-              </w:rPr>
-              <w:t>未披露绝对量</w:t>
-            </w:r>
-          </w:p>
-        </w:tc>
-        <w:tc>
-          <w:tcPr>
-            <w:tcW w:type="dxa" w:w="1569"/>
-            <w:shd w:fill="F7F8FA" w:val="clear"/>
             <w:tcBorders>
               <w:top w:val="single" w:sz="4" w:space="0" w:color="EEEEEE"/>
               <w:left w:val="nil" w:sz="0" w:space="0" w:color="FFFFFF"/>
@@ -3208,7 +3317,58 @@
           <w:color w:val="767676"/>
           <w:sz w:val="17"/>
         </w:rPr>
-        <w:t>表 1  销量（万千升）。*2025 年统计局同比按当年公告，不与 2024 年当时公布基数连乘。企业销量 ÷ 规上产量不是官方市占。</w:t>
+        <w:t>表 1  论点 A 的数。企业销量÷产量不是官方市占。其他品牌≠崂山单品牌。</w:t>
+      </w:r>
+    </w:p>
+    <w:p>
+      <w:pPr>
+        <w:spacing w:before="0" w:after="140" w:line="307" w:lineRule="auto"/>
+        <w:ind w:firstLine="0"/>
+        <w:jc w:val="both"/>
+      </w:pPr>
+      <w:r>
+        <w:rPr>
+          <w:rFonts w:ascii="Calibri" w:hAnsi="Calibri" w:eastAsia="微软雅黑" w:cs="Calibri"/>
+          <w:b w:val="0"/>
+          <w:i w:val="0"/>
+          <w:color w:val="1A1A1A"/>
+          <w:sz w:val="22"/>
+        </w:rPr>
+        <w:t>论点 A 的 So what。读竞争不要从五强排行读，从「哪一瓶在长、哪一瓶在掉」读。崂山现在掉的是第二品牌这条线。全国化若对不准正在长的那一层——有差异、仍在大众预算里的单品——就是用铺货去对抗结构。</w:t>
+      </w:r>
+    </w:p>
+    <w:p>
+      <w:pPr>
+        <w:spacing w:before="0" w:after="140" w:line="307" w:lineRule="auto"/>
+        <w:ind w:firstLine="0"/>
+        <w:jc w:val="both"/>
+      </w:pPr>
+      <w:r>
+        <w:rPr>
+          <w:rFonts w:ascii="Calibri" w:hAnsi="Calibri" w:eastAsia="微软雅黑" w:cs="Calibri"/>
+          <w:b w:val="0"/>
+          <w:i w:val="0"/>
+          <w:color w:val="1A1A1A"/>
+          <w:sz w:val="22"/>
+        </w:rPr>
+        <w:t>A 同时排除三种常见写法。第一种，用青啤集团 2025 年 +1.5% 证明崂山全国化已经开始见效——那是主品牌回量。第二种，用华润、青啤的量级差证明崂山没有资格做第二品牌——公开战略已经写过资格，缺的是桌上的被点理由。第三种，用「啤酒消费升级」一笔带过对手——升级发生在 U8、老雪、中高端以上，并不自动滴到 6 元以下的旧崂山。</w:t>
+      </w:r>
+    </w:p>
+    <w:p>
+      <w:pPr>
+        <w:spacing w:before="0" w:after="140" w:line="307" w:lineRule="auto"/>
+        <w:ind w:firstLine="0"/>
+        <w:jc w:val="both"/>
+      </w:pPr>
+      <w:r>
+        <w:rPr>
+          <w:rFonts w:ascii="Calibri" w:hAnsi="Calibri" w:eastAsia="微软雅黑" w:cs="Calibri"/>
+          <w:b w:val="0"/>
+          <w:i w:val="0"/>
+          <w:color w:val="1A1A1A"/>
+          <w:sz w:val="22"/>
+        </w:rPr>
+        <w:t>如果内部数证明崂山单品牌 2025 年已经转正，而「其他品牌」的下降来自山水、汉斯等，A3 的止衰叙事要改成「巩固并外溢」。在这个数到来之前，公开账只允许按更保守的那条线决策：当第二品牌整体在缩来配置费用。保守在这里不是态度，是避免把主品牌的回量当成崂山的许可证。</w:t>
       </w:r>
     </w:p>
     <w:p>
@@ -3224,7 +3384,7 @@
           <w:color w:val="1428A0"/>
           <w:sz w:val="30"/>
         </w:rPr>
-        <w:t>03  对手名单</w:t>
+        <w:t>03  论点 B　对手必须分层，否则名单是错的</w:t>
       </w:r>
     </w:p>
     <w:p>
@@ -3248,7 +3408,7 @@
           <w:color w:val="1A1A1A"/>
           <w:sz w:val="24"/>
         </w:rPr>
-        <w:t>3.1  先分层，再点名</w:t>
+        <w:t>B1  先分层，再点名</w:t>
       </w:r>
     </w:p>
     <w:p>
@@ -3265,7 +3425,7 @@
           <w:color w:val="1A1A1A"/>
           <w:sz w:val="22"/>
         </w:rPr>
-        <w:t>YJ 的 H6 把真实竞品写成勇闯天涯、哈尔滨小麦王、燕京清爽。飞书写的是与雪花、燕京同价位差异化。两份材料对得上，缺的是层。没有层，勇闯和 U8 会被写成同一个对手，青岛经典也会被误列进来。</w:t>
+        <w:t>YJ 的 H6 把真实竞品写成勇闯天涯、哈尔滨小麦王、燕京清爽。飞书写与雪花、燕京同价位差异化。两份材料对得上，缺的是层。没有层，勇闯和 U8 会被写成同一个敌人，青岛经典也会被列进来。后者直接违反飞书：避开青啤腹地。</w:t>
       </w:r>
     </w:p>
     <w:p>
@@ -3282,7 +3442,7 @@
           <w:color w:val="1A1A1A"/>
           <w:sz w:val="22"/>
         </w:rPr>
-        <w:t>塔基大约在 6 元以下：勇闯、燕京清爽、地方经济型、哈啤入门款。这是崂山的历史基本盘，费用最烈，盘在缩。大众升级大约在 6—8 元：老雪往下走、U8、哈尔滨小麦王。这是独立品牌还要不要得住的位置，全麦必须在这里被点。经典、纯生及中高端以上不进入：青岛主品牌、喜力、百威核心。飞书把这条写成红线，做成小青岛即失败。</w:t>
+        <w:t>课题写 6 元以下，分工材料写 8 元以下，H4 会上仍空着。工作口径先用两层。塔基：约 6 元以下，勇闯、燕京清爽、地方经济型、哈啤入门款。大众升级：约 6—8 元，老雪向下、U8、哈尔滨小麦王。不进入：经典、纯生及中高端以上，青岛主品牌、喜力、百威核心。价签可以等核价改，分层逻辑不改。</w:t>
       </w:r>
     </w:p>
     <w:p>
@@ -3299,241 +3459,7 @@
           <w:color w:val="1A1A1A"/>
           <w:sz w:val="22"/>
         </w:rPr>
-        <w:t>H4 没拍板，表 2 的价位只是工作口径，不是官方零售价。终端核价回来以后，可以改价签，不要改分层逻辑。</w:t>
-      </w:r>
-    </w:p>
-    <w:p>
-      <w:pPr>
-        <w:spacing w:before="220" w:after="100"/>
-        <w:ind w:firstLine="0"/>
-      </w:pPr>
-      <w:r>
-        <w:rPr>
-          <w:rFonts w:ascii="Calibri" w:hAnsi="Calibri" w:eastAsia="微软雅黑" w:cs="Calibri"/>
-          <w:b/>
-          <w:i w:val="0"/>
-          <w:color w:val="1A1A1A"/>
-          <w:sz w:val="24"/>
-        </w:rPr>
-        <w:t>3.2  雪花：出省以后店主最省事的替换</w:t>
-      </w:r>
-    </w:p>
-    <w:p>
-      <w:pPr>
-        <w:spacing w:before="0" w:after="140" w:line="307" w:lineRule="auto"/>
-        <w:ind w:firstLine="0"/>
-        <w:jc w:val="both"/>
-      </w:pPr>
-      <w:r>
-        <w:rPr>
-          <w:rFonts w:ascii="Calibri" w:hAnsi="Calibri" w:eastAsia="微软雅黑" w:cs="Calibri"/>
-          <w:b w:val="0"/>
-          <w:i w:val="0"/>
-          <w:color w:val="1A1A1A"/>
-          <w:sz w:val="22"/>
-        </w:rPr>
-        <w:t>华润是销量第一，也是全国铺货最完整的大众机器。2024 年公司说要守住经济型、主力市场和大单品。塔基它不会让出来给崂山「更便宜一点」的打法。同年中档及以上销量占比首次全年过半；2025 年次高档及以上接近总销量 25%，喜力仍有近两成增长，老雪 +60%。雪花在用勇闯守桌，用老雪和喜力把货架从下往上填满。</w:t>
-      </w:r>
-    </w:p>
-    <w:p>
-      <w:pPr>
-        <w:spacing w:before="0" w:after="140" w:line="307" w:lineRule="auto"/>
-        <w:ind w:firstLine="0"/>
-        <w:jc w:val="both"/>
-      </w:pPr>
-      <w:r>
-        <w:rPr>
-          <w:rFonts w:ascii="Calibri" w:hAnsi="Calibri" w:eastAsia="微软雅黑" w:cs="Calibri"/>
-          <w:b w:val="0"/>
-          <w:i w:val="0"/>
-          <w:color w:val="1A1A1A"/>
-          <w:sz w:val="22"/>
-        </w:rPr>
-        <w:t>侯孝海公开提过，山东因为勇闯涨价和竞争烈度增加，增速放缓。这句话比任何份额访谈都有用：雪花已经把山东当成必须投入的第二主场，不是远方市场。行业访谈把青啤在鲁份额放到 70%—80%、华润约 20%；更早的渠道材料写过，雪花用清爽、勇闯和部分罐装切的就是 6 元及以下，青啤回击时用过精品崂山和经典。数字是访谈口径，机制是实的——勇闯在根据地打过同价位，而且打过一轮。</w:t>
-      </w:r>
-    </w:p>
-    <w:p>
-      <w:pPr>
-        <w:spacing w:before="0" w:after="140" w:line="307" w:lineRule="auto"/>
-        <w:ind w:firstLine="0"/>
-        <w:jc w:val="both"/>
-      </w:pPr>
-      <w:r>
-        <w:rPr>
-          <w:rFonts w:ascii="Calibri" w:hAnsi="Calibri" w:eastAsia="微软雅黑" w:cs="Calibri"/>
-          <w:b w:val="0"/>
-          <w:i w:val="0"/>
-          <w:color w:val="1A1A1A"/>
-          <w:sz w:val="22"/>
-        </w:rPr>
-        <w:t>对崂山：雪花第一。样板如果选在雪花费用密度最高的省，开店成本会系统性高于北方根据地。6 元以下和勇闯对砸，胜率最低；6—8 元若没有可感知差异，店主仍会回到雪花。</w:t>
-      </w:r>
-    </w:p>
-    <w:p>
-      <w:pPr>
-        <w:spacing w:before="220" w:after="100"/>
-        <w:ind w:firstLine="0"/>
-      </w:pPr>
-      <w:r>
-        <w:rPr>
-          <w:rFonts w:ascii="Calibri" w:hAnsi="Calibri" w:eastAsia="微软雅黑" w:cs="Calibri"/>
-          <w:b/>
-          <w:i w:val="0"/>
-          <w:color w:val="1A1A1A"/>
-          <w:sz w:val="24"/>
-        </w:rPr>
-        <w:t>3.3  燕京：清爽在下面，U8 在上面</w:t>
-      </w:r>
-    </w:p>
-    <w:p>
-      <w:pPr>
-        <w:spacing w:before="0" w:after="140" w:line="307" w:lineRule="auto"/>
-        <w:ind w:firstLine="0"/>
-        <w:jc w:val="both"/>
-      </w:pPr>
-      <w:r>
-        <w:rPr>
-          <w:rFonts w:ascii="Calibri" w:hAnsi="Calibri" w:eastAsia="微软雅黑" w:cs="Calibri"/>
-          <w:b w:val="0"/>
-          <w:i w:val="0"/>
-          <w:color w:val="1A1A1A"/>
-          <w:sz w:val="22"/>
-        </w:rPr>
-        <w:t>燕京 2023 年 394.24 万千升，2024 年 400.44 万千升（+1.57%），2025 年 405.30 万千升（+1.21%），缩量年里连续正增长。U8 2024 年 69.60 万千升（+31.40%），2025 年 90 万千升（+29.31%）。公司收入仍有 53.40% 在华北（2024 年 78.30 亿元，+5.39%），华东只占 9.12%，华南 26.23%。燕京没有先变成均匀的全国公司，是用一款单品从华北往外溢。</w:t>
-      </w:r>
-    </w:p>
-    <w:p>
-      <w:pPr>
-        <w:spacing w:before="0" w:after="140" w:line="307" w:lineRule="auto"/>
-        <w:ind w:firstLine="0"/>
-        <w:jc w:val="both"/>
-      </w:pPr>
-      <w:r>
-        <w:rPr>
-          <w:rFonts w:ascii="Calibri" w:hAnsi="Calibri" w:eastAsia="微软雅黑" w:cs="Calibri"/>
-          <w:b w:val="0"/>
-          <w:i w:val="0"/>
-          <w:color w:val="1A1A1A"/>
-          <w:sz w:val="22"/>
-        </w:rPr>
-        <w:t>U8 成交有 5—6 元和 8—10 元两说，本稿并存，不合成一个价。结构比标价重要：燕京清爽继续占塔基，U8 在大众升级带截流。河北是 U8 除北京、内蒙外的优势区，也是飞书点名的崂山核心市场。两条线在河北会撞上。</w:t>
-      </w:r>
-    </w:p>
-    <w:p>
-      <w:pPr>
-        <w:spacing w:before="0" w:after="140" w:line="307" w:lineRule="auto"/>
-        <w:ind w:firstLine="0"/>
-        <w:jc w:val="both"/>
-      </w:pPr>
-      <w:r>
-        <w:rPr>
-          <w:rFonts w:ascii="Calibri" w:hAnsi="Calibri" w:eastAsia="微软雅黑" w:cs="Calibri"/>
-          <w:b w:val="0"/>
-          <w:i w:val="0"/>
-          <w:color w:val="1A1A1A"/>
-          <w:sz w:val="22"/>
-        </w:rPr>
-        <w:t>2024 年燕京华东收入 +9.82%，华北 +5.39%，华南几乎持平（+0.28%），西北 −12.52%。全国化不是所有方向都赚钱。对崂山：燕京第二。鲁冀不能只防勇闯，还要防 U8 把「能喝出一点不一样」的预算先拿走。华南不是燕京最锋利的刃，却是珠江的家门口，不能因为燕京弱就判断南下容易。</w:t>
-      </w:r>
-    </w:p>
-    <w:p>
-      <w:pPr>
-        <w:spacing w:before="220" w:after="100"/>
-        <w:ind w:firstLine="0"/>
-      </w:pPr>
-      <w:r>
-        <w:rPr>
-          <w:rFonts w:ascii="Calibri" w:hAnsi="Calibri" w:eastAsia="微软雅黑" w:cs="Calibri"/>
-          <w:b/>
-          <w:i w:val="0"/>
-          <w:color w:val="1A1A1A"/>
-          <w:sz w:val="24"/>
-        </w:rPr>
-        <w:t>3.4  哈尔滨小麦王：全麦叙事最近的干扰</w:t>
-      </w:r>
-    </w:p>
-    <w:p>
-      <w:pPr>
-        <w:spacing w:before="0" w:after="140" w:line="307" w:lineRule="auto"/>
-        <w:ind w:firstLine="0"/>
-        <w:jc w:val="both"/>
-      </w:pPr>
-      <w:r>
-        <w:rPr>
-          <w:rFonts w:ascii="Calibri" w:hAnsi="Calibri" w:eastAsia="微软雅黑" w:cs="Calibri"/>
-          <w:b w:val="0"/>
-          <w:i w:val="0"/>
-          <w:color w:val="1A1A1A"/>
-          <w:sz w:val="22"/>
-        </w:rPr>
-        <w:t>哈啤是百威在中国的大众 / 中档抓手。YJ 把小麦王列进 H6，和全麦升级最近。媒体把部分哈啤 SKU 放在 8—10 元，和崂山历史 6 元以下并不完全重叠。终端核价没回来之前，小麦王先当干扰项：它会把「全麦 / 小麦 / 口感」讲成口味游戏。升级如果只停在原料词，桌上会被小麦王稀释，品牌还是叫不出名的大众瓶。</w:t>
-      </w:r>
-    </w:p>
-    <w:p>
-      <w:pPr>
-        <w:spacing w:before="0" w:after="140" w:line="307" w:lineRule="auto"/>
-        <w:ind w:firstLine="0"/>
-        <w:jc w:val="both"/>
-      </w:pPr>
-      <w:r>
-        <w:rPr>
-          <w:rFonts w:ascii="Calibri" w:hAnsi="Calibri" w:eastAsia="微软雅黑" w:cs="Calibri"/>
-          <w:b w:val="0"/>
-          <w:i w:val="0"/>
-          <w:color w:val="1A1A1A"/>
-          <w:sz w:val="22"/>
-        </w:rPr>
-        <w:t>百威中国区 2024 年销量 −11.8%、收入 −13.0%、每百升收入 −1.4%，份额 −149 个基点；2025 年销量再 −8.6%。公司写的原因是行业放缓、更侧重的即饮渠道人流下降，四季度主动去库存约占 2024 年降幅的三分之一。飞书把崂山场景钉在火锅、烧烤、小龙虾。现饮是原点，也是这两年掉得最快的一层。对手如果只在餐饮桌上比，全国化会做成复制一个正在变难的场景。</w:t>
-      </w:r>
-    </w:p>
-    <w:p>
-      <w:pPr>
-        <w:spacing w:before="220" w:after="100"/>
-        <w:ind w:firstLine="0"/>
-      </w:pPr>
-      <w:r>
-        <w:rPr>
-          <w:rFonts w:ascii="Calibri" w:hAnsi="Calibri" w:eastAsia="微软雅黑" w:cs="Calibri"/>
-          <w:b/>
-          <w:i w:val="0"/>
-          <w:color w:val="1A1A1A"/>
-          <w:sz w:val="24"/>
-        </w:rPr>
-        <w:t>3.5  珠江和嘉士伯：南边墙上的名字，不是北方桌上的对手</w:t>
-      </w:r>
-    </w:p>
-    <w:p>
-      <w:pPr>
-        <w:spacing w:before="0" w:after="140" w:line="307" w:lineRule="auto"/>
-        <w:ind w:firstLine="0"/>
-        <w:jc w:val="both"/>
-      </w:pPr>
-      <w:r>
-        <w:rPr>
-          <w:rFonts w:ascii="Calibri" w:hAnsi="Calibri" w:eastAsia="微软雅黑" w:cs="Calibri"/>
-          <w:b w:val="0"/>
-          <w:i w:val="0"/>
-          <w:color w:val="1A1A1A"/>
-          <w:sz w:val="22"/>
-        </w:rPr>
-        <w:t>珠江 2024 年 143.96 万千升（+2.62%），2025 年 146.24 万千升（+1.58%），2025 年华南收入占 95.66%。这是区域墙，不是全国假想敌。重庆啤酒 2024 年 297.49 万千升，2025 年 299.52 万千升，高档已近半，代表嘉士伯在西部和部分南部的组合。两家都不该写进鲁冀的对手名单，但南下候选城里必须点名。广东 2024 年规上产量 474.72 万千升，已超过山东 463.4 万千升。产量第一不自动等于崂山的需求机会。飞书写「填补南方中低端」，公开格局显示南方中低端并不空。</w:t>
-      </w:r>
-    </w:p>
-    <w:p>
-      <w:pPr>
-        <w:spacing w:before="0" w:after="140" w:line="307" w:lineRule="auto"/>
-        <w:ind w:firstLine="0"/>
-        <w:jc w:val="both"/>
-      </w:pPr>
-      <w:r>
-        <w:rPr>
-          <w:rFonts w:ascii="Calibri" w:hAnsi="Calibri" w:eastAsia="微软雅黑" w:cs="Calibri"/>
-          <w:b w:val="0"/>
-          <w:i w:val="0"/>
-          <w:color w:val="1A1A1A"/>
-          <w:sz w:val="22"/>
-        </w:rPr>
-        <w:t>地方品牌是家里的第三对手。河北 2024 年啤酒产量 −3.98%，规上营收 67.51 亿元；华润雪花河北、河北燕京、青啤石家庄、蓝贝四家合计占全省规上啤酒营收 50.98%、利润 47.1%。河北不是自留地。山东的地方鲜啤还在，但重资产门店外扩的路径本组不展开，那是案例组的失败样本。</w:t>
+        <w:t>这意味着：6 元以下是守盘，费用最烈，盘在缩，和勇闯对砸胜率最低。6—8 元是独立品牌还站不站得住的位置，全麦必须在这里被点。经典桌不进——做成小青岛，销总现场就可以判失败，不必等全国化结果。</w:t>
       </w:r>
     </w:p>
     <w:tbl>
@@ -3544,15 +3470,16 @@
         <w:tblW w:w="5000" w:type="pct"/>
       </w:tblPr>
       <w:tblGrid>
-        <w:gridCol w:w="2353"/>
-        <w:gridCol w:w="2353"/>
-        <w:gridCol w:w="2353"/>
-        <w:gridCol w:w="2353"/>
+        <w:gridCol w:w="1882"/>
+        <w:gridCol w:w="1882"/>
+        <w:gridCol w:w="1882"/>
+        <w:gridCol w:w="1882"/>
+        <w:gridCol w:w="1882"/>
       </w:tblGrid>
       <w:tr>
         <w:tc>
           <w:tcPr>
-            <w:tcW w:type="dxa" w:w="2353"/>
+            <w:tcW w:type="dxa" w:w="1882"/>
             <w:shd w:fill="1428A0" w:val="clear"/>
             <w:tcBorders>
               <w:top w:val="single" w:sz="4" w:space="0" w:color="1428A0"/>
@@ -3588,7 +3515,7 @@
         </w:tc>
         <w:tc>
           <w:tcPr>
-            <w:tcW w:type="dxa" w:w="2353"/>
+            <w:tcW w:type="dxa" w:w="1882"/>
             <w:shd w:fill="1428A0" w:val="clear"/>
             <w:tcBorders>
               <w:top w:val="single" w:sz="4" w:space="0" w:color="1428A0"/>
@@ -3618,13 +3545,13 @@
                 <w:color w:val="FFFFFF"/>
                 <w:sz w:val="17"/>
               </w:rPr>
-              <w:t>价位（工作口径）</w:t>
+              <w:t>工作价位</w:t>
             </w:r>
           </w:p>
         </w:tc>
         <w:tc>
           <w:tcPr>
-            <w:tcW w:type="dxa" w:w="2353"/>
+            <w:tcW w:type="dxa" w:w="1882"/>
             <w:shd w:fill="1428A0" w:val="clear"/>
             <w:tcBorders>
               <w:top w:val="single" w:sz="4" w:space="0" w:color="1428A0"/>
@@ -3654,13 +3581,13 @@
                 <w:color w:val="FFFFFF"/>
                 <w:sz w:val="17"/>
               </w:rPr>
-              <w:t>对位</w:t>
+              <w:t>对位单品</w:t>
             </w:r>
           </w:p>
         </w:tc>
         <w:tc>
           <w:tcPr>
-            <w:tcW w:type="dxa" w:w="2353"/>
+            <w:tcW w:type="dxa" w:w="1882"/>
             <w:shd w:fill="1428A0" w:val="clear"/>
             <w:tcBorders>
               <w:top w:val="single" w:sz="4" w:space="0" w:color="1428A0"/>
@@ -3690,7 +3617,43 @@
                 <w:color w:val="FFFFFF"/>
                 <w:sz w:val="17"/>
               </w:rPr>
-              <w:t>崂山怎么用</w:t>
+              <w:t>崂山用途</w:t>
+            </w:r>
+          </w:p>
+        </w:tc>
+        <w:tc>
+          <w:tcPr>
+            <w:tcW w:type="dxa" w:w="1882"/>
+            <w:shd w:fill="1428A0" w:val="clear"/>
+            <w:tcBorders>
+              <w:top w:val="single" w:sz="4" w:space="0" w:color="1428A0"/>
+              <w:left w:val="nil" w:sz="0" w:space="0" w:color="FFFFFF"/>
+              <w:bottom w:val="single" w:sz="4" w:space="0" w:color="1428A0"/>
+              <w:right w:val="nil" w:sz="0" w:space="0" w:color="FFFFFF"/>
+            </w:tcBorders>
+            <w:tcMar>
+              <w:top w:w="52" w:type="dxa"/>
+              <w:left w:w="72" w:type="dxa"/>
+              <w:bottom w:w="52" w:type="dxa"/>
+              <w:right w:w="72" w:type="dxa"/>
+            </w:tcMar>
+            <w:vAlign w:val="center"/>
+          </w:tcPr>
+          <w:p>
+            <w:pPr>
+              <w:spacing w:before="0" w:after="0" w:line="269" w:lineRule="auto"/>
+              <w:ind w:firstLine="0"/>
+              <w:jc w:val="center"/>
+            </w:pPr>
+            <w:r>
+              <w:rPr>
+                <w:rFonts w:ascii="Calibri" w:hAnsi="Calibri" w:eastAsia="微软雅黑" w:cs="Calibri"/>
+                <w:b/>
+                <w:i w:val="0"/>
+                <w:color w:val="FFFFFF"/>
+                <w:sz w:val="17"/>
+              </w:rPr>
+              <w:t>不成立时</w:t>
             </w:r>
           </w:p>
         </w:tc>
@@ -3698,7 +3661,7 @@
       <w:tr>
         <w:tc>
           <w:tcPr>
-            <w:tcW w:type="dxa" w:w="2353"/>
+            <w:tcW w:type="dxa" w:w="1882"/>
             <w:shd w:fill="FFFFFF" w:val="clear"/>
             <w:tcBorders>
               <w:top w:val="single" w:sz="4" w:space="0" w:color="EEEEEE"/>
@@ -3734,7 +3697,7 @@
         </w:tc>
         <w:tc>
           <w:tcPr>
-            <w:tcW w:type="dxa" w:w="2353"/>
+            <w:tcW w:type="dxa" w:w="1882"/>
             <w:shd w:fill="FFFFFF" w:val="clear"/>
             <w:tcBorders>
               <w:top w:val="single" w:sz="4" w:space="0" w:color="EEEEEE"/>
@@ -3770,7 +3733,7 @@
         </w:tc>
         <w:tc>
           <w:tcPr>
-            <w:tcW w:type="dxa" w:w="2353"/>
+            <w:tcW w:type="dxa" w:w="1882"/>
             <w:shd w:fill="FFFFFF" w:val="clear"/>
             <w:tcBorders>
               <w:top w:val="single" w:sz="4" w:space="0" w:color="EEEEEE"/>
@@ -3800,13 +3763,13 @@
                 <w:color w:val="1A1A1A"/>
                 <w:sz w:val="17"/>
               </w:rPr>
-              <w:t>勇闯天涯、燕京清爽、地方经济型、哈啤入门款</w:t>
+              <w:t>勇闯、燕京清爽、地方经济型</w:t>
             </w:r>
           </w:p>
         </w:tc>
         <w:tc>
           <w:tcPr>
-            <w:tcW w:type="dxa" w:w="2353"/>
+            <w:tcW w:type="dxa" w:w="1882"/>
             <w:shd w:fill="FFFFFF" w:val="clear"/>
             <w:tcBorders>
               <w:top w:val="single" w:sz="4" w:space="0" w:color="EEEEEE"/>
@@ -3836,7 +3799,43 @@
                 <w:color w:val="1A1A1A"/>
                 <w:sz w:val="17"/>
               </w:rPr>
-              <w:t>历史基本盘。费用最烈，盘在缩</w:t>
+              <w:t>只守不扩</w:t>
+            </w:r>
+          </w:p>
+        </w:tc>
+        <w:tc>
+          <w:tcPr>
+            <w:tcW w:type="dxa" w:w="1882"/>
+            <w:shd w:fill="FFFFFF" w:val="clear"/>
+            <w:tcBorders>
+              <w:top w:val="single" w:sz="4" w:space="0" w:color="EEEEEE"/>
+              <w:left w:val="nil" w:sz="0" w:space="0" w:color="FFFFFF"/>
+              <w:bottom w:val="single" w:sz="4" w:space="0" w:color="EEEEEE"/>
+              <w:right w:val="nil" w:sz="0" w:space="0" w:color="FFFFFF"/>
+            </w:tcBorders>
+            <w:tcMar>
+              <w:top w:w="52" w:type="dxa"/>
+              <w:left w:w="72" w:type="dxa"/>
+              <w:bottom w:w="52" w:type="dxa"/>
+              <w:right w:w="72" w:type="dxa"/>
+            </w:tcMar>
+            <w:vAlign w:val="center"/>
+          </w:tcPr>
+          <w:p>
+            <w:pPr>
+              <w:spacing w:before="0" w:after="0" w:line="269" w:lineRule="auto"/>
+              <w:ind w:firstLine="0"/>
+              <w:jc w:val="left"/>
+            </w:pPr>
+            <w:r>
+              <w:rPr>
+                <w:rFonts w:ascii="Calibri" w:hAnsi="Calibri" w:eastAsia="微软雅黑" w:cs="Calibri"/>
+                <w:b w:val="0"/>
+                <w:i w:val="0"/>
+                <w:color w:val="1A1A1A"/>
+                <w:sz w:val="17"/>
+              </w:rPr>
+              <w:t>再便宜一档换量，费用被雪花吃掉</w:t>
             </w:r>
           </w:p>
         </w:tc>
@@ -3844,7 +3843,7 @@
       <w:tr>
         <w:tc>
           <w:tcPr>
-            <w:tcW w:type="dxa" w:w="2353"/>
+            <w:tcW w:type="dxa" w:w="1882"/>
             <w:shd w:fill="F7F8FA" w:val="clear"/>
             <w:tcBorders>
               <w:top w:val="single" w:sz="4" w:space="0" w:color="EEEEEE"/>
@@ -3880,7 +3879,7 @@
         </w:tc>
         <w:tc>
           <w:tcPr>
-            <w:tcW w:type="dxa" w:w="2353"/>
+            <w:tcW w:type="dxa" w:w="1882"/>
             <w:shd w:fill="F7F8FA" w:val="clear"/>
             <w:tcBorders>
               <w:top w:val="single" w:sz="4" w:space="0" w:color="EEEEEE"/>
@@ -3916,7 +3915,7 @@
         </w:tc>
         <w:tc>
           <w:tcPr>
-            <w:tcW w:type="dxa" w:w="2353"/>
+            <w:tcW w:type="dxa" w:w="1882"/>
             <w:shd w:fill="F7F8FA" w:val="clear"/>
             <w:tcBorders>
               <w:top w:val="single" w:sz="4" w:space="0" w:color="EEEEEE"/>
@@ -3946,13 +3945,13 @@
                 <w:color w:val="1A1A1A"/>
                 <w:sz w:val="17"/>
               </w:rPr>
-              <w:t>老雪向下、U8、哈尔滨小麦王</w:t>
+              <w:t>U8、老雪、小麦王</w:t>
             </w:r>
           </w:p>
         </w:tc>
         <w:tc>
           <w:tcPr>
-            <w:tcW w:type="dxa" w:w="2353"/>
+            <w:tcW w:type="dxa" w:w="1882"/>
             <w:shd w:fill="F7F8FA" w:val="clear"/>
             <w:tcBorders>
               <w:top w:val="single" w:sz="4" w:space="0" w:color="EEEEEE"/>
@@ -3982,7 +3981,43 @@
                 <w:color w:val="1A1A1A"/>
                 <w:sz w:val="17"/>
               </w:rPr>
-              <w:t>独立品牌要去的位置。全麦必须在这里被选中</w:t>
+              <w:t>独立品牌主战场</w:t>
+            </w:r>
+          </w:p>
+        </w:tc>
+        <w:tc>
+          <w:tcPr>
+            <w:tcW w:type="dxa" w:w="1882"/>
+            <w:shd w:fill="F7F8FA" w:val="clear"/>
+            <w:tcBorders>
+              <w:top w:val="single" w:sz="4" w:space="0" w:color="EEEEEE"/>
+              <w:left w:val="nil" w:sz="0" w:space="0" w:color="FFFFFF"/>
+              <w:bottom w:val="single" w:sz="4" w:space="0" w:color="EEEEEE"/>
+              <w:right w:val="nil" w:sz="0" w:space="0" w:color="FFFFFF"/>
+            </w:tcBorders>
+            <w:tcMar>
+              <w:top w:w="52" w:type="dxa"/>
+              <w:left w:w="72" w:type="dxa"/>
+              <w:bottom w:w="52" w:type="dxa"/>
+              <w:right w:w="72" w:type="dxa"/>
+            </w:tcMar>
+            <w:vAlign w:val="center"/>
+          </w:tcPr>
+          <w:p>
+            <w:pPr>
+              <w:spacing w:before="0" w:after="0" w:line="269" w:lineRule="auto"/>
+              <w:ind w:firstLine="0"/>
+              <w:jc w:val="left"/>
+            </w:pPr>
+            <w:r>
+              <w:rPr>
+                <w:rFonts w:ascii="Calibri" w:hAnsi="Calibri" w:eastAsia="微软雅黑" w:cs="Calibri"/>
+                <w:b w:val="0"/>
+                <w:i w:val="0"/>
+                <w:color w:val="1A1A1A"/>
+                <w:sz w:val="17"/>
+              </w:rPr>
+              <w:t>全麦只是原料词，桌上仍回雪花</w:t>
             </w:r>
           </w:p>
         </w:tc>
@@ -3990,7 +4025,7 @@
       <w:tr>
         <w:tc>
           <w:tcPr>
-            <w:tcW w:type="dxa" w:w="2353"/>
+            <w:tcW w:type="dxa" w:w="1882"/>
             <w:shd w:fill="FFFFFF" w:val="clear"/>
             <w:tcBorders>
               <w:top w:val="single" w:sz="4" w:space="0" w:color="EEEEEE"/>
@@ -4026,7 +4061,7 @@
         </w:tc>
         <w:tc>
           <w:tcPr>
-            <w:tcW w:type="dxa" w:w="2353"/>
+            <w:tcW w:type="dxa" w:w="1882"/>
             <w:shd w:fill="FFFFFF" w:val="clear"/>
             <w:tcBorders>
               <w:top w:val="single" w:sz="4" w:space="0" w:color="EEEEEE"/>
@@ -4056,13 +4091,13 @@
                 <w:color w:val="1A1A1A"/>
                 <w:sz w:val="17"/>
               </w:rPr>
-              <w:t>经典 / 纯生及中高端以上</w:t>
+              <w:t>经典 / 纯生及以上</w:t>
             </w:r>
           </w:p>
         </w:tc>
         <w:tc>
           <w:tcPr>
-            <w:tcW w:type="dxa" w:w="2353"/>
+            <w:tcW w:type="dxa" w:w="1882"/>
             <w:shd w:fill="FFFFFF" w:val="clear"/>
             <w:tcBorders>
               <w:top w:val="single" w:sz="4" w:space="0" w:color="EEEEEE"/>
@@ -4098,7 +4133,7 @@
         </w:tc>
         <w:tc>
           <w:tcPr>
-            <w:tcW w:type="dxa" w:w="2353"/>
+            <w:tcW w:type="dxa" w:w="1882"/>
             <w:shd w:fill="FFFFFF" w:val="clear"/>
             <w:tcBorders>
               <w:top w:val="single" w:sz="4" w:space="0" w:color="EEEEEE"/>
@@ -4128,7 +4163,43 @@
                 <w:color w:val="1A1A1A"/>
                 <w:sz w:val="17"/>
               </w:rPr>
-              <w:t>红线。做成小青岛即失败</w:t>
+              <w:t>红线</w:t>
+            </w:r>
+          </w:p>
+        </w:tc>
+        <w:tc>
+          <w:tcPr>
+            <w:tcW w:type="dxa" w:w="1882"/>
+            <w:shd w:fill="FFFFFF" w:val="clear"/>
+            <w:tcBorders>
+              <w:top w:val="single" w:sz="4" w:space="0" w:color="EEEEEE"/>
+              <w:left w:val="nil" w:sz="0" w:space="0" w:color="FFFFFF"/>
+              <w:bottom w:val="single" w:sz="4" w:space="0" w:color="EEEEEE"/>
+              <w:right w:val="nil" w:sz="0" w:space="0" w:color="FFFFFF"/>
+            </w:tcBorders>
+            <w:tcMar>
+              <w:top w:w="52" w:type="dxa"/>
+              <w:left w:w="72" w:type="dxa"/>
+              <w:bottom w:w="52" w:type="dxa"/>
+              <w:right w:w="72" w:type="dxa"/>
+            </w:tcMar>
+            <w:vAlign w:val="center"/>
+          </w:tcPr>
+          <w:p>
+            <w:pPr>
+              <w:spacing w:before="0" w:after="0" w:line="269" w:lineRule="auto"/>
+              <w:ind w:firstLine="0"/>
+              <w:jc w:val="left"/>
+            </w:pPr>
+            <w:r>
+              <w:rPr>
+                <w:rFonts w:ascii="Calibri" w:hAnsi="Calibri" w:eastAsia="微软雅黑" w:cs="Calibri"/>
+                <w:b w:val="0"/>
+                <w:i w:val="0"/>
+                <w:color w:val="1A1A1A"/>
+                <w:sz w:val="17"/>
+              </w:rPr>
+              <w:t>内部左右互搏，主品牌吸走资源</w:t>
             </w:r>
           </w:p>
         </w:tc>
@@ -4147,7 +4218,326 @@
           <w:color w:val="767676"/>
           <w:sz w:val="17"/>
         </w:rPr>
-        <w:t>表 2  同价位分层。价位待终端核价与品牌方确认 H4，不作官方零售价。</w:t>
+        <w:t>表 2  对手分层。H4 未确认前不作官方零售价。</w:t>
+      </w:r>
+    </w:p>
+    <w:p>
+      <w:pPr>
+        <w:spacing w:before="220" w:after="100"/>
+        <w:ind w:firstLine="0"/>
+      </w:pPr>
+      <w:r>
+        <w:rPr>
+          <w:rFonts w:ascii="Calibri" w:hAnsi="Calibri" w:eastAsia="微软雅黑" w:cs="Calibri"/>
+          <w:b/>
+          <w:i w:val="0"/>
+          <w:color w:val="1A1A1A"/>
+          <w:sz w:val="24"/>
+        </w:rPr>
+        <w:t>B2  雪花是第一假想敌，因为它同时守塔基、填升级带、已经打进山东</w:t>
+      </w:r>
+    </w:p>
+    <w:p>
+      <w:pPr>
+        <w:spacing w:before="0" w:after="140" w:line="307" w:lineRule="auto"/>
+        <w:ind w:firstLine="0"/>
+        <w:jc w:val="both"/>
+      </w:pPr>
+      <w:r>
+        <w:rPr>
+          <w:rFonts w:ascii="Calibri" w:hAnsi="Calibri" w:eastAsia="微软雅黑" w:cs="Calibri"/>
+          <w:b w:val="0"/>
+          <w:i w:val="0"/>
+          <w:color w:val="1A1A1A"/>
+          <w:sz w:val="22"/>
+        </w:rPr>
+        <w:t>华润是销量第一，也是全国铺货最完整的大众体系。2024 年公司公开说要守住经济型、主力市场和大单品。塔基不会让给「再便宜一点」的崂山。同年中档及以上销量占比首次全年过半；2025 年次高档及以上接近总销量 25%，喜力仍有近两成增长，老雪 +60%。勇闯守桌，老雪和喜力把货架从下往上填。崂山出省以后，店主最省事的替换就是雪花——同一条大众预算，不用换经销商习惯。</w:t>
+      </w:r>
+    </w:p>
+    <w:p>
+      <w:pPr>
+        <w:spacing w:before="0" w:after="140" w:line="307" w:lineRule="auto"/>
+        <w:ind w:firstLine="0"/>
+        <w:jc w:val="both"/>
+      </w:pPr>
+      <w:r>
+        <w:rPr>
+          <w:rFonts w:ascii="Calibri" w:hAnsi="Calibri" w:eastAsia="微软雅黑" w:cs="Calibri"/>
+          <w:b w:val="0"/>
+          <w:i w:val="0"/>
+          <w:color w:val="1A1A1A"/>
+          <w:sz w:val="22"/>
+        </w:rPr>
+        <w:t>山东不是雪花的远方市场。侯孝海公开提过，山东因勇闯涨价和竞争烈度增加而增速放缓。行业访谈把青啤在鲁份额放到 70%—80%、华润约 20%。更早的渠道材料写过，雪花用清爽、勇闯和部分罐装切的就是 6 元及以下，青啤回击时用过精品崂山和经典。份额是访谈口径，机制是实的：同价位战争已经在根据地发生过一轮。</w:t>
+      </w:r>
+    </w:p>
+    <w:p>
+      <w:pPr>
+        <w:spacing w:before="0" w:after="140" w:line="307" w:lineRule="auto"/>
+        <w:ind w:firstLine="0"/>
+        <w:jc w:val="both"/>
+      </w:pPr>
+      <w:r>
+        <w:rPr>
+          <w:rFonts w:ascii="Calibri" w:hAnsi="Calibri" w:eastAsia="微软雅黑" w:cs="Calibri"/>
+          <w:b w:val="0"/>
+          <w:i w:val="0"/>
+          <w:color w:val="1A1A1A"/>
+          <w:sz w:val="22"/>
+        </w:rPr>
+        <w:t>So what。雪花第一。样板若选在雪花费用密度最高的省，单店成本会系统性高于北方。6 元以下对砸，是用短板打长板。6—8 元若没有可被感知的差异，店主仍回雪花。山东样板的第一对手就是勇闯，不是珠江，也不是青岛经典。</w:t>
+      </w:r>
+    </w:p>
+    <w:p>
+      <w:pPr>
+        <w:spacing w:before="220" w:after="100"/>
+        <w:ind w:firstLine="0"/>
+      </w:pPr>
+      <w:r>
+        <w:rPr>
+          <w:rFonts w:ascii="Calibri" w:hAnsi="Calibri" w:eastAsia="微软雅黑" w:cs="Calibri"/>
+          <w:b/>
+          <w:i w:val="0"/>
+          <w:color w:val="1A1A1A"/>
+          <w:sz w:val="24"/>
+        </w:rPr>
+        <w:t>B3  燕京是第二假想敌：清爽在下，U8 在上，河北会撞车</w:t>
+      </w:r>
+    </w:p>
+    <w:p>
+      <w:pPr>
+        <w:spacing w:before="0" w:after="140" w:line="307" w:lineRule="auto"/>
+        <w:ind w:firstLine="0"/>
+        <w:jc w:val="both"/>
+      </w:pPr>
+      <w:r>
+        <w:rPr>
+          <w:rFonts w:ascii="Calibri" w:hAnsi="Calibri" w:eastAsia="微软雅黑" w:cs="Calibri"/>
+          <w:b w:val="0"/>
+          <w:i w:val="0"/>
+          <w:color w:val="1A1A1A"/>
+          <w:sz w:val="22"/>
+        </w:rPr>
+        <w:t>燕京 2023—2025 年 394.24 → 400.44 → 405.30 万千升，缩量年连续正增长。U8 从 69.60 万千升到 90 万千升，两年都是三十来个点。2024 年华北仍占燕京收入 53.40%（78.30 亿元，+5.39%），华东 9.12%，华南 26.23%。燕京没有先变成均匀的全国公司，是用一款单品从华北外溢。</w:t>
+      </w:r>
+    </w:p>
+    <w:p>
+      <w:pPr>
+        <w:spacing w:before="0" w:after="140" w:line="307" w:lineRule="auto"/>
+        <w:ind w:firstLine="0"/>
+        <w:jc w:val="both"/>
+      </w:pPr>
+      <w:r>
+        <w:rPr>
+          <w:rFonts w:ascii="Calibri" w:hAnsi="Calibri" w:eastAsia="微软雅黑" w:cs="Calibri"/>
+          <w:b w:val="0"/>
+          <w:i w:val="0"/>
+          <w:color w:val="1A1A1A"/>
+          <w:sz w:val="22"/>
+        </w:rPr>
+        <w:t>U8 成交有 5—6 元和 8—10 元两说，并存，不合成一个价。结构比标价重要：清爽继续占塔基，U8 在大众升级带截「能喝出一点不一样」的预算。河北是 U8 除北京、内蒙外的优势区，也是飞书点名的崂山核心市场。两条线在河北会撞上。</w:t>
+      </w:r>
+    </w:p>
+    <w:p>
+      <w:pPr>
+        <w:spacing w:before="0" w:after="140" w:line="307" w:lineRule="auto"/>
+        <w:ind w:firstLine="0"/>
+        <w:jc w:val="both"/>
+      </w:pPr>
+      <w:r>
+        <w:rPr>
+          <w:rFonts w:ascii="Calibri" w:hAnsi="Calibri" w:eastAsia="微软雅黑" w:cs="Calibri"/>
+          <w:b w:val="0"/>
+          <w:i w:val="0"/>
+          <w:color w:val="1A1A1A"/>
+          <w:sz w:val="22"/>
+        </w:rPr>
+        <w:t>燕京 2024 年华东 +9.82%、华北 +5.39%、华南 +0.28%、西北 −12.52%。全国化不是所有方向都赚钱。So what。鲁冀不能只防勇闯，还要防 U8 把升级预算先拿走。华南不是燕京最锋利的刃，却是珠江的家门口——不能因为燕京弱，就判断南下容易。U8 的外溢方式（一款单品、从根据地出去）是产品组可以对照的结构，本组不把乌苏、东鹏写成案例。</w:t>
+      </w:r>
+    </w:p>
+    <w:p>
+      <w:pPr>
+        <w:spacing w:before="220" w:after="100"/>
+        <w:ind w:firstLine="0"/>
+      </w:pPr>
+      <w:r>
+        <w:rPr>
+          <w:rFonts w:ascii="Calibri" w:hAnsi="Calibri" w:eastAsia="微软雅黑" w:cs="Calibri"/>
+          <w:b/>
+          <w:i w:val="0"/>
+          <w:color w:val="1A1A1A"/>
+          <w:sz w:val="24"/>
+        </w:rPr>
+        <w:t>B4  小麦王是全麦叙事的最近干扰，百威中国区提醒现饮 β</w:t>
+      </w:r>
+    </w:p>
+    <w:p>
+      <w:pPr>
+        <w:spacing w:before="0" w:after="140" w:line="307" w:lineRule="auto"/>
+        <w:ind w:firstLine="0"/>
+        <w:jc w:val="both"/>
+      </w:pPr>
+      <w:r>
+        <w:rPr>
+          <w:rFonts w:ascii="Calibri" w:hAnsi="Calibri" w:eastAsia="微软雅黑" w:cs="Calibri"/>
+          <w:b w:val="0"/>
+          <w:i w:val="0"/>
+          <w:color w:val="1A1A1A"/>
+          <w:sz w:val="22"/>
+        </w:rPr>
+        <w:t>YJ 把哈尔滨小麦王列入 H6，和全麦最近。媒体把部分哈啤 SKU 放在 8—10 元，与崂山历史 6 元以下并不完全重叠。核价回来之前，小麦王先当干扰项：它会把「全麦 / 小麦 / 口感」讲成口味游戏。升级如果只停在原料词，桌上被稀释，瓶子还是叫不出名的大众瓶。核价后若小麦王大量落在 6—8 元，再升格为主对手。</w:t>
+      </w:r>
+    </w:p>
+    <w:p>
+      <w:pPr>
+        <w:spacing w:before="0" w:after="140" w:line="307" w:lineRule="auto"/>
+        <w:ind w:firstLine="0"/>
+        <w:jc w:val="both"/>
+      </w:pPr>
+      <w:r>
+        <w:rPr>
+          <w:rFonts w:ascii="Calibri" w:hAnsi="Calibri" w:eastAsia="微软雅黑" w:cs="Calibri"/>
+          <w:b w:val="0"/>
+          <w:i w:val="0"/>
+          <w:color w:val="1A1A1A"/>
+          <w:sz w:val="22"/>
+        </w:rPr>
+        <w:t>百威中国区 2024 年销量 −11.8%、收入 −13.0%、每百升收入 −1.4%，份额 −149bps；2025 年销量再 −8.6%。公司写的是现饮人流下降，2024 年四季度去库存约占降幅三分之一。飞书把崂山场景钉在火锅、烧烤、小龙虾。现饮是原点，也是这两年掉得最快的一层。</w:t>
+      </w:r>
+    </w:p>
+    <w:p>
+      <w:pPr>
+        <w:spacing w:before="0" w:after="140" w:line="307" w:lineRule="auto"/>
+        <w:ind w:firstLine="0"/>
+        <w:jc w:val="both"/>
+      </w:pPr>
+      <w:r>
+        <w:rPr>
+          <w:rFonts w:ascii="Calibri" w:hAnsi="Calibri" w:eastAsia="微软雅黑" w:cs="Calibri"/>
+          <w:b w:val="0"/>
+          <w:i w:val="0"/>
+          <w:color w:val="1A1A1A"/>
+          <w:sz w:val="22"/>
+        </w:rPr>
+        <w:t>So what。全国化如果只在餐饮桌上比，就是复制一个正在变难的场景。样板城必须同时看三件事：餐饮桌数（有没有被点）、零售排面（离开桌子还在不在）、即时零售（有没有第三条出货）。只有铺货、没有售卖和补货，出货可以快于饮用。对照样本归案例组，纪律留在本组：铺货家数不构成阶段成果。</w:t>
+      </w:r>
+    </w:p>
+    <w:p>
+      <w:pPr>
+        <w:spacing w:before="220" w:after="100"/>
+        <w:ind w:firstLine="0"/>
+      </w:pPr>
+      <w:r>
+        <w:rPr>
+          <w:rFonts w:ascii="Calibri" w:hAnsi="Calibri" w:eastAsia="微软雅黑" w:cs="Calibri"/>
+          <w:b/>
+          <w:i w:val="0"/>
+          <w:color w:val="1A1A1A"/>
+          <w:sz w:val="24"/>
+        </w:rPr>
+        <w:t>B5  珠江和嘉士伯不是北方对手，是南边墙上的名字</w:t>
+      </w:r>
+    </w:p>
+    <w:p>
+      <w:pPr>
+        <w:spacing w:before="0" w:after="140" w:line="307" w:lineRule="auto"/>
+        <w:ind w:firstLine="0"/>
+        <w:jc w:val="both"/>
+      </w:pPr>
+      <w:r>
+        <w:rPr>
+          <w:rFonts w:ascii="Calibri" w:hAnsi="Calibri" w:eastAsia="微软雅黑" w:cs="Calibri"/>
+          <w:b w:val="0"/>
+          <w:i w:val="0"/>
+          <w:color w:val="1A1A1A"/>
+          <w:sz w:val="22"/>
+        </w:rPr>
+        <w:t>珠江 2024 年 143.96 万千升（+2.62%），2025 年 146.24 万千升（+1.58%），华南收入占 95.66%。重庆啤酒 297.49 万、299.52 万千升，高档近半，代表嘉士伯在西部和部分南部的组合。两家都不该写进鲁冀对手名单，南下候选城必须点名。</w:t>
+      </w:r>
+    </w:p>
+    <w:p>
+      <w:pPr>
+        <w:spacing w:before="0" w:after="140" w:line="307" w:lineRule="auto"/>
+        <w:ind w:firstLine="0"/>
+        <w:jc w:val="both"/>
+      </w:pPr>
+      <w:r>
+        <w:rPr>
+          <w:rFonts w:ascii="Calibri" w:hAnsi="Calibri" w:eastAsia="微软雅黑" w:cs="Calibri"/>
+          <w:b w:val="0"/>
+          <w:i w:val="0"/>
+          <w:color w:val="1A1A1A"/>
+          <w:sz w:val="22"/>
+        </w:rPr>
+        <w:t>广东 2024 年规上产量 474.72 万千升，超过山东 463.4 万千升。产量第一不自动等于需求机会。飞书写填补南方中低端。公开格局是：南方中低端不空。空的是「有品质感、不是青岛、还进得了大众预算」。</w:t>
+      </w:r>
+    </w:p>
+    <w:p>
+      <w:pPr>
+        <w:spacing w:before="0" w:after="140" w:line="307" w:lineRule="auto"/>
+        <w:ind w:firstLine="0"/>
+        <w:jc w:val="both"/>
+      </w:pPr>
+      <w:r>
+        <w:rPr>
+          <w:rFonts w:ascii="Calibri" w:hAnsi="Calibri" w:eastAsia="微软雅黑" w:cs="Calibri"/>
+          <w:b w:val="0"/>
+          <w:i w:val="0"/>
+          <w:color w:val="1A1A1A"/>
+          <w:sz w:val="22"/>
+        </w:rPr>
+        <w:t>河北 2024 年啤酒产量 −3.98%，规上营收 67.51 亿元；雪花河北、河北燕京、青啤石家庄、蓝贝四家合计占营收 50.98%、利润 47.1%。河北不是自留地，是四强桌。地方鲜啤是家里的第三对手，不单列全国假想敌。</w:t>
+      </w:r>
+    </w:p>
+    <w:p>
+      <w:pPr>
+        <w:spacing w:before="0" w:after="140" w:line="307" w:lineRule="auto"/>
+        <w:ind w:firstLine="0"/>
+        <w:jc w:val="both"/>
+      </w:pPr>
+      <w:r>
+        <w:rPr>
+          <w:rFonts w:ascii="Calibri" w:hAnsi="Calibri" w:eastAsia="微软雅黑" w:cs="Calibri"/>
+          <w:b w:val="0"/>
+          <w:i w:val="0"/>
+          <w:color w:val="1A1A1A"/>
+          <w:sz w:val="22"/>
+        </w:rPr>
+        <w:t>论点 B 的 So what。假想敌顺序：雪花第一，燕京第二，小麦王待核价，珠江只在南方点名，青岛经典永不进入。名单一乱，样板城会选错，费用会打到红线上。</w:t>
+      </w:r>
+    </w:p>
+    <w:p>
+      <w:pPr>
+        <w:spacing w:before="0" w:after="140" w:line="307" w:lineRule="auto"/>
+        <w:ind w:firstLine="0"/>
+        <w:jc w:val="both"/>
+      </w:pPr>
+      <w:r>
+        <w:rPr>
+          <w:rFonts w:ascii="Calibri" w:hAnsi="Calibri" w:eastAsia="微软雅黑" w:cs="Calibri"/>
+          <w:b w:val="0"/>
+          <w:i w:val="0"/>
+          <w:color w:val="1A1A1A"/>
+          <w:sz w:val="22"/>
+        </w:rPr>
+        <w:t>名单怎么用在费用上。对雪花：山东样板的对照瓶是勇闯，不是喜力；衡量的是桌数有没有从勇闯挪回来，不是有没有在夜场见到崂山。对燕京：河北样板的对照瓶是 U8 和清爽两层，不能只盯一层。对小麦王：先核价，再决定要不要把「全麦」从原料词改成和小麦王可区分的桌上语言——改法归产品组，要不要改由核价决定。对珠江：只在南方候选城的对照名单里出现，不进入鲁冀周会。</w:t>
+      </w:r>
+    </w:p>
+    <w:p>
+      <w:pPr>
+        <w:spacing w:before="0" w:after="140" w:line="307" w:lineRule="auto"/>
+        <w:ind w:firstLine="0"/>
+        <w:jc w:val="both"/>
+      </w:pPr>
+      <w:r>
+        <w:rPr>
+          <w:rFonts w:ascii="Calibri" w:hAnsi="Calibri" w:eastAsia="微软雅黑" w:cs="Calibri"/>
+          <w:b w:val="0"/>
+          <w:i w:val="0"/>
+          <w:color w:val="1A1A1A"/>
+          <w:sz w:val="22"/>
+        </w:rPr>
+        <w:t>B 也排除三种错法。把五强都写成竞争对手，周报会变成行业剪报。把青岛经典写成主要敌人，全国化会做成内部左右互搏。把 U8 写成「高端案例」而不是桌上的截流者，6—8 元会被让出去，崂山会停在塔基和勇闯对砸。</w:t>
       </w:r>
     </w:p>
     <w:p>
@@ -4163,7 +4553,7 @@
           <w:color w:val="1428A0"/>
           <w:sz w:val="30"/>
         </w:rPr>
-        <w:t>04  区域市场</w:t>
+        <w:t>04  论点 C　地理不是往南走，是两场不同的战争</w:t>
       </w:r>
     </w:p>
     <w:p>
@@ -4187,7 +4577,7 @@
           <w:color w:val="1A1A1A"/>
           <w:sz w:val="24"/>
         </w:rPr>
-        <w:t>4.1  集团账本只能证明队伍在北方</w:t>
+        <w:t>C1  集团账本只能证明队伍在北方</w:t>
       </w:r>
     </w:p>
     <w:p>
@@ -4204,7 +4594,7 @@
           <w:color w:val="1A1A1A"/>
           <w:sz w:val="22"/>
         </w:rPr>
-        <w:t>飞书点名核心市场是山东、河北。青啤 2024 年山东分部收入 22,094,714 千元（220.95 亿元），同比 −3.38%；2025 年 22,324,392 千元，+1.04%。华北 2024 年 78.03 亿元，−2.24%；2025 年 78.64 亿元，+0.78%。山东分部销量占集团 70.68%（2024）、70.60%（2025），华北占 26.59%、26.62%。两分部相加约 97%。</w:t>
+        <w:t>飞书点名核心市场：山东、河北。青啤山东分部收入 2024 年 220.95 亿元（−3.38%），2025 年 223.24 亿元（+1.04%）。华北 78.03 亿元（−2.24%）、78.64 亿元（+0.78%）。山东分部销量占集团 70.68%、70.60%，华北占 26.59%、26.62%，合计约 97%。</w:t>
       </w:r>
     </w:p>
     <w:p>
@@ -4221,7 +4611,7 @@
           <w:color w:val="1A1A1A"/>
           <w:sz w:val="22"/>
         </w:rPr>
-        <w:t>97% 是销售组织记账。山东分部完全可能把销往外省的酒记在自己账上，不能写成「中国有 97% 的青啤消费者在鲁冀」。能确定的只有：基本盘、工厂和队伍在北方；南方不是换个商标就能接上的市场。崂山作为第二品牌，没有理由假设自己比集团更全国。</w:t>
+        <w:t>97% 是销售组织记账。山东分部可以把销往外省的酒记在自己账上。不能写成「中国有 97% 的青啤消费者在鲁冀」。能确定的只有：基本盘、工厂和队伍在北方。崂山作为第二品牌，没有证据表明自己比集团更全国。</w:t>
       </w:r>
     </w:p>
     <w:p>
@@ -4238,23 +4628,7 @@
           <w:color w:val="1A1A1A"/>
           <w:sz w:val="22"/>
         </w:rPr>
-        <w:t>2024 年华南 −6.75%、华东 −9.91%、东南 −24.14%。2025 年华南 +1.18%、华东 +3.81%，体量仍小。集团在南方的问题是规模不够、波动更大。青啤 2025 年报自己写北方连片、南方靠正向积累。这和飞书「样板先行、先稳经销商基本盘」是同一句话。</w:t>
-      </w:r>
-    </w:p>
-    <w:p>
-      <w:pPr>
-        <w:spacing w:before="220" w:after="100"/>
-        <w:ind w:firstLine="0"/>
-      </w:pPr>
-      <w:r>
-        <w:rPr>
-          <w:rFonts w:ascii="Calibri" w:hAnsi="Calibri" w:eastAsia="微软雅黑" w:cs="Calibri"/>
-          <w:b/>
-          <w:i w:val="0"/>
-          <w:color w:val="1A1A1A"/>
-          <w:sz w:val="24"/>
-        </w:rPr>
-        <w:t>4.2  山东：粮仓，也是勇闯已经进来过的主战场</w:t>
+        <w:t>2024 年华南 −6.75%、华东 −9.91%、东南 −24.14%。2025 年华南 +1.18%、华东 +3.81%，体量仍小。集团在南方是规模不够、波动更大。2025 年报写北方连片、南方靠正向积累。和飞书「样板先行、先稳经销商基本盘」是同一句。</w:t>
       </w:r>
     </w:p>
     <w:p>
@@ -4271,141 +4645,7 @@
           <w:color w:val="1A1A1A"/>
           <w:sz w:val="22"/>
         </w:rPr>
-        <w:t>山东产量 2022 年 489.39 万千升，2023 年 483.6 万千升，2024 年 463.4 万千升，并把维持三十余年的产量第一让给广东。消费上它仍是青啤体系最厚的省。份额访谈不能当官方数，但方向稳定：青啤在鲁是老大，雪花是唯一能把费用打进来的第二。</w:t>
-      </w:r>
-    </w:p>
-    <w:p>
-      <w:pPr>
-        <w:spacing w:before="0" w:after="140" w:line="307" w:lineRule="auto"/>
-        <w:ind w:firstLine="0"/>
-        <w:jc w:val="both"/>
-      </w:pPr>
-      <w:r>
-        <w:rPr>
-          <w:rFonts w:ascii="Calibri" w:hAnsi="Calibri" w:eastAsia="微软雅黑" w:cs="Calibri"/>
-          <w:b w:val="0"/>
-          <w:i w:val="0"/>
-          <w:color w:val="1A1A1A"/>
-          <w:sz w:val="22"/>
-        </w:rPr>
-        <w:t>对崂山，山东有两个角色，不能只记一个。它是现金流和经销商能力的样板源，全国化若抽空山东费用去支援南下，勇闯会把 6 元以下再切一刀。它也不是可以躺着的后花园——勇闯涨价和竞争烈度已经在公开场合被华润提起。正确写法是：山东先做升级保卫，验证全麦在勇闯桌上还能否被点，再把方法带出去。只守不升，永远是区域品牌；只抽不守，连区域品牌都保不住。</w:t>
-      </w:r>
-    </w:p>
-    <w:p>
-      <w:pPr>
-        <w:spacing w:before="220" w:after="100"/>
-        <w:ind w:firstLine="0"/>
-      </w:pPr>
-      <w:r>
-        <w:rPr>
-          <w:rFonts w:ascii="Calibri" w:hAnsi="Calibri" w:eastAsia="微软雅黑" w:cs="Calibri"/>
-          <w:b/>
-          <w:i w:val="0"/>
-          <w:color w:val="1A1A1A"/>
-          <w:sz w:val="24"/>
-        </w:rPr>
-        <w:t>4.3  河北：飞书点名的第二核心，四强已经在桌上</w:t>
-      </w:r>
-    </w:p>
-    <w:p>
-      <w:pPr>
-        <w:spacing w:before="0" w:after="140" w:line="307" w:lineRule="auto"/>
-        <w:ind w:firstLine="0"/>
-        <w:jc w:val="both"/>
-      </w:pPr>
-      <w:r>
-        <w:rPr>
-          <w:rFonts w:ascii="Calibri" w:hAnsi="Calibri" w:eastAsia="微软雅黑" w:cs="Calibri"/>
-          <w:b w:val="0"/>
-          <w:i w:val="0"/>
-          <w:color w:val="1A1A1A"/>
-          <w:sz w:val="22"/>
-        </w:rPr>
-        <w:t>河北 2024 年啤酒产量下降，利润微降，四家企业拿走约一半营收。燕京在这里有根据地，U8 往外溢时河北是近场。雪花有河北公司，青啤有石家庄工厂，蓝贝还在。飞书把河北写成核心市场，公开格局把它写成消耗市场。</w:t>
-      </w:r>
-    </w:p>
-    <w:p>
-      <w:pPr>
-        <w:spacing w:before="0" w:after="140" w:line="307" w:lineRule="auto"/>
-        <w:ind w:firstLine="0"/>
-        <w:jc w:val="both"/>
-      </w:pPr>
-      <w:r>
-        <w:rPr>
-          <w:rFonts w:ascii="Calibri" w:hAnsi="Calibri" w:eastAsia="微软雅黑" w:cs="Calibri"/>
-          <w:b w:val="0"/>
-          <w:i w:val="0"/>
-          <w:color w:val="1A1A1A"/>
-          <w:sz w:val="22"/>
-        </w:rPr>
-        <w:t>河北样板的考核不应是再铺多少低价瓶。要看的是：燕京 U8 和雪花同时在场时，升级后的崂山还能否保住桌数。能保住，北方连片才成立；保不住，全国化在第二核心就已经失败，不必南下验证。</w:t>
-      </w:r>
-    </w:p>
-    <w:p>
-      <w:pPr>
-        <w:spacing w:before="220" w:after="100"/>
-        <w:ind w:firstLine="0"/>
-      </w:pPr>
-      <w:r>
-        <w:rPr>
-          <w:rFonts w:ascii="Calibri" w:hAnsi="Calibri" w:eastAsia="微软雅黑" w:cs="Calibri"/>
-          <w:b/>
-          <w:i w:val="0"/>
-          <w:color w:val="1A1A1A"/>
-          <w:sz w:val="24"/>
-        </w:rPr>
-        <w:t>4.4  华南：产量中心南移，品牌墙比需求墙高</w:t>
-      </w:r>
-    </w:p>
-    <w:p>
-      <w:pPr>
-        <w:spacing w:before="0" w:after="140" w:line="307" w:lineRule="auto"/>
-        <w:ind w:firstLine="0"/>
-        <w:jc w:val="both"/>
-      </w:pPr>
-      <w:r>
-        <w:rPr>
-          <w:rFonts w:ascii="Calibri" w:hAnsi="Calibri" w:eastAsia="微软雅黑" w:cs="Calibri"/>
-          <w:b w:val="0"/>
-          <w:i w:val="0"/>
-          <w:color w:val="1A1A1A"/>
-          <w:sz w:val="22"/>
-        </w:rPr>
-        <w:t>广东成为第一生产大省，雪花、嘉士伯、青啤都在这里有过产能或收购。珠江把 95% 以上收入放在华南且仍在增长。飞书禁止用统一策略覆盖全国，落成操作就是：不与珠江抢「广东人自己的啤酒」，不与喜力、嘉士伯抢夜场高档，只试验外地大众品牌能否在中低端餐饮和传统零售站住。</w:t>
-      </w:r>
-    </w:p>
-    <w:p>
-      <w:pPr>
-        <w:spacing w:before="0" w:after="140" w:line="307" w:lineRule="auto"/>
-        <w:ind w:firstLine="0"/>
-        <w:jc w:val="both"/>
-      </w:pPr>
-      <w:r>
-        <w:rPr>
-          <w:rFonts w:ascii="Calibri" w:hAnsi="Calibri" w:eastAsia="微软雅黑" w:cs="Calibri"/>
-          <w:b w:val="0"/>
-          <w:i w:val="0"/>
-          <w:color w:val="1A1A1A"/>
-          <w:sz w:val="22"/>
-        </w:rPr>
-        <w:t>样板城缩小到一座，不要写成华南大区。门槛五条：有现成青啤或崂山经销商，90 天能铺进餐饮加零售；现饮场景和北方同源，烧烤、夜宵、海鲜，降低教育成本；勇闯或 U8 费用还没顶格；不和青岛经典抢同一张中档桌；能铺到邻城，不是旅游孤岛。按这个筛，南下先是一座夜宵城，不是广东省。</w:t>
-      </w:r>
-    </w:p>
-    <w:p>
-      <w:pPr>
-        <w:spacing w:before="0" w:after="140" w:line="307" w:lineRule="auto"/>
-        <w:ind w:firstLine="0"/>
-        <w:jc w:val="both"/>
-      </w:pPr>
-      <w:r>
-        <w:rPr>
-          <w:rFonts w:ascii="Calibri" w:hAnsi="Calibri" w:eastAsia="微软雅黑" w:cs="Calibri"/>
-          <w:b w:val="0"/>
-          <w:i w:val="0"/>
-          <w:color w:val="1A1A1A"/>
-          <w:sz w:val="22"/>
-        </w:rPr>
-        <w:t>华东 2024 年掉了 9.91%，2025 年转正 3.81%，体量介于华北和华南之间。本稿不把华东写成第三核心，除非崂山分省数回来以后显示那里已经有可观的桌。沿黄、鲁西可以和山东保卫放在同一组观察，不另开一条「全国战线」。</w:t>
+        <w:t>So what。把青啤分部结构当成崂山已经全国化的证据，是读错账。南方不是换标就能接上的市场。全国化的第一笔费用，应当留在队伍已经在的地方，用来证明升级后还守不守得住桌。</w:t>
       </w:r>
     </w:p>
     <w:tbl>
@@ -4527,7 +4767,7 @@
                 <w:color w:val="FFFFFF"/>
                 <w:sz w:val="17"/>
               </w:rPr>
-              <w:t>2024 同比</w:t>
+              <w:t>24同比</w:t>
             </w:r>
           </w:p>
         </w:tc>
@@ -4599,7 +4839,7 @@
                 <w:color w:val="FFFFFF"/>
                 <w:sz w:val="17"/>
               </w:rPr>
-              <w:t>2025 同比</w:t>
+              <w:t>25同比</w:t>
             </w:r>
           </w:p>
         </w:tc>
@@ -5710,7 +5950,191 @@
           <w:color w:val="767676"/>
           <w:sz w:val="17"/>
         </w:rPr>
-        <w:t>表 3  青啤分部收入，含分部间交易。南部分部销量不拿二手数填。</w:t>
+        <w:t>表 3  青啤分部收入，含内部交易。不等于崂山分省消费。</w:t>
+      </w:r>
+    </w:p>
+    <w:p>
+      <w:pPr>
+        <w:spacing w:before="220" w:after="100"/>
+        <w:ind w:firstLine="0"/>
+      </w:pPr>
+      <w:r>
+        <w:rPr>
+          <w:rFonts w:ascii="Calibri" w:hAnsi="Calibri" w:eastAsia="微软雅黑" w:cs="Calibri"/>
+          <w:b/>
+          <w:i w:val="0"/>
+          <w:color w:val="1A1A1A"/>
+          <w:sz w:val="24"/>
+        </w:rPr>
+        <w:t>C2  山东是粮仓，也是勇闯已经打进来的主战场</w:t>
+      </w:r>
+    </w:p>
+    <w:p>
+      <w:pPr>
+        <w:spacing w:before="0" w:after="140" w:line="307" w:lineRule="auto"/>
+        <w:ind w:firstLine="0"/>
+        <w:jc w:val="both"/>
+      </w:pPr>
+      <w:r>
+        <w:rPr>
+          <w:rFonts w:ascii="Calibri" w:hAnsi="Calibri" w:eastAsia="微软雅黑" w:cs="Calibri"/>
+          <w:b w:val="0"/>
+          <w:i w:val="0"/>
+          <w:color w:val="1A1A1A"/>
+          <w:sz w:val="22"/>
+        </w:rPr>
+        <w:t>山东产量 2022—2024 年 489.39 → 483.6 → 463.4 万千升，产量第一让给广东。消费上它仍是青啤体系最厚的省。份额访谈不能当官方数，方向稳定：青啤是老大，雪花是唯一能把费用打进来的第二。</w:t>
+      </w:r>
+    </w:p>
+    <w:p>
+      <w:pPr>
+        <w:spacing w:before="0" w:after="140" w:line="307" w:lineRule="auto"/>
+        <w:ind w:firstLine="0"/>
+        <w:jc w:val="both"/>
+      </w:pPr>
+      <w:r>
+        <w:rPr>
+          <w:rFonts w:ascii="Calibri" w:hAnsi="Calibri" w:eastAsia="微软雅黑" w:cs="Calibri"/>
+          <w:b w:val="0"/>
+          <w:i w:val="0"/>
+          <w:color w:val="1A1A1A"/>
+          <w:sz w:val="22"/>
+        </w:rPr>
+        <w:t>山东对崂山是两个角色，不能只记一个。它是现金流和经销商能力的来源。全国化若抽空山东费用支援南下，勇闯会在 6 元以下再切一刀，止衰会先在根据地失败。它也不是后花园。勇闯涨价和竞争烈度已被华润在公开场合提起，同价位战争已经发生过。</w:t>
+      </w:r>
+    </w:p>
+    <w:p>
+      <w:pPr>
+        <w:spacing w:before="0" w:after="140" w:line="307" w:lineRule="auto"/>
+        <w:ind w:firstLine="0"/>
+        <w:jc w:val="both"/>
+      </w:pPr>
+      <w:r>
+        <w:rPr>
+          <w:rFonts w:ascii="Calibri" w:hAnsi="Calibri" w:eastAsia="微软雅黑" w:cs="Calibri"/>
+          <w:b w:val="0"/>
+          <w:i w:val="0"/>
+          <w:color w:val="1A1A1A"/>
+          <w:sz w:val="22"/>
+        </w:rPr>
+        <w:t>所以山东样板的问题不是「要不要守」，是「升级后还能否在勇闯桌上被点」。只守不升，永远是区域品牌。只抽不守，连区域品牌都保不住。方法在这里验证，再带出去。带不出去，说明方法不成立，不是南方人更难说话。</w:t>
+      </w:r>
+    </w:p>
+    <w:p>
+      <w:pPr>
+        <w:spacing w:before="220" w:after="100"/>
+        <w:ind w:firstLine="0"/>
+      </w:pPr>
+      <w:r>
+        <w:rPr>
+          <w:rFonts w:ascii="Calibri" w:hAnsi="Calibri" w:eastAsia="微软雅黑" w:cs="Calibri"/>
+          <w:b/>
+          <w:i w:val="0"/>
+          <w:color w:val="1A1A1A"/>
+          <w:sz w:val="24"/>
+        </w:rPr>
+        <w:t>C3  河北是第二核心，也是四强桌、U8 近场</w:t>
+      </w:r>
+    </w:p>
+    <w:p>
+      <w:pPr>
+        <w:spacing w:before="0" w:after="140" w:line="307" w:lineRule="auto"/>
+        <w:ind w:firstLine="0"/>
+        <w:jc w:val="both"/>
+      </w:pPr>
+      <w:r>
+        <w:rPr>
+          <w:rFonts w:ascii="Calibri" w:hAnsi="Calibri" w:eastAsia="微软雅黑" w:cs="Calibri"/>
+          <w:b w:val="0"/>
+          <w:i w:val="0"/>
+          <w:color w:val="1A1A1A"/>
+          <w:sz w:val="22"/>
+        </w:rPr>
+        <w:t>河北 2024 年啤酒产量下降、利润微降，四家拿走约一半营收。燕京有根据地，U8 外溢时河北是近场。雪花有河北公司，青啤有石家庄工厂，蓝贝还在。飞书把它写成核心市场，公开格局把它写成消耗市场。两句都对：必须守，而且守起来比山东更挤。</w:t>
+      </w:r>
+    </w:p>
+    <w:p>
+      <w:pPr>
+        <w:spacing w:before="0" w:after="140" w:line="307" w:lineRule="auto"/>
+        <w:ind w:firstLine="0"/>
+        <w:jc w:val="both"/>
+      </w:pPr>
+      <w:r>
+        <w:rPr>
+          <w:rFonts w:ascii="Calibri" w:hAnsi="Calibri" w:eastAsia="微软雅黑" w:cs="Calibri"/>
+          <w:b w:val="0"/>
+          <w:i w:val="0"/>
+          <w:color w:val="1A1A1A"/>
+          <w:sz w:val="22"/>
+        </w:rPr>
+        <w:t>河北样板的考核不是再铺多少低价瓶。要看的是：U8 和雪花同时在场时，升级后的崂山还能否保住桌数。能保住，北方连片才成立。保不住，全国化在第二核心就已经失败，不必南下花钱验证一条在河北就不成立的产品语言。</w:t>
+      </w:r>
+    </w:p>
+    <w:p>
+      <w:pPr>
+        <w:spacing w:before="220" w:after="100"/>
+        <w:ind w:firstLine="0"/>
+      </w:pPr>
+      <w:r>
+        <w:rPr>
+          <w:rFonts w:ascii="Calibri" w:hAnsi="Calibri" w:eastAsia="微软雅黑" w:cs="Calibri"/>
+          <w:b/>
+          <w:i w:val="0"/>
+          <w:color w:val="1A1A1A"/>
+          <w:sz w:val="24"/>
+        </w:rPr>
+        <w:t>C4  华南是进入战，不是填空</w:t>
+      </w:r>
+    </w:p>
+    <w:p>
+      <w:pPr>
+        <w:spacing w:before="0" w:after="140" w:line="307" w:lineRule="auto"/>
+        <w:ind w:firstLine="0"/>
+        <w:jc w:val="both"/>
+      </w:pPr>
+      <w:r>
+        <w:rPr>
+          <w:rFonts w:ascii="Calibri" w:hAnsi="Calibri" w:eastAsia="微软雅黑" w:cs="Calibri"/>
+          <w:b w:val="0"/>
+          <w:i w:val="0"/>
+          <w:color w:val="1A1A1A"/>
+          <w:sz w:val="22"/>
+        </w:rPr>
+        <w:t>广东已是第一生产大省。珠江、雪花、嘉士伯、青啤都在这里有过产能或收购。飞书禁止统一策略覆盖全国，落成操作是：不与珠江抢「广东人自己的啤酒」，不与喜力、嘉士伯抢夜场高档，只试验外地大众瓶能否在中低端餐饮和传统零售站住。</w:t>
+      </w:r>
+    </w:p>
+    <w:p>
+      <w:pPr>
+        <w:spacing w:before="0" w:after="140" w:line="307" w:lineRule="auto"/>
+        <w:ind w:firstLine="0"/>
+        <w:jc w:val="both"/>
+      </w:pPr>
+      <w:r>
+        <w:rPr>
+          <w:rFonts w:ascii="Calibri" w:hAnsi="Calibri" w:eastAsia="微软雅黑" w:cs="Calibri"/>
+          <w:b w:val="0"/>
+          <w:i w:val="0"/>
+          <w:color w:val="1A1A1A"/>
+          <w:sz w:val="22"/>
+        </w:rPr>
+        <w:t>样板缩小到一座城，不写成华南大区。门槛五条，缺一条就换城：有现成青啤或崂山经销商，90 天能铺进餐饮加零售；现饮场景与北方同源——烧烤、夜宵、海鲜——降低教育成本；勇闯或 U8 费用尚未顶格；不与青岛经典抢同一张中档桌；能铺到邻城，不是旅游孤岛。</w:t>
+      </w:r>
+    </w:p>
+    <w:p>
+      <w:pPr>
+        <w:spacing w:before="0" w:after="140" w:line="307" w:lineRule="auto"/>
+        <w:ind w:firstLine="0"/>
+        <w:jc w:val="both"/>
+      </w:pPr>
+      <w:r>
+        <w:rPr>
+          <w:rFonts w:ascii="Calibri" w:hAnsi="Calibri" w:eastAsia="微软雅黑" w:cs="Calibri"/>
+          <w:b w:val="0"/>
+          <w:i w:val="0"/>
+          <w:color w:val="1A1A1A"/>
+          <w:sz w:val="22"/>
+        </w:rPr>
+        <w:t>华东 2024 年 −9.91%、2025 年 +3.81%，体量介于华北与华南之间。本稿不把华东写成第三核心，除非分省数回来显示那里已经有可观的桌。沿黄、鲁西并入山东保卫观察，不另开一条「全国战线」。</w:t>
       </w:r>
     </w:p>
     <w:tbl>
@@ -5793,7 +6217,7 @@
                 <w:color w:val="FFFFFF"/>
                 <w:sz w:val="17"/>
               </w:rPr>
-              <w:t>北方（鲁 / 冀及沿黄）</w:t>
+              <w:t>北方保卫战</w:t>
             </w:r>
           </w:p>
         </w:tc>
@@ -5829,7 +6253,7 @@
                 <w:color w:val="FFFFFF"/>
                 <w:sz w:val="17"/>
               </w:rPr>
-              <w:t>南方（粤及泛华南）</w:t>
+              <w:t>南方进入战</w:t>
             </w:r>
           </w:p>
         </w:tc>
@@ -5867,7 +6291,7 @@
                 <w:color w:val="1A1A1A"/>
                 <w:sz w:val="17"/>
               </w:rPr>
-              <w:t>已有厚度</w:t>
+              <w:t>要回答的问题</w:t>
             </w:r>
           </w:p>
         </w:tc>
@@ -5903,7 +6327,7 @@
                 <w:color w:val="1A1A1A"/>
                 <w:sz w:val="17"/>
               </w:rPr>
-              <w:t>飞书点名核心；北方分部记账占集团销量约七成加两成</w:t>
+              <w:t>全麦在勇闯 / U8 桌上还能否被点</w:t>
             </w:r>
           </w:p>
         </w:tc>
@@ -5939,7 +6363,7 @@
                 <w:color w:val="1A1A1A"/>
                 <w:sz w:val="17"/>
               </w:rPr>
-              <w:t>收入薄，2024 年掉得快</w:t>
+              <w:t>外地大众瓶在珠江 / 雪花桌上能否被点第二次</w:t>
             </w:r>
           </w:p>
         </w:tc>
@@ -5977,7 +6401,7 @@
                 <w:color w:val="1A1A1A"/>
                 <w:sz w:val="17"/>
               </w:rPr>
-              <w:t>桌上对手</w:t>
+              <w:t>对手</w:t>
             </w:r>
           </w:p>
         </w:tc>
@@ -6049,7 +6473,7 @@
                 <w:color w:val="1A1A1A"/>
                 <w:sz w:val="17"/>
               </w:rPr>
-              <w:t>珠江 + 雪花 + 嘉士伯</w:t>
+              <w:t>珠江、雪花、嘉士伯组合</w:t>
             </w:r>
           </w:p>
         </w:tc>
@@ -6087,7 +6511,7 @@
                 <w:color w:val="1A1A1A"/>
                 <w:sz w:val="17"/>
               </w:rPr>
-              <w:t>场景</w:t>
+              <w:t>失败含义</w:t>
             </w:r>
           </w:p>
         </w:tc>
@@ -6123,7 +6547,7 @@
                 <w:color w:val="1A1A1A"/>
                 <w:sz w:val="17"/>
               </w:rPr>
-              <w:t>火锅烧烤夜宵，和飞书一致</w:t>
+              <w:t>根据地失守，全国化失去方法</w:t>
             </w:r>
           </w:p>
         </w:tc>
@@ -6159,7 +6583,7 @@
                 <w:color w:val="1A1A1A"/>
                 <w:sz w:val="17"/>
               </w:rPr>
-              <w:t>餐饮更碎，地域心智更强</w:t>
+              <w:t>有方法但不可复制，停在区域品牌</w:t>
             </w:r>
           </w:p>
         </w:tc>
@@ -6197,7 +6621,7 @@
                 <w:color w:val="1A1A1A"/>
                 <w:sz w:val="17"/>
               </w:rPr>
-              <w:t>对崂山</w:t>
+              <w:t>成功仍不够</w:t>
             </w:r>
           </w:p>
         </w:tc>
@@ -6233,7 +6657,7 @@
                 <w:color w:val="1A1A1A"/>
                 <w:sz w:val="17"/>
               </w:rPr>
-              <w:t>先守桌，再换产品语言</w:t>
+              <w:t>只说明鲁冀还在，不证明能出省</w:t>
             </w:r>
           </w:p>
         </w:tc>
@@ -6269,7 +6693,117 @@
                 <w:color w:val="1A1A1A"/>
                 <w:sz w:val="17"/>
               </w:rPr>
-              <w:t>单城进入，不铺全省</w:t>
+              <w:t>只说明一座城，不证明能铺省</w:t>
+            </w:r>
+          </w:p>
+        </w:tc>
+      </w:tr>
+      <w:tr>
+        <w:tc>
+          <w:tcPr>
+            <w:tcW w:type="dxa" w:w="3137"/>
+            <w:shd w:fill="FFFFFF" w:val="clear"/>
+            <w:tcBorders>
+              <w:top w:val="single" w:sz="4" w:space="0" w:color="EEEEEE"/>
+              <w:left w:val="nil" w:sz="0" w:space="0" w:color="FFFFFF"/>
+              <w:bottom w:val="single" w:sz="4" w:space="0" w:color="EEEEEE"/>
+              <w:right w:val="nil" w:sz="0" w:space="0" w:color="FFFFFF"/>
+            </w:tcBorders>
+            <w:tcMar>
+              <w:top w:w="52" w:type="dxa"/>
+              <w:left w:w="72" w:type="dxa"/>
+              <w:bottom w:w="52" w:type="dxa"/>
+              <w:right w:w="72" w:type="dxa"/>
+            </w:tcMar>
+            <w:vAlign w:val="center"/>
+          </w:tcPr>
+          <w:p>
+            <w:pPr>
+              <w:spacing w:before="0" w:after="0" w:line="269" w:lineRule="auto"/>
+              <w:ind w:firstLine="0"/>
+              <w:jc w:val="left"/>
+            </w:pPr>
+            <w:r>
+              <w:rPr>
+                <w:rFonts w:ascii="Calibri" w:hAnsi="Calibri" w:eastAsia="微软雅黑" w:cs="Calibri"/>
+                <w:b w:val="0"/>
+                <w:i w:val="0"/>
+                <w:color w:val="1A1A1A"/>
+                <w:sz w:val="17"/>
+              </w:rPr>
+              <w:t>禁止动作</w:t>
+            </w:r>
+          </w:p>
+        </w:tc>
+        <w:tc>
+          <w:tcPr>
+            <w:tcW w:type="dxa" w:w="3137"/>
+            <w:shd w:fill="FFFFFF" w:val="clear"/>
+            <w:tcBorders>
+              <w:top w:val="single" w:sz="4" w:space="0" w:color="EEEEEE"/>
+              <w:left w:val="nil" w:sz="0" w:space="0" w:color="FFFFFF"/>
+              <w:bottom w:val="single" w:sz="4" w:space="0" w:color="EEEEEE"/>
+              <w:right w:val="nil" w:sz="0" w:space="0" w:color="FFFFFF"/>
+            </w:tcBorders>
+            <w:tcMar>
+              <w:top w:w="52" w:type="dxa"/>
+              <w:left w:w="72" w:type="dxa"/>
+              <w:bottom w:w="52" w:type="dxa"/>
+              <w:right w:w="72" w:type="dxa"/>
+            </w:tcMar>
+            <w:vAlign w:val="center"/>
+          </w:tcPr>
+          <w:p>
+            <w:pPr>
+              <w:spacing w:before="0" w:after="0" w:line="269" w:lineRule="auto"/>
+              <w:ind w:firstLine="0"/>
+              <w:jc w:val="left"/>
+            </w:pPr>
+            <w:r>
+              <w:rPr>
+                <w:rFonts w:ascii="Calibri" w:hAnsi="Calibri" w:eastAsia="微软雅黑" w:cs="Calibri"/>
+                <w:b w:val="0"/>
+                <w:i w:val="0"/>
+                <w:color w:val="1A1A1A"/>
+                <w:sz w:val="17"/>
+              </w:rPr>
+              <w:t>抽空费用支援南下</w:t>
+            </w:r>
+          </w:p>
+        </w:tc>
+        <w:tc>
+          <w:tcPr>
+            <w:tcW w:type="dxa" w:w="3137"/>
+            <w:shd w:fill="FFFFFF" w:val="clear"/>
+            <w:tcBorders>
+              <w:top w:val="single" w:sz="4" w:space="0" w:color="EEEEEE"/>
+              <w:left w:val="nil" w:sz="0" w:space="0" w:color="FFFFFF"/>
+              <w:bottom w:val="single" w:sz="4" w:space="0" w:color="EEEEEE"/>
+              <w:right w:val="nil" w:sz="0" w:space="0" w:color="FFFFFF"/>
+            </w:tcBorders>
+            <w:tcMar>
+              <w:top w:w="52" w:type="dxa"/>
+              <w:left w:w="72" w:type="dxa"/>
+              <w:bottom w:w="52" w:type="dxa"/>
+              <w:right w:w="72" w:type="dxa"/>
+            </w:tcMar>
+            <w:vAlign w:val="center"/>
+          </w:tcPr>
+          <w:p>
+            <w:pPr>
+              <w:spacing w:before="0" w:after="0" w:line="269" w:lineRule="auto"/>
+              <w:ind w:firstLine="0"/>
+              <w:jc w:val="left"/>
+            </w:pPr>
+            <w:r>
+              <w:rPr>
+                <w:rFonts w:ascii="Calibri" w:hAnsi="Calibri" w:eastAsia="微软雅黑" w:cs="Calibri"/>
+                <w:b w:val="0"/>
+                <w:i w:val="0"/>
+                <w:color w:val="1A1A1A"/>
+                <w:sz w:val="17"/>
+              </w:rPr>
+              <w:t>华南大区铺开、全国铺开</w:t>
             </w:r>
           </w:p>
         </w:tc>
@@ -6288,7 +6822,58 @@
           <w:color w:val="767676"/>
           <w:sz w:val="17"/>
         </w:rPr>
-        <w:t>表 4  南北只要这一张。渠道深挖、案例对照不在本组。</w:t>
+        <w:t>表 4  两场战争不可互相替代。全国化要两个都成立。</w:t>
+      </w:r>
+    </w:p>
+    <w:p>
+      <w:pPr>
+        <w:spacing w:before="0" w:after="140" w:line="307" w:lineRule="auto"/>
+        <w:ind w:firstLine="0"/>
+        <w:jc w:val="both"/>
+      </w:pPr>
+      <w:r>
+        <w:rPr>
+          <w:rFonts w:ascii="Calibri" w:hAnsi="Calibri" w:eastAsia="微软雅黑" w:cs="Calibri"/>
+          <w:b w:val="0"/>
+          <w:i w:val="0"/>
+          <w:color w:val="1A1A1A"/>
+          <w:sz w:val="22"/>
+        </w:rPr>
+        <w:t>论点 C 的 So what。地理决策不是选一个增长更快的大区。是选两场能证伪的试验。北方失败，停。南方失败，方法不复制，回到鲁冀把桌守住。两个都还没做，就铺省，是把假设当成答案。</w:t>
+      </w:r>
+    </w:p>
+    <w:p>
+      <w:pPr>
+        <w:spacing w:before="0" w:after="140" w:line="307" w:lineRule="auto"/>
+        <w:ind w:firstLine="0"/>
+        <w:jc w:val="both"/>
+      </w:pPr>
+      <w:r>
+        <w:rPr>
+          <w:rFonts w:ascii="Calibri" w:hAnsi="Calibri" w:eastAsia="微软雅黑" w:cs="Calibri"/>
+          <w:b w:val="0"/>
+          <w:i w:val="0"/>
+          <w:color w:val="1A1A1A"/>
+          <w:sz w:val="22"/>
+        </w:rPr>
+        <w:t>两场试验的先后不是口味问题，是信息价值。鲁冀已经有桌、有队伍、有勇闯和 U8。在这里失败，失败原因可以被分解成产品不被点、还是执行不到位——至少对手是清楚的。在广州或深圳先失败，失败原因可以同时是墙、场景、价格、队伍，四件事缠在一起，学不到可复制的方法。所以第一笔费用的信息密度在北方更高。南方城是方法成立之后的压力测试，不是方法本身。</w:t>
+      </w:r>
+    </w:p>
+    <w:p>
+      <w:pPr>
+        <w:spacing w:before="0" w:after="140" w:line="307" w:lineRule="auto"/>
+        <w:ind w:firstLine="0"/>
+        <w:jc w:val="both"/>
+      </w:pPr>
+      <w:r>
+        <w:rPr>
+          <w:rFonts w:ascii="Calibri" w:hAnsi="Calibri" w:eastAsia="微软雅黑" w:cs="Calibri"/>
+          <w:b w:val="0"/>
+          <w:i w:val="0"/>
+          <w:color w:val="1A1A1A"/>
+          <w:sz w:val="22"/>
+        </w:rPr>
+        <w:t>C 排除的写法同样具体。用广东产量第一证明应该把主战场迁到华南——产量是供给，墙上已经有珠江。用「南方消费升级」证明 6 元以下能填空——南方中低端不空。用青啤分部 97% 证明崂山消费也在鲁冀——记账不是消费地。用华东 2025 年转正证明可以开第三条战线——体量仍小，且没有崂山单品牌分省数。</w:t>
       </w:r>
     </w:p>
     <w:p>
@@ -6304,7 +6889,7 @@
           <w:color w:val="1428A0"/>
           <w:sz w:val="30"/>
         </w:rPr>
-        <w:t>05  把对手和区域收成一条逻辑</w:t>
+        <w:t>05  把 A、B、C 收成一条决策逻辑</w:t>
       </w:r>
     </w:p>
     <w:p>
@@ -6329,7 +6914,7 @@
           <w:color w:val="1A1A1A"/>
           <w:sz w:val="22"/>
         </w:rPr>
-        <w:t>前面分开写了人和地。收口时只保留能互相支撑的句子，其余留给其他组。</w:t>
+        <w:t>A 说战场在单品和终端，第二品牌还在失量。B 说桌上的替换顺序是固定的：6 元以下换勇闯和清爽，6—8 元被 U8、老雪、小麦王截流，经典桌不进。C 说北方已经是这个结构，南方多一块珠江墙，并不少一块对手。</w:t>
       </w:r>
     </w:p>
     <w:p>
@@ -6346,7 +6931,7 @@
           <w:color w:val="1A1A1A"/>
           <w:sz w:val="22"/>
         </w:rPr>
-        <w:t>总量不再长，份额在大单品和终端上重分。青啤主品牌 2025 年已经回量，其他品牌仍在降。崂山全国化的时间窗口，叠在第二品牌失量、主品牌吸量的阶段。继续当便宜青岛，资源会被主品牌拿走；做成独立大众品牌，失量才有机会变成再配置。这是为什么对手不能写成青岛经典，价位不能停在「再便宜一档」。</w:t>
+        <w:t>三句合在一起，只推出一个资源顺序。第一笔费用留在鲁冀，证明升级后的崂山在勇闯和 U8 同时在场时还能被点——这是方法。第二笔费用进一座南方夜宵城，证明方法可以离开根据地——这是复制。两笔都还没打完，第三笔不存在。</w:t>
       </w:r>
     </w:p>
     <w:p>
@@ -6363,7 +6948,7 @@
           <w:color w:val="1A1A1A"/>
           <w:sz w:val="22"/>
         </w:rPr>
-        <w:t>桌上的替换顺序因此是固定的。6 元以下，店主换的是勇闯和燕京清爽。6—8 元，截流的是 U8、老雪和小麦王。经典桌不进。北方已经是这个结构：山东有勇闯，河北有 U8。南方多一块珠江墙，并不是少一块对手。所以南下不是去填空，是把北方已经成立的对位，搬到一座场景相近、费用尚未顶格的城里再试一次。</w:t>
+        <w:t>如果 A 不成立——行业重新放量、第二品牌自己回量——全国化可以从「止衰」改回「扩盘」，样板数量可以增加。公开的 2023—2025 年不支持这一条。如果 B 不成立——品牌方确认真实对手是青岛经典，或成交带已整体上到 8 元以上——分层要重写，红线也要重写。H4、H6 核价没回来之前，不改分层。如果 C 不成立——分省数证明崂山销量已经均匀地铺在华南——样板可以多于一座。公开的集团账本不支持这一条。</w:t>
       </w:r>
     </w:p>
     <w:p>
@@ -6380,7 +6965,7 @@
           <w:color w:val="1A1A1A"/>
           <w:sz w:val="22"/>
         </w:rPr>
-        <w:t>区域顺序也因此是固定的。鲁冀是保卫战，证明全麦在勇闯和 U8 同时在场时还能否被点。南方是进入战，证明外地大众瓶在珠江和雪花的桌子上有没有第二次被点的机会。两个样板回答两个不同的问题，不能互相替代：北方赢了，只说明根据地还在；南方赢了，只说明有一座城可以被复制。全国化成立，要两个都成立。现在公开数据只支持把样板名单收到这个范围，不支持写成广东全省或全国铺开。</w:t>
+        <w:t>现饮是两条战线的共同原点，也是共同风险。飞书钉在火锅烧烤小龙虾，百威中国用两年双位数下滑写下现饮的 β。因此样板的经营定义不是覆盖。餐饮被点、零售还在、即时零售出单，三件事同时看。缺后两件，只说明进了店，不说明还在被喝。</w:t>
       </w:r>
     </w:p>
     <w:p>
@@ -6397,7 +6982,41 @@
           <w:color w:val="1A1A1A"/>
           <w:sz w:val="22"/>
         </w:rPr>
-        <w:t>现饮是两条战线的共同原点，也是共同风险。飞书钉在火锅烧烤小龙虾，百威中国用两年双位数下滑证明现饮的 β。样板城的数因此不能只留铺货家数。餐饮桌数说明有没有被点，零售排面说明离开桌子以后还在不在，即时零售说明有没有第三条出货。三项里只有铺货、没有售卖和补货，和金威、乌苏那类「出货快于饮用」是同一类错误——对照本身归案例组，本组只把这条纪律留下。</w:t>
+        <w:t>本组停在「桌上还是不是那几个对手、还在不在那两个价位」。规格、包装、购买理由归产品组。经销毛利、费用科目、与主品牌的考核边界归渠道组。乌苏、大窑、天地壹号归案例组。三组的输入会修正价签和城名，不应修正「先方法、后复制」这条顺序——除非 A、B、C 里有一条被数据推翻。</w:t>
+      </w:r>
+    </w:p>
+    <w:p>
+      <w:pPr>
+        <w:spacing w:before="0" w:after="140" w:line="307" w:lineRule="auto"/>
+        <w:ind w:firstLine="0"/>
+        <w:jc w:val="both"/>
+      </w:pPr>
+      <w:r>
+        <w:rPr>
+          <w:rFonts w:ascii="Calibri" w:hAnsi="Calibri" w:eastAsia="微软雅黑" w:cs="Calibri"/>
+          <w:b w:val="0"/>
+          <w:i w:val="0"/>
+          <w:color w:val="1A1A1A"/>
+          <w:sz w:val="22"/>
+        </w:rPr>
+        <w:t>90 天里，北方样板若成立，应当能看见三件同时发生的事：对照桌（勇闯或 U8）没有等幅上升，崂山桌数或补货频次上升，库存周转没有明显恶化。只见铺货上升、不见后两件，判为出货，不判为方法成立。南方样板若成立，应当能看见第二次点单：同一批终端在首轮促销减弱后仍补货。只见开户，不见第二次补货，判为进入费用，不判为可复制。</w:t>
+      </w:r>
+    </w:p>
+    <w:p>
+      <w:pPr>
+        <w:spacing w:before="0" w:after="140" w:line="307" w:lineRule="auto"/>
+        <w:ind w:firstLine="0"/>
+        <w:jc w:val="both"/>
+      </w:pPr>
+      <w:r>
+        <w:rPr>
+          <w:rFonts w:ascii="Calibri" w:hAnsi="Calibri" w:eastAsia="微软雅黑" w:cs="Calibri"/>
+          <w:b w:val="0"/>
+          <w:i w:val="0"/>
+          <w:color w:val="1A1A1A"/>
+          <w:sz w:val="22"/>
+        </w:rPr>
+        <w:t>这两条标准故意写得窄。窄的好处是 10 月 13 日之后不会用「氛围变好」「经销商愿意进」来代替答案。窄的代价是：即使品牌表达、包装、促销都做对，只要桌上没动，本组仍判方法未成立。产品组和渠道组可以解释为什么没动；本组不把解释当成桌上的桌。</w:t>
       </w:r>
     </w:p>
     <w:p>
@@ -6413,7 +7032,7 @@
           <w:color w:val="1428A0"/>
           <w:sz w:val="30"/>
         </w:rPr>
-        <w:t>06  判断</w:t>
+        <w:t>06  对 10.13 的含义，以及什么会推翻答案</w:t>
       </w:r>
     </w:p>
     <w:p>
@@ -6438,7 +7057,7 @@
           <w:color w:val="1A1A1A"/>
           <w:sz w:val="22"/>
         </w:rPr>
-        <w:t>崂山要赢的不是五强排位，是 6—8 元那一桌有没有独立理由被点。假想敌：雪花第一，燕京第二——清爽在下、U8 在上。青岛主品牌是红线。哈尔滨小麦王先当全麦叙事的干扰，终端核价后再决定升不升格。</w:t>
+        <w:t>带进销总的决策建议只有四条。第一，对手名单按表 2 锁定，青岛经典从名单删除。第二，2026 年资源只开两个试验：鲁西或冀中的升级保卫，一座南方夜宵城的进入。第三，阶段成果只认桌数、补货、库存、扣费后贡献，不认铺货家数和覆盖省数。第四，H4、H6 和分省销量作为会后 14 天内必须关闭的数，关不掉则样板名单可以改城、不改结构。</w:t>
       </w:r>
     </w:p>
     <w:p>
@@ -6455,41 +7074,7 @@
           <w:color w:val="1A1A1A"/>
           <w:sz w:val="22"/>
         </w:rPr>
-        <w:t>第二品牌三年失量，全国化是止衰。吨酒收入停在主品牌的六成左右。6 元以下只守不扩；扩出去的规格必须离开「更便宜的青岛」，又不能撞进经典带。规格、包装、购买理由的写法归产品组，本组只锁价位和对手。</w:t>
-      </w:r>
-    </w:p>
-    <w:p>
-      <w:pPr>
-        <w:spacing w:before="0" w:after="140" w:line="307" w:lineRule="auto"/>
-        <w:ind w:firstLine="0"/>
-        <w:jc w:val="both"/>
-      </w:pPr>
-      <w:r>
-        <w:rPr>
-          <w:rFonts w:ascii="Calibri" w:hAnsi="Calibri" w:eastAsia="微软雅黑" w:cs="Calibri"/>
-          <w:b w:val="0"/>
-          <w:i w:val="0"/>
-          <w:color w:val="1A1A1A"/>
-          <w:sz w:val="22"/>
-        </w:rPr>
-        <w:t>样板两座，问题不同。鲁西或冀中：升级保卫，对手是勇闯加 U8。一座南方夜宵城：进入试验，对手是珠江加雪花，场景仍要和北方同源。门槛仍是那五条。不做华南大区，不做全国铺开。</w:t>
-      </w:r>
-    </w:p>
-    <w:p>
-      <w:pPr>
-        <w:spacing w:before="0" w:after="140" w:line="307" w:lineRule="auto"/>
-        <w:ind w:firstLine="0"/>
-        <w:jc w:val="both"/>
-      </w:pPr>
-      <w:r>
-        <w:rPr>
-          <w:rFonts w:ascii="Calibri" w:hAnsi="Calibri" w:eastAsia="微软雅黑" w:cs="Calibri"/>
-          <w:b w:val="0"/>
-          <w:i w:val="0"/>
-          <w:color w:val="1A1A1A"/>
-          <w:sz w:val="22"/>
-        </w:rPr>
-        <w:t>现饮做原点，不做唯一引擎。铺货家数不作为阶段成果。本组对样板的经营定义停在：这张桌上还是不是那几个对手、还在不在那两个价位。经销利润、费用科目、案例对照，分别交回渠道组和案例组。</w:t>
+        <w:t>会推翻答案的数，也只有四类。品牌方确认成交带已经整体高于 8 元，或真实对手就是青岛经典——改分层和红线。崂山单品牌分省显示华南已有与鲁冀同量级的桌——可以增加南方样板。鲁冀终端核价显示小麦王大量落在 6—8 元且正在切桌——小麦王升格。样板 90 天内餐饮桌数不增、补货不连续——方法不成立，停复制，回到产品语言，而不是加城。</w:t>
       </w:r>
     </w:p>
     <w:tbl>
@@ -6532,7 +7117,7 @@
                 <w:color w:val="1428A0"/>
                 <w:sz w:val="21"/>
               </w:rPr>
-              <w:t>给 10.13 的收口</w:t>
+              <w:t>Governing thought（可直接读）</w:t>
             </w:r>
           </w:p>
           <w:p>
@@ -6549,7 +7134,7 @@
                 <w:color w:val="1A1A1A"/>
                 <w:sz w:val="21"/>
               </w:rPr>
-              <w:t>对手是勇闯、小麦王、燕京清爽，上一层还有 U8，不是青岛经典。战场先在鲁冀证明升级还守得住桌，再进一座南方夜宵城看外地瓶能不能被点第二次。价位看 6—8 元，6 元以下只守不扩。现在公开数据够锁住这三句；不够写出分省份额和货架成交价。</w:t>
+              <w:t>全国化成立，当且仅当鲁冀 6—8 元桌上还守得住、南方有一座城被点第二次。现在的公开数据只支持把费用锁在这两个试验上。和谁抢：雪花第一，燕京第二，经典不进。在哪抢：先保卫，后进入。先证明什么：方法，然后才是复制。</w:t>
             </w:r>
           </w:p>
         </w:tc>
@@ -6573,7 +7158,7 @@
           <w:color w:val="1428A0"/>
           <w:sz w:val="30"/>
         </w:rPr>
-        <w:t>07  本组还缺的数</w:t>
+        <w:t>07  本组仍缺、且会改城名的数</w:t>
       </w:r>
     </w:p>
     <w:p>
@@ -6598,7 +7183,7 @@
           <w:color w:val="1A1A1A"/>
           <w:sz w:val="22"/>
         </w:rPr>
-        <w:t>升级规格、购买理由、渠道利润模型、乌苏 / 大窑 / 天地壹号对照，分别归产品组和案例组。本组只追下面这些。</w:t>
+        <w:t>下列缺口关不掉，不把城名写死，也不把价签写成官方。结构保持。</w:t>
       </w:r>
     </w:p>
     <w:p>
@@ -6625,7 +7210,7 @@
           <w:color w:val="1A1A1A"/>
           <w:sz w:val="22"/>
         </w:rPr>
-        <w:t>H4：品牌方确认成交口径以 6 元还是 8 元为准。</w:t>
+        <w:t>H4：成交口径以 6 元还是 8 元为准。</w:t>
       </w:r>
     </w:p>
     <w:p>
@@ -6652,7 +7237,7 @@
           <w:color w:val="1A1A1A"/>
           <w:sz w:val="22"/>
         </w:rPr>
-        <w:t>H6：勇闯、小麦王、燕京清爽、U8 在鲁 / 冀 / 候选样板城的建议零售价、常态价、促销价。</w:t>
+        <w:t>H6：勇闯、小麦王、燕京清爽、U8 在鲁 / 冀 / 候选城的建议零售价、常态价、促销价。</w:t>
       </w:r>
     </w:p>
     <w:p>
@@ -6679,7 +7264,7 @@
           <w:color w:val="1A1A1A"/>
           <w:sz w:val="22"/>
         </w:rPr>
-        <w:t>崂山分省或鲁 / 冀 / 其他的销量、占比、同比。公开年报给不出单品牌。</w:t>
+        <w:t>崂山单品牌分省或鲁 / 冀 / 其他的销量、占比、同比。</w:t>
       </w:r>
     </w:p>
     <w:p>
@@ -6706,7 +7291,7 @@
           <w:color w:val="1A1A1A"/>
           <w:sz w:val="22"/>
         </w:rPr>
-        <w:t>餐饮、传统零售、即时零售的销量结构。没有结构，现饮判断只能停在行业层。</w:t>
+        <w:t>餐饮 / 传统零售 / 即时零售结构。没有结构，现饮判断停在行业层。</w:t>
       </w:r>
     </w:p>
     <w:p>
@@ -6722,7 +7307,7 @@
           <w:color w:val="1428A0"/>
           <w:sz w:val="30"/>
         </w:rPr>
-        <w:t>08  来源</w:t>
+        <w:t>08  来源与复核</w:t>
       </w:r>
     </w:p>
     <w:p>
@@ -6747,7 +7332,7 @@
           <w:color w:val="767676"/>
           <w:sz w:val="19"/>
         </w:rPr>
-        <w:t>复盘@YJ 逐字稿：P02 四条预研判断；H4 价格带；H6 竞品名单；Q7–Q10 对应本组。</w:t>
+        <w:t>复盘@YJ：P02 四条预研；H4 价格带；H6 竞品；Q7–Q10 对应本组。</w:t>
       </w:r>
     </w:p>
     <w:p>
@@ -6764,7 +7349,7 @@
           <w:color w:val="767676"/>
           <w:sz w:val="19"/>
         </w:rPr>
-        <w:t>飞书研讨页：避开青啤腹地；核心市场鲁冀；场景火锅烧烤小龙虾；样板先行。</w:t>
+        <w:t>飞书研讨：避开腹地；核心市场鲁冀；场景火锅烧烤小龙虾；样板先行。</w:t>
       </w:r>
     </w:p>
     <w:p>
@@ -6781,7 +7366,7 @@
           <w:color w:val="767676"/>
           <w:sz w:val="19"/>
         </w:rPr>
-        <w:t>青岛啤酒 2023 / 2024 / 2025 年报：集团与分品牌销量、分部收入。</w:t>
+        <w:t>青岛啤酒 2023 / 2024 / 2025 年报：分品牌销量、分部收入。</w:t>
       </w:r>
     </w:p>
     <w:p>
@@ -6798,7 +7383,7 @@
           <w:color w:val="767676"/>
           <w:sz w:val="19"/>
         </w:rPr>
-        <w:t>华润啤酒 2023 / 2024 / 2025 全年业绩；燕京年报及 2025 业绩快报；重啤、珠江年报；百威亚太年报。</w:t>
+        <w:t>华润 2023—2025 全年业绩；燕京年报及 2025 快报；重啤、珠江年报；百威亚太年报。</w:t>
       </w:r>
     </w:p>
     <w:p>
@@ -6815,7 +7400,7 @@
           <w:color w:val="767676"/>
           <w:sz w:val="19"/>
         </w:rPr>
-        <w:t>国家统计局规上产量（各年年报转引）。河北轻工行业协会 2024。粤鲁产量易位公开报道。</w:t>
+        <w:t>统计局规上产量（各年年报转引）。河北轻工行业协会 2024。粤鲁产量公开报道。</w:t>
       </w:r>
     </w:p>
     <w:p>
@@ -6832,7 +7417,7 @@
           <w:color w:val="767676"/>
           <w:sz w:val="19"/>
         </w:rPr>
-        <w:t>云酒头条 2024-04、国金证券 2023-08 渠道材料：山东份额，仅作机制，不作官方市占。界面新闻：U8 成交两说并存。</w:t>
+        <w:t>云酒头条 2024-04、国金 2023-08：山东份额仅作机制。界面：U8 成交两说并存。</w:t>
       </w:r>
     </w:p>
     <w:p>
@@ -6849,7 +7434,7 @@
           <w:color w:val="767676"/>
           <w:sz w:val="18"/>
         </w:rPr>
-        <w:t>关键复核：华润 24/23 = −2.48%（公告 −2.5%）；青啤 24/23 = −5.86%；25/24 = +1.46%（公告 +1.5%）；其他品牌 345→320→315；燕京 24/23 = +1.57%；U8 25/24 = +29.31%；山东分部销量 / 集团销量 = 70.68%。320 万千升未写作崂山单品牌。</w:t>
+        <w:t>复核：华润 24/23 = −2.48%（公告 −2.5%）；青啤 24/23 = −5.86%，25/24 = +1.46%（公告 +1.5%）；其他品牌 345→320→315；燕京 24/23 = +1.57%；U8 25/24 = +29.31%；山东分部销量/集团 = 70.68%。320 万千升未写作崂山单品牌。</w:t>
       </w:r>
     </w:p>
     <w:sectPr>

</xml_diff>